<commit_message>
feat(srs): update srs and add srs builder
</commit_message>
<xml_diff>
--- a/Final Paper.docx
+++ b/Final Paper.docx
@@ -11821,30 +11821,49 @@
     <w:p>
       <w:pPr>
         <w:pStyle w:val="FirstParagraph"/>
-        <w:keepNext/>
+      </w:pPr>
+      <w:r>
+        <w:t xml:space="preserve">IEEE 830 / ISO·IEC·IEEE 29148 Format</w:t>
+      </w:r>
+    </w:p>
+    <w:p>
+      <w:pPr>
+        <w:pStyle w:val="BodyText"/>
       </w:pPr>
       <w:r>
         <w:rPr>
           <w:b/>
           <w:bCs/>
         </w:rPr>
-        <w:t xml:space="preserve">FontID — Typographic-Hallucination Font Matcher</w:t>
-      </w:r>
-      <w:r>
-        <w:t xml:space="preserve"> </w:t>
-      </w:r>
-      <w:r>
-        <w:t xml:space="preserve">Web demonstrator for</w:t>
-      </w:r>
-      <w:r>
-        <w:t xml:space="preserve"> </w:t>
-      </w:r>
-      <w:r>
-        <w:rPr>
-          <w:i/>
-          <w:iCs/>
-        </w:rPr>
-        <w:t xml:space="preserve">“Addressing Typographic Hallucination in Generative AI Images: An Open-Set Metric Learning Approach to Font Style Recognition.”</w:t>
+        <w:t xml:space="preserve">Addressing Typographic Hallucination in Generative AI Images: An Open-Set Metric Learning Approach to Font Style Recognition</w:t>
+      </w:r>
+    </w:p>
+    <w:p>
+      <w:pPr>
+        <w:pStyle w:val="BodyText"/>
+      </w:pPr>
+      <w:r>
+        <w:t xml:space="preserve">Version 1.1 · July 26, 2026</w:t>
+      </w:r>
+    </w:p>
+    <w:p>
+      <w:pPr>
+        <w:pStyle w:val="BodyText"/>
+      </w:pPr>
+      <w:r>
+        <w:t xml:space="preserve">By</w:t>
+      </w:r>
+      <w:r>
+        <w:t xml:space="preserve"> </w:t>
+      </w:r>
+      <w:r>
+        <w:t xml:space="preserve">Janritch Diputado</w:t>
+      </w:r>
+      <w:r>
+        <w:t xml:space="preserve"> </w:t>
+      </w:r>
+      <w:r>
+        <w:t xml:space="preserve">Matt Cabarrubias</w:t>
       </w:r>
     </w:p>
     <w:p>
@@ -11853,13 +11872,29 @@
         <w:keepNext/>
       </w:pPr>
       <w:r>
-        <w:t xml:space="preserve">Version 1.0 · IEEE 830 / ISO·IEC·IEEE 29148 (thesis-scoped)</w:t>
+        <w:t xml:space="preserve">Christine D. Bandalan, MEng</w:t>
+      </w:r>
+      <w:r>
+        <w:t xml:space="preserve"> </w:t>
+      </w:r>
+      <w:r>
+        <w:t xml:space="preserve">Faculty Adviser</w:t>
+      </w:r>
+    </w:p>
+    <w:p>
+      <w:pPr>
+        <w:pStyle w:val="Heading2"/>
+        <w:keepNext/>
+      </w:pPr>
+      <w:r>
+        <w:t xml:space="preserve">Revision History</w:t>
       </w:r>
     </w:p>
     <w:tbl>
       <w:tblPr>
         <w:tblStyle w:val="Table"/>
-        <w:tblW w:type="auto" w:w="0"/>
+        <w:tblW w:type="pct" w:w="5000"/>
+        <w:tblLayout w:type="fixed"/>
         <w:tblLook w:firstRow="1" w:lastRow="0" w:firstColumn="0" w:lastColumn="0" w:noHBand="0" w:noVBand="0" w:val="0020"/>
       </w:tblPr>
       <w:tblGrid>
@@ -11971,15 +12006,58 @@
           </w:p>
         </w:tc>
       </w:tr>
+      <w:tr>
+        <w:tc>
+          <w:tcPr/>
+          <w:p>
+            <w:pPr>
+              <w:pStyle w:val="Compact"/>
+              <w:jc w:val="left"/>
+            </w:pPr>
+            <w:r>
+              <w:t xml:space="preserve">2026-07-26</w:t>
+            </w:r>
+          </w:p>
+        </w:tc>
+        <w:tc>
+          <w:tcPr/>
+          <w:p>
+            <w:pPr>
+              <w:pStyle w:val="Compact"/>
+              <w:jc w:val="left"/>
+            </w:pPr>
+            <w:r>
+              <w:t xml:space="preserve">1.1</w:t>
+            </w:r>
+          </w:p>
+        </w:tc>
+        <w:tc>
+          <w:tcPr/>
+          <w:p>
+            <w:pPr>
+              <w:pStyle w:val="Compact"/>
+              <w:jc w:val="left"/>
+            </w:pPr>
+            <w:r>
+              <w:t xml:space="preserve">Restructured to the IEEE 830 capstone template; adviser format revisions</w:t>
+            </w:r>
+          </w:p>
+        </w:tc>
+        <w:tc>
+          <w:tcPr/>
+          <w:p>
+            <w:pPr>
+              <w:pStyle w:val="Compact"/>
+              <w:jc w:val="left"/>
+            </w:pPr>
+            <w:r>
+              <w:t xml:space="preserve">Research team</w:t>
+            </w:r>
+          </w:p>
+        </w:tc>
+      </w:tr>
     </w:tbl>
     <w:p>
-      <w:r>
-        <w:pict>
-          <v:rect style="width:0;height:1.5pt" o:hralign="center" o:hrstd="t" o:hr="t"/>
-        </w:pict>
-      </w:r>
-    </w:p>
-    <w:p>
       <w:pPr>
         <w:pStyle w:val="Heading2"/>
       </w:pPr>
@@ -12000,7 +12078,7 @@
         <w:pStyle w:val="FirstParagraph"/>
       </w:pPr>
       <w:r>
-        <w:t xml:space="preserve">This document specifies the requirements for</w:t>
+        <w:t xml:space="preserve">This Software Requirements Specification (SRS) defines the functional and non-functional requirements for</w:t>
       </w:r>
       <w:r>
         <w:t xml:space="preserve"> </w:t>
@@ -12013,7 +12091,10 @@
         <w:t xml:space="preserve">FontID</w:t>
       </w:r>
       <w:r>
-        <w:t xml:space="preserve">, the web demonstrator that exposes the thesis’s font-recognition model to a user. It is the</w:t>
+        <w:t xml:space="preserve"> </w:t>
+      </w:r>
+      <w:r>
+        <w:t xml:space="preserve">version 1.x, the web demonstrator that exposes the thesis’s font-recognition model to a user. It is the</w:t>
       </w:r>
       <w:r>
         <w:t xml:space="preserve"> </w:t>
@@ -12029,15 +12110,38 @@
         <w:t xml:space="preserve"> </w:t>
       </w:r>
       <w:r>
-        <w:t xml:space="preserve">half of the study’s build method (§4.10): a single-page application that accepts a generative-AI image, runs the open-set metric-learning pipeline, and returns a ranked shortlist of the closest Google Fonts for each detected line of text — or rejects the text as out-of-palette. The document is written for the two researchers (developers), the faculty adviser, and the panel evaluating the demonstrator.</w:t>
-      </w:r>
-    </w:p>
-    <w:p>
-      <w:pPr>
-        <w:pStyle w:val="BodyText"/>
-      </w:pPr>
-      <w:r>
-        <w:t xml:space="preserve">Requirements use</w:t>
+        <w:t xml:space="preserve">half of the study’s build method (Ch4 §4.10): a single-page application that accepts a generative-AI image, runs the open-set metric-learning pipeline, and returns a ranked shortlist of the closest Google Fonts for each detected line of text — or rejects the text as out-of-palette. The software will not perform font vectorization, licensing, or any commercial identification.</w:t>
+      </w:r>
+    </w:p>
+    <w:p>
+      <w:pPr>
+        <w:pStyle w:val="Heading3"/>
+      </w:pPr>
+      <w:r>
+        <w:t xml:space="preserve">1.2 Document Conventions</w:t>
+      </w:r>
+    </w:p>
+    <w:p>
+      <w:pPr>
+        <w:pStyle w:val="FirstParagraph"/>
+      </w:pPr>
+      <w:r>
+        <w:t xml:space="preserve">Each requirement is labeled</w:t>
+      </w:r>
+      <w:r>
+        <w:t xml:space="preserve"> </w:t>
+      </w:r>
+      <w:r>
+        <w:rPr>
+          <w:rStyle w:val="VerbatimChar"/>
+        </w:rPr>
+        <w:t xml:space="preserve">REQ-&lt;section&gt;-&lt;n&gt;</w:t>
+      </w:r>
+      <w:r>
+        <w:t xml:space="preserve"> </w:t>
+      </w:r>
+      <w:r>
+        <w:t xml:space="preserve">(e.g., REQ-4.1-2) with priority</w:t>
       </w:r>
       <w:r>
         <w:t xml:space="preserve"> </w:t>
@@ -12047,13 +12151,10 @@
           <w:b/>
           <w:bCs/>
         </w:rPr>
-        <w:t xml:space="preserve">shall</w:t>
-      </w:r>
-      <w:r>
-        <w:t xml:space="preserve"> </w:t>
-      </w:r>
-      <w:r>
-        <w:t xml:space="preserve">for mandatory behavior,</w:t>
+        <w:t xml:space="preserve">High / Med / Low</w:t>
+      </w:r>
+      <w:r>
+        <w:t xml:space="preserve">. Mandatory behavior uses</w:t>
       </w:r>
       <w:r>
         <w:t xml:space="preserve"> </w:t>
@@ -12063,28 +12164,10 @@
           <w:b/>
           <w:bCs/>
         </w:rPr>
-        <w:t xml:space="preserve">should</w:t>
-      </w:r>
-      <w:r>
-        <w:t xml:space="preserve"> </w:t>
-      </w:r>
-      <w:r>
-        <w:t xml:space="preserve">for desired behavior, and are labeled</w:t>
-      </w:r>
-      <w:r>
-        <w:t xml:space="preserve"> </w:t>
-      </w:r>
-      <w:r>
-        <w:rPr>
-          <w:rStyle w:val="VerbatimChar"/>
-        </w:rPr>
-        <w:t xml:space="preserve">REQ-&lt;section&gt;-&lt;n&gt;</w:t>
-      </w:r>
-      <w:r>
-        <w:t xml:space="preserve"> </w:t>
-      </w:r>
-      <w:r>
-        <w:t xml:space="preserve">with priority</w:t>
+        <w:t xml:space="preserve">shall</w:t>
+      </w:r>
+      <w:r>
+        <w:t xml:space="preserve">; desired behavior uses</w:t>
       </w:r>
       <w:r>
         <w:t xml:space="preserve"> </w:t>
@@ -12094,10 +12177,10 @@
           <w:b/>
           <w:bCs/>
         </w:rPr>
-        <w:t xml:space="preserve">High / Med / Low</w:t>
-      </w:r>
-      <w:r>
-        <w:t xml:space="preserve">.</w:t>
+        <w:t xml:space="preserve">should</w:t>
+      </w:r>
+      <w:r>
+        <w:t xml:space="preserve">. Tables and figures follow APA 7th edition formatting.</w:t>
       </w:r>
     </w:p>
     <w:p>
@@ -12105,7 +12188,23 @@
         <w:pStyle w:val="Heading3"/>
       </w:pPr>
       <w:r>
-        <w:t xml:space="preserve">1.2 Scope</w:t>
+        <w:t xml:space="preserve">1.3 Intended Audience and Reading Suggestions</w:t>
+      </w:r>
+    </w:p>
+    <w:p>
+      <w:pPr>
+        <w:pStyle w:val="FirstParagraph"/>
+      </w:pPr>
+      <w:r>
+        <w:t xml:space="preserve">The document is intended for the two researcher-developers, the faculty adviser, and the panel evaluating the demonstrator. The panel and adviser may read Section 2 for a high-level view of scope and functions; the developers should read Sections 3–5 in full; evaluators verifying the demo should focus on Section 4 (features) and Section 5 (non-functional requirements) to derive test cases.</w:t>
+      </w:r>
+    </w:p>
+    <w:p>
+      <w:pPr>
+        <w:pStyle w:val="Heading3"/>
+      </w:pPr>
+      <w:r>
+        <w:t xml:space="preserve">1.4 Product Scope</w:t>
       </w:r>
     </w:p>
     <w:p>
@@ -12165,7 +12264,7 @@
         <w:keepNext/>
       </w:pPr>
       <w:r>
-        <w:t xml:space="preserve">1.3 Definitions and Acronyms</w:t>
+        <w:t xml:space="preserve">1.5 References</w:t>
       </w:r>
     </w:p>
     <w:tbl>
@@ -12176,8 +12275,10 @@
         <w:tblLook w:firstRow="1" w:lastRow="0" w:firstColumn="0" w:lastColumn="0" w:noHBand="0" w:noVBand="0" w:val="0020"/>
       </w:tblPr>
       <w:tblGrid>
-        <w:gridCol w:w="3960"/>
-        <w:gridCol w:w="3960"/>
+        <w:gridCol w:w="1980"/>
+        <w:gridCol w:w="1980"/>
+        <w:gridCol w:w="1980"/>
+        <w:gridCol w:w="1980"/>
       </w:tblGrid>
       <w:tr>
         <w:trPr>
@@ -12191,7 +12292,7 @@
               <w:jc w:val="left"/>
             </w:pPr>
             <w:r>
-              <w:t xml:space="preserve">Term</w:t>
+              <w:t xml:space="preserve">Ref#</w:t>
             </w:r>
           </w:p>
         </w:tc>
@@ -12203,7 +12304,31 @@
               <w:jc w:val="left"/>
             </w:pPr>
             <w:r>
-              <w:t xml:space="preserve">Meaning</w:t>
+              <w:t xml:space="preserve">Document Title</w:t>
+            </w:r>
+          </w:p>
+        </w:tc>
+        <w:tc>
+          <w:tcPr/>
+          <w:p>
+            <w:pPr>
+              <w:pStyle w:val="Compact"/>
+              <w:jc w:val="left"/>
+            </w:pPr>
+            <w:r>
+              <w:t xml:space="preserve">Version/Date</w:t>
+            </w:r>
+          </w:p>
+        </w:tc>
+        <w:tc>
+          <w:tcPr/>
+          <w:p>
+            <w:pPr>
+              <w:pStyle w:val="Compact"/>
+              <w:jc w:val="left"/>
+            </w:pPr>
+            <w:r>
+              <w:t xml:space="preserve">Source</w:t>
             </w:r>
           </w:p>
         </w:tc>
@@ -12217,7 +12342,7 @@
               <w:jc w:val="left"/>
             </w:pPr>
             <w:r>
-              <w:t xml:space="preserve">Typographic hallucination</w:t>
+              <w:t xml:space="preserve">[1]</w:t>
             </w:r>
           </w:p>
         </w:tc>
@@ -12229,7 +12354,31 @@
               <w:jc w:val="left"/>
             </w:pPr>
             <w:r>
-              <w:t xml:space="preserve">Probabilistic glyph deformation (warping, kerning jitter, smear) that GenAI introduces into rendered text.</w:t>
+              <w:t xml:space="preserve">Thesis Chapter 4 — Methodology (conceptual framework §4.4, architecture §4.5, build method §4.10)</w:t>
+            </w:r>
+          </w:p>
+        </w:tc>
+        <w:tc>
+          <w:tcPr/>
+          <w:p>
+            <w:pPr>
+              <w:pStyle w:val="Compact"/>
+              <w:jc w:val="left"/>
+            </w:pPr>
+            <w:r>
+              <w:t xml:space="preserve">2026</w:t>
+            </w:r>
+          </w:p>
+        </w:tc>
+        <w:tc>
+          <w:tcPr/>
+          <w:p>
+            <w:pPr>
+              <w:pStyle w:val="Compact"/>
+              <w:jc w:val="left"/>
+            </w:pPr>
+            <w:r>
+              <w:t xml:space="preserve">This thesis</w:t>
             </w:r>
           </w:p>
         </w:tc>
@@ -12243,7 +12392,7 @@
               <w:jc w:val="left"/>
             </w:pPr>
             <w:r>
-              <w:t xml:space="preserve">Palette</w:t>
+              <w:t xml:space="preserve">[2]</w:t>
             </w:r>
           </w:p>
         </w:tc>
@@ -12255,7 +12404,31 @@
               <w:jc w:val="left"/>
             </w:pPr>
             <w:r>
-              <w:t xml:space="preserve">The curated closed set of 50–100 known Google Fonts the model can name.</w:t>
+              <w:t xml:space="preserve">IEEE Std 830-1998, Recommended Practice for Software Requirements Specifications</w:t>
+            </w:r>
+          </w:p>
+        </w:tc>
+        <w:tc>
+          <w:tcPr/>
+          <w:p>
+            <w:pPr>
+              <w:pStyle w:val="Compact"/>
+              <w:jc w:val="left"/>
+            </w:pPr>
+            <w:r>
+              <w:t xml:space="preserve">1998</w:t>
+            </w:r>
+          </w:p>
+        </w:tc>
+        <w:tc>
+          <w:tcPr/>
+          <w:p>
+            <w:pPr>
+              <w:pStyle w:val="Compact"/>
+              <w:jc w:val="left"/>
+            </w:pPr>
+            <w:r>
+              <w:t xml:space="preserve">IEEE</w:t>
             </w:r>
           </w:p>
         </w:tc>
@@ -12269,7 +12442,7 @@
               <w:jc w:val="left"/>
             </w:pPr>
             <w:r>
-              <w:t xml:space="preserve">Open-set / reject</w:t>
+              <w:t xml:space="preserve">[3]</w:t>
             </w:r>
           </w:p>
         </w:tc>
@@ -12281,32 +12454,31 @@
               <w:jc w:val="left"/>
             </w:pPr>
             <w:r>
-              <w:t xml:space="preserve">Returning</w:t>
-            </w:r>
-            <w:r>
-              <w:t xml:space="preserve"> </w:t>
-            </w:r>
-            <w:r>
-              <w:t xml:space="preserve">“unknown”</w:t>
-            </w:r>
-            <w:r>
-              <w:t xml:space="preserve"> </w:t>
-            </w:r>
-            <w:r>
-              <w:t xml:space="preserve">when a crop’s best match falls below threshold</w:t>
-            </w:r>
-            <w:r>
-              <w:t xml:space="preserve"> </w:t>
-            </w:r>
-            <w:r>
-              <w:rPr>
-                <w:b/>
-                <w:bCs/>
-              </w:rPr>
-              <w:t xml:space="preserve">τ</w:t>
-            </w:r>
-            <w:r>
-              <w:t xml:space="preserve">, instead of forcing a wrong label.</w:t>
+              <w:t xml:space="preserve">ISO/IEC/IEEE 29148:2018, Requirements engineering</w:t>
+            </w:r>
+          </w:p>
+        </w:tc>
+        <w:tc>
+          <w:tcPr/>
+          <w:p>
+            <w:pPr>
+              <w:pStyle w:val="Compact"/>
+              <w:jc w:val="left"/>
+            </w:pPr>
+            <w:r>
+              <w:t xml:space="preserve">2018</w:t>
+            </w:r>
+          </w:p>
+        </w:tc>
+        <w:tc>
+          <w:tcPr/>
+          <w:p>
+            <w:pPr>
+              <w:pStyle w:val="Compact"/>
+              <w:jc w:val="left"/>
+            </w:pPr>
+            <w:r>
+              <w:t xml:space="preserve">ISO/IEC/IEEE</w:t>
             </w:r>
           </w:p>
         </w:tc>
@@ -12320,7 +12492,7 @@
               <w:jc w:val="left"/>
             </w:pPr>
             <w:r>
-              <w:t xml:space="preserve">Top-K</w:t>
+              <w:t xml:space="preserve">[4]</w:t>
             </w:r>
           </w:p>
         </w:tc>
@@ -12332,12 +12504,10 @@
               <w:jc w:val="left"/>
             </w:pPr>
             <w:r>
-              <w:t xml:space="preserve">The K highest-ranked font candidates for one text crop (K = 3 in the demo).</w:t>
-            </w:r>
-          </w:p>
-        </w:tc>
-      </w:tr>
-      <w:tr>
+              <w:t xml:space="preserve">Google Fonts open-source font library</w:t>
+            </w:r>
+          </w:p>
+        </w:tc>
         <w:tc>
           <w:tcPr/>
           <w:p>
@@ -12346,7 +12516,7 @@
               <w:jc w:val="left"/>
             </w:pPr>
             <w:r>
-              <w:t xml:space="preserve">Embedding</w:t>
+              <w:t xml:space="preserve">current</w:t>
             </w:r>
           </w:p>
         </w:tc>
@@ -12358,45 +12528,12 @@
               <w:jc w:val="left"/>
             </w:pPr>
             <w:r>
-              <w:t xml:space="preserve">The fixed-length style vector produced by the DINOv2 encoder + metric head.</w:t>
-            </w:r>
-          </w:p>
-        </w:tc>
-      </w:tr>
-      <w:tr>
-        <w:tc>
-          <w:tcPr/>
-          <w:p>
-            <w:pPr>
-              <w:pStyle w:val="Compact"/>
-              <w:jc w:val="left"/>
-            </w:pPr>
-            <w:r>
-              <w:t xml:space="preserve">SSIM</w:t>
-            </w:r>
-          </w:p>
-        </w:tc>
-        <w:tc>
-          <w:tcPr/>
-          <w:p>
-            <w:pPr>
-              <w:pStyle w:val="Compact"/>
-              <w:jc w:val="left"/>
-            </w:pPr>
-            <w:r>
-              <w:t xml:space="preserve">Structural Similarity Index — re-render score between the input crop and the predicted font.</w:t>
+              <w:t xml:space="preserve">https://fonts.google.com</w:t>
             </w:r>
           </w:p>
         </w:tc>
       </w:tr>
     </w:tbl>
-    <w:p>
-      <w:r>
-        <w:pict>
-          <v:rect style="width:0;height:1.5pt" o:hralign="center" o:hrstd="t" o:hr="t"/>
-        </w:pict>
-      </w:r>
-    </w:p>
     <w:p>
       <w:pPr>
         <w:pStyle w:val="Heading2"/>
@@ -12528,7 +12665,7 @@
         <w:keepNext/>
       </w:pPr>
       <w:r>
-        <w:t xml:space="preserve">2.3 User Classes</w:t>
+        <w:t xml:space="preserve">2.3 User Classes and Characteristics</w:t>
       </w:r>
     </w:p>
     <w:tbl>
@@ -12579,7 +12716,7 @@
               <w:jc w:val="left"/>
             </w:pPr>
             <w:r>
-              <w:t xml:space="preserve">Use of the app</w:t>
+              <w:t xml:space="preserve">Privileges/Access</w:t>
             </w:r>
           </w:p>
         </w:tc>
@@ -12617,7 +12754,7 @@
               <w:jc w:val="left"/>
             </w:pPr>
             <w:r>
-              <w:t xml:space="preserve">Uploads an image, reads the Top-K shortlist.</w:t>
+              <w:t xml:space="preserve">Standard access: uploads an image, reads the Top-K shortlist.</w:t>
             </w:r>
           </w:p>
         </w:tc>
@@ -12655,7 +12792,7 @@
               <w:jc w:val="left"/>
             </w:pPr>
             <w:r>
-              <w:t xml:space="preserve">Drives the demo, inspects scores, confirms open-set reject behavior.</w:t>
+              <w:t xml:space="preserve">Full local access: drives the demo, inspects backend score/τ logs, confirms open-set reject behavior.</w:t>
             </w:r>
           </w:p>
         </w:tc>
@@ -12761,7 +12898,7 @@
         </w:numPr>
       </w:pPr>
       <w:r>
-        <w:t xml:space="preserve">Stack is fixed by the methodology (§4.8):</w:t>
+        <w:t xml:space="preserve">Stack is fixed by the methodology (Ch4 §4.8):</w:t>
       </w:r>
       <w:r>
         <w:t xml:space="preserve"> </w:t>
@@ -12853,7 +12990,7 @@
         <w:t xml:space="preserve"> </w:t>
       </w:r>
       <w:r>
-        <w:t xml:space="preserve">run inside the model forward pass to avoid train–serve skew (§4.3.2).</w:t>
+        <w:t xml:space="preserve">run inside the model forward pass to avoid train–serve skew (Ch4 §4.3.2).</w:t>
       </w:r>
     </w:p>
     <w:p>
@@ -12913,10 +13050,15 @@
       </w:r>
     </w:p>
     <w:p>
-      <w:r>
-        <w:pict>
-          <v:rect style="width:0;height:1.5pt" o:hralign="center" o:hrstd="t" o:hr="t"/>
-        </w:pict>
+      <w:pPr>
+        <w:pStyle w:val="Compact"/>
+        <w:numPr>
+          <w:ilvl w:val="0"/>
+          <w:numId w:val="1010"/>
+        </w:numPr>
+      </w:pPr>
+      <w:r>
+        <w:t xml:space="preserve">The HuggingFace Hub remains reachable for the one-time weight download; after that the app runs offline.</w:t>
       </w:r>
     </w:p>
     <w:p>
@@ -12932,7 +13074,7 @@
         <w:pStyle w:val="Heading3"/>
       </w:pPr>
       <w:r>
-        <w:t xml:space="preserve">3.1 User Interface</w:t>
+        <w:t xml:space="preserve">3.1 User Interfaces</w:t>
       </w:r>
     </w:p>
     <w:p>
@@ -13052,23 +13194,7 @@
         <w:pStyle w:val="FirstParagraph"/>
       </w:pPr>
       <w:r>
-        <w:t xml:space="preserve">The interface</w:t>
-      </w:r>
-      <w:r>
-        <w:t xml:space="preserve"> </w:t>
-      </w:r>
-      <w:r>
-        <w:rPr>
-          <w:b/>
-          <w:bCs/>
-        </w:rPr>
-        <w:t xml:space="preserve">shall</w:t>
-      </w:r>
-      <w:r>
-        <w:t xml:space="preserve"> </w:t>
-      </w:r>
-      <w:r>
-        <w:t xml:space="preserve">work at desktop widths and keep all three zones reachable on one page. Standard affordances: every result font preview offers a copy-name / preview action.</w:t>
+        <w:t xml:space="preserve">The interface shall work at desktop widths and keep all three zones reachable on one page. Standard affordances: every result font preview offers a copy-name / preview action.</w:t>
       </w:r>
     </w:p>
     <w:p>
@@ -13107,18 +13233,18 @@
           <wp:inline>
             <wp:extent cx="5334000" cy="7593328"/>
             <wp:effectExtent b="0" l="0" r="0" t="0"/>
-            <wp:docPr descr="FontID single-page wireframe with three stacked zones: an upload dropzone with sample thumbnails, a processing zone showing detected text regions and pipeline status, and a results carousel of per-region cards" title="" id="130" name="Picture"/>
+            <wp:docPr descr="FontID single-page wireframe with three stacked zones: an upload dropzone with sample thumbnails, a processing zone showing detected text regions and pipeline status, and a results carousel of per-region cards" title="" id="133" name="Picture"/>
             <a:graphic>
               <a:graphicData uri="http://schemas.openxmlformats.org/drawingml/2006/picture">
                 <pic:pic>
                   <pic:nvPicPr>
-                    <pic:cNvPr descr="assets/figures/app_wireframe.png" id="131" name="Picture"/>
+                    <pic:cNvPr descr="assets/figures/app_wireframe.png" id="134" name="Picture"/>
                     <pic:cNvPicPr>
                       <a:picLocks noChangeArrowheads="1" noChangeAspect="1"/>
                     </pic:cNvPicPr>
                   </pic:nvPicPr>
                   <pic:blipFill>
-                    <a:blip r:embed="rId129"/>
+                    <a:blip r:embed="rId132"/>
                     <a:stretch>
                       <a:fillRect/>
                     </a:stretch>
@@ -13148,7 +13274,6 @@
     <w:p>
       <w:pPr>
         <w:pStyle w:val="BodyText"/>
-        <w:keepNext/>
       </w:pPr>
       <w:r>
         <w:rPr>
@@ -13167,10 +13292,27 @@
     <w:p>
       <w:pPr>
         <w:pStyle w:val="Heading3"/>
+      </w:pPr>
+      <w:r>
+        <w:t xml:space="preserve">3.2 Hardware Interfaces</w:t>
+      </w:r>
+    </w:p>
+    <w:p>
+      <w:pPr>
+        <w:pStyle w:val="FirstParagraph"/>
         <w:keepNext/>
       </w:pPr>
       <w:r>
-        <w:t xml:space="preserve">3.2 Software Interfaces</w:t>
+        <w:t xml:space="preserve">No dedicated hardware interface exists. The system runs on a commodity laptop; an NVIDIA GPU, when present, is used through the standard CUDA driver stack, and CPU-only operation is supported. No scanners, sensors, or printers are involved.</w:t>
+      </w:r>
+    </w:p>
+    <w:p>
+      <w:pPr>
+        <w:pStyle w:val="Heading3"/>
+        <w:keepNext/>
+      </w:pPr>
+      <w:r>
+        <w:t xml:space="preserve">3.3 Software Interfaces</w:t>
       </w:r>
     </w:p>
     <w:tbl>
@@ -13400,10 +13542,18 @@
     </w:tbl>
     <w:p>
       <w:pPr>
-        <w:pStyle w:val="BodyText"/>
-      </w:pPr>
-      <w:r>
-        <w:t xml:space="preserve">All client–server traffic is local HTTP over</w:t>
+        <w:pStyle w:val="Heading3"/>
+      </w:pPr>
+      <w:r>
+        <w:t xml:space="preserve">3.4 Communications Interfaces</w:t>
+      </w:r>
+    </w:p>
+    <w:p>
+      <w:pPr>
+        <w:pStyle w:val="FirstParagraph"/>
+      </w:pPr>
+      <w:r>
+        <w:t xml:space="preserve">All client–server traffic is HTTP over</w:t>
       </w:r>
       <w:r>
         <w:t xml:space="preserve"> </w:t>
@@ -13415,31 +13565,63 @@
         <w:t xml:space="preserve">localhost</w:t>
       </w:r>
       <w:r>
+        <w:t xml:space="preserve"> </w:t>
+      </w:r>
+      <w:r>
+        <w:t xml:space="preserve">(REST, JSON, multipart upload). No external network traffic occurs at request time, no email or notification channels exist, and no TLS is required for the single-machine demo.</w:t>
+      </w:r>
+    </w:p>
+    <w:p>
+      <w:pPr>
+        <w:pStyle w:val="Heading2"/>
+      </w:pPr>
+      <w:r>
+        <w:t xml:space="preserve">4. System Features</w:t>
+      </w:r>
+    </w:p>
+    <w:p>
+      <w:pPr>
+        <w:pStyle w:val="Heading3"/>
+      </w:pPr>
+      <w:r>
+        <w:t xml:space="preserve">4.1 Image Input</w:t>
+      </w:r>
+    </w:p>
+    <w:p>
+      <w:pPr>
+        <w:pStyle w:val="Heading4"/>
+      </w:pPr>
+      <w:r>
+        <w:t xml:space="preserve">4.1.1 Description and Priority</w:t>
+      </w:r>
+    </w:p>
+    <w:p>
+      <w:pPr>
+        <w:pStyle w:val="FirstParagraph"/>
+      </w:pPr>
+      <w:r>
+        <w:t xml:space="preserve">User supplies a GenAI image by drag-drop, file browse, or a bundled sample. Priority:</w:t>
+      </w:r>
+      <w:r>
+        <w:t xml:space="preserve"> </w:t>
+      </w:r>
+      <w:r>
+        <w:rPr>
+          <w:b/>
+          <w:bCs/>
+        </w:rPr>
+        <w:t xml:space="preserve">High</w:t>
+      </w:r>
+      <w:r>
         <w:t xml:space="preserve">.</w:t>
       </w:r>
     </w:p>
     <w:p>
-      <w:r>
-        <w:pict>
-          <v:rect style="width:0;height:1.5pt" o:hralign="center" o:hrstd="t" o:hr="t"/>
-        </w:pict>
-      </w:r>
-    </w:p>
-    <w:p>
-      <w:pPr>
-        <w:pStyle w:val="Heading2"/>
-      </w:pPr>
-      <w:r>
-        <w:t xml:space="preserve">4. System Features (Functional Requirements)</w:t>
-      </w:r>
-    </w:p>
-    <w:p>
-      <w:pPr>
-        <w:pStyle w:val="Heading3"/>
-        <w:keepNext/>
-      </w:pPr>
-      <w:r>
-        <w:t xml:space="preserve">4.1 Image Input — Priority: High</w:t>
+      <w:pPr>
+        <w:pStyle w:val="Heading4"/>
+      </w:pPr>
+      <w:r>
+        <w:t xml:space="preserve">4.1.2 Stimulus/Response Sequences</w:t>
       </w:r>
     </w:p>
     <w:p>
@@ -13448,7 +13630,7 @@
         <w:keepNext/>
       </w:pPr>
       <w:r>
-        <w:t xml:space="preserve">User supplies a GenAI image.</w:t>
+        <w:t xml:space="preserve">User drops/selects an image → client shows a preview and enables</w:t>
       </w:r>
       <w:r>
         <w:t xml:space="preserve"> </w:t>
@@ -13458,29 +13640,13 @@
           <w:b/>
           <w:bCs/>
         </w:rPr>
-        <w:t xml:space="preserve">Stimulus/response:</w:t>
-      </w:r>
-      <w:r>
-        <w:t xml:space="preserve"> </w:t>
-      </w:r>
-      <w:r>
-        <w:t xml:space="preserve">user drops/selects an image → client shows a preview and enables</w:t>
-      </w:r>
-      <w:r>
-        <w:t xml:space="preserve"> </w:t>
-      </w:r>
-      <w:r>
-        <w:rPr>
-          <w:b/>
-          <w:bCs/>
-        </w:rPr>
         <w:t xml:space="preserve">Identify Fonts</w:t>
       </w:r>
       <w:r>
         <w:t xml:space="preserve"> </w:t>
       </w:r>
       <w:r>
-        <w:t xml:space="preserve">→ click posts to</w:t>
+        <w:t xml:space="preserve">→ click posts the image to</w:t>
       </w:r>
       <w:r>
         <w:t xml:space="preserve"> </w:t>
@@ -13493,6 +13659,15 @@
       </w:r>
       <w:r>
         <w:t xml:space="preserve">.</w:t>
+      </w:r>
+    </w:p>
+    <w:p>
+      <w:pPr>
+        <w:pStyle w:val="Heading4"/>
+        <w:keepNext/>
+      </w:pPr>
+      <w:r>
+        <w:t xml:space="preserve">4.1.3 Functional Requirements</w:t>
       </w:r>
     </w:p>
     <w:tbl>
@@ -13531,7 +13706,7 @@
               <w:jc w:val="left"/>
             </w:pPr>
             <w:r>
-              <w:t xml:space="preserve">Requirement</w:t>
+              <w:t xml:space="preserve">Requirement Description</w:t>
             </w:r>
           </w:p>
         </w:tc>
@@ -13743,10 +13918,46 @@
     <w:p>
       <w:pPr>
         <w:pStyle w:val="Heading3"/>
-        <w:keepNext/>
-      </w:pPr>
-      <w:r>
-        <w:t xml:space="preserve">4.2 Text Localization and Processing — Priority: High</w:t>
+      </w:pPr>
+      <w:r>
+        <w:t xml:space="preserve">4.2 Text Localization and Processing</w:t>
+      </w:r>
+    </w:p>
+    <w:p>
+      <w:pPr>
+        <w:pStyle w:val="Heading4"/>
+      </w:pPr>
+      <w:r>
+        <w:t xml:space="preserve">4.2.1 Description and Priority</w:t>
+      </w:r>
+    </w:p>
+    <w:p>
+      <w:pPr>
+        <w:pStyle w:val="FirstParagraph"/>
+      </w:pPr>
+      <w:r>
+        <w:t xml:space="preserve">The backend finds text regions and prepares each crop for matching. Priority:</w:t>
+      </w:r>
+      <w:r>
+        <w:t xml:space="preserve"> </w:t>
+      </w:r>
+      <w:r>
+        <w:rPr>
+          <w:b/>
+          <w:bCs/>
+        </w:rPr>
+        <w:t xml:space="preserve">High</w:t>
+      </w:r>
+      <w:r>
+        <w:t xml:space="preserve">.</w:t>
+      </w:r>
+    </w:p>
+    <w:p>
+      <w:pPr>
+        <w:pStyle w:val="Heading4"/>
+      </w:pPr>
+      <w:r>
+        <w:t xml:space="preserve">4.2.2 Stimulus/Response Sequences</w:t>
       </w:r>
     </w:p>
     <w:p>
@@ -13755,22 +13966,6 @@
         <w:keepNext/>
       </w:pPr>
       <w:r>
-        <w:t xml:space="preserve">The backend finds text regions and prepares each crop.</w:t>
-      </w:r>
-      <w:r>
-        <w:t xml:space="preserve"> </w:t>
-      </w:r>
-      <w:r>
-        <w:rPr>
-          <w:b/>
-          <w:bCs/>
-        </w:rPr>
-        <w:t xml:space="preserve">Stimulus/response:</w:t>
-      </w:r>
-      <w:r>
-        <w:t xml:space="preserve"> </w:t>
-      </w:r>
-      <w:r>
         <w:rPr>
           <w:rStyle w:val="VerbatimChar"/>
         </w:rPr>
@@ -13780,7 +13975,16 @@
         <w:t xml:space="preserve"> </w:t>
       </w:r>
       <w:r>
-        <w:t xml:space="preserve">receives the image → localizer returns boxes → each crop is preprocessed and embedded → status advances in the Processing zone.</w:t>
+        <w:t xml:space="preserve">receives the image → localizer returns bounding boxes → each crop is preprocessed and embedded → status advances in the Processing zone.</w:t>
+      </w:r>
+    </w:p>
+    <w:p>
+      <w:pPr>
+        <w:pStyle w:val="Heading4"/>
+        <w:keepNext/>
+      </w:pPr>
+      <w:r>
+        <w:t xml:space="preserve">4.2.3 Functional Requirements</w:t>
       </w:r>
     </w:p>
     <w:tbl>
@@ -13819,7 +14023,7 @@
               <w:jc w:val="left"/>
             </w:pPr>
             <w:r>
-              <w:t xml:space="preserve">Requirement</w:t>
+              <w:t xml:space="preserve">Requirement Description</w:t>
             </w:r>
           </w:p>
         </w:tc>
@@ -13992,10 +14196,46 @@
     <w:p>
       <w:pPr>
         <w:pStyle w:val="Heading3"/>
-        <w:keepNext/>
-      </w:pPr>
-      <w:r>
-        <w:t xml:space="preserve">4.3 Font Matching and Top-K Results — Priority: High</w:t>
+      </w:pPr>
+      <w:r>
+        <w:t xml:space="preserve">4.3 Font Matching and Top-K Results</w:t>
+      </w:r>
+    </w:p>
+    <w:p>
+      <w:pPr>
+        <w:pStyle w:val="Heading4"/>
+      </w:pPr>
+      <w:r>
+        <w:t xml:space="preserve">4.3.1 Description and Priority</w:t>
+      </w:r>
+    </w:p>
+    <w:p>
+      <w:pPr>
+        <w:pStyle w:val="FirstParagraph"/>
+      </w:pPr>
+      <w:r>
+        <w:t xml:space="preserve">For each crop, the system ranks the palette and decides known vs. unknown. Priority:</w:t>
+      </w:r>
+      <w:r>
+        <w:t xml:space="preserve"> </w:t>
+      </w:r>
+      <w:r>
+        <w:rPr>
+          <w:b/>
+          <w:bCs/>
+        </w:rPr>
+        <w:t xml:space="preserve">High</w:t>
+      </w:r>
+      <w:r>
+        <w:t xml:space="preserve">.</w:t>
+      </w:r>
+    </w:p>
+    <w:p>
+      <w:pPr>
+        <w:pStyle w:val="Heading4"/>
+      </w:pPr>
+      <w:r>
+        <w:t xml:space="preserve">4.3.2 Stimulus/Response Sequences</w:t>
       </w:r>
     </w:p>
     <w:p>
@@ -14004,23 +14244,16 @@
         <w:keepNext/>
       </w:pPr>
       <w:r>
-        <w:t xml:space="preserve">For each crop, rank the palette and decide known vs. unknown.</w:t>
-      </w:r>
-      <w:r>
-        <w:t xml:space="preserve"> </w:t>
-      </w:r>
-      <w:r>
-        <w:rPr>
-          <w:b/>
-          <w:bCs/>
-        </w:rPr>
-        <w:t xml:space="preserve">Stimulus/response:</w:t>
-      </w:r>
-      <w:r>
-        <w:t xml:space="preserve"> </w:t>
-      </w:r>
-      <w:r>
-        <w:t xml:space="preserve">embedding is compared to the palette → if best similarity ≥ τ, return ranked Top-K; else mark the crop out-of-palette.</w:t>
+        <w:t xml:space="preserve">Embedding is compared to the palette → if best similarity ≥ τ, return the ranked Top-K; else mark the crop out-of-palette.</w:t>
+      </w:r>
+    </w:p>
+    <w:p>
+      <w:pPr>
+        <w:pStyle w:val="Heading4"/>
+        <w:keepNext/>
+      </w:pPr>
+      <w:r>
+        <w:t xml:space="preserve">4.3.3 Functional Requirements</w:t>
       </w:r>
     </w:p>
     <w:tbl>
@@ -14059,7 +14292,7 @@
               <w:jc w:val="left"/>
             </w:pPr>
             <w:r>
-              <w:t xml:space="preserve">Requirement</w:t>
+              <w:t xml:space="preserve">Requirement Description</w:t>
             </w:r>
           </w:p>
         </w:tc>
@@ -14291,10 +14524,46 @@
     <w:p>
       <w:pPr>
         <w:pStyle w:val="Heading3"/>
-        <w:keepNext/>
-      </w:pPr>
-      <w:r>
-        <w:t xml:space="preserve">4.4 Font Preview — Priority: Med</w:t>
+      </w:pPr>
+      <w:r>
+        <w:t xml:space="preserve">4.4 Font Preview</w:t>
+      </w:r>
+    </w:p>
+    <w:p>
+      <w:pPr>
+        <w:pStyle w:val="Heading4"/>
+      </w:pPr>
+      <w:r>
+        <w:t xml:space="preserve">4.4.1 Description and Priority</w:t>
+      </w:r>
+    </w:p>
+    <w:p>
+      <w:pPr>
+        <w:pStyle w:val="FirstParagraph"/>
+      </w:pPr>
+      <w:r>
+        <w:t xml:space="preserve">The user visually confirms a match against live-rendered candidates. Priority:</w:t>
+      </w:r>
+      <w:r>
+        <w:t xml:space="preserve"> </w:t>
+      </w:r>
+      <w:r>
+        <w:rPr>
+          <w:b/>
+          <w:bCs/>
+        </w:rPr>
+        <w:t xml:space="preserve">Med</w:t>
+      </w:r>
+      <w:r>
+        <w:t xml:space="preserve">.</w:t>
+      </w:r>
+    </w:p>
+    <w:p>
+      <w:pPr>
+        <w:pStyle w:val="Heading4"/>
+      </w:pPr>
+      <w:r>
+        <w:t xml:space="preserve">4.4.2 Stimulus/Response Sequences</w:t>
       </w:r>
     </w:p>
     <w:p>
@@ -14303,23 +14572,16 @@
         <w:keepNext/>
       </w:pPr>
       <w:r>
-        <w:t xml:space="preserve">Let the user visually confirm a match.</w:t>
-      </w:r>
-      <w:r>
-        <w:t xml:space="preserve"> </w:t>
-      </w:r>
-      <w:r>
-        <w:rPr>
-          <w:b/>
-          <w:bCs/>
-        </w:rPr>
-        <w:t xml:space="preserve">Stimulus/response:</w:t>
-      </w:r>
-      <w:r>
-        <w:t xml:space="preserve"> </w:t>
-      </w:r>
-      <w:r>
-        <w:t xml:space="preserve">for each candidate the app renders the detected text string in that font.</w:t>
+        <w:t xml:space="preserve">For each candidate font, the app renders the detected text string in that font beside the crop.</w:t>
+      </w:r>
+    </w:p>
+    <w:p>
+      <w:pPr>
+        <w:pStyle w:val="Heading4"/>
+        <w:keepNext/>
+      </w:pPr>
+      <w:r>
+        <w:t xml:space="preserve">4.4.3 Functional Requirements</w:t>
       </w:r>
     </w:p>
     <w:tbl>
@@ -14358,7 +14620,7 @@
               <w:jc w:val="left"/>
             </w:pPr>
             <w:r>
-              <w:t xml:space="preserve">Requirement</w:t>
+              <w:t xml:space="preserve">Requirement Description</w:t>
             </w:r>
           </w:p>
         </w:tc>
@@ -14453,19 +14715,12 @@
       </w:tr>
     </w:tbl>
     <w:p>
-      <w:r>
-        <w:pict>
-          <v:rect style="width:0;height:1.5pt" o:hralign="center" o:hrstd="t" o:hr="t"/>
-        </w:pict>
-      </w:r>
-    </w:p>
-    <w:p>
       <w:pPr>
         <w:pStyle w:val="Heading2"/>
         <w:keepNext/>
       </w:pPr>
       <w:r>
-        <w:t xml:space="preserve">5. Non-Functional Requirements</w:t>
+        <w:t xml:space="preserve">5. Other Nonfunctional Requirements</w:t>
       </w:r>
     </w:p>
     <w:p>
@@ -14474,7 +14729,7 @@
         <w:keepNext/>
       </w:pPr>
       <w:r>
-        <w:t xml:space="preserve">5.1 Performance</w:t>
+        <w:t xml:space="preserve">5.1 Performance Requirements</w:t>
       </w:r>
     </w:p>
     <w:tbl>
@@ -14513,7 +14768,7 @@
               <w:jc w:val="left"/>
             </w:pPr>
             <w:r>
-              <w:t xml:space="preserve">Requirement</w:t>
+              <w:t xml:space="preserve">Requirement Description</w:t>
             </w:r>
           </w:p>
         </w:tc>
@@ -14598,7 +14853,6 @@
           <w:p>
             <w:pPr>
               <w:pStyle w:val="Compact"/>
-              <w:keepNext/>
               <w:jc w:val="left"/>
             </w:pPr>
             <w:r>
@@ -14614,7 +14868,16 @@
         <w:keepNext/>
       </w:pPr>
       <w:r>
-        <w:t xml:space="preserve">5.2 Usability</w:t>
+        <w:t xml:space="preserve">5.2 Safety Requirements</w:t>
+      </w:r>
+    </w:p>
+    <w:p>
+      <w:pPr>
+        <w:pStyle w:val="FirstParagraph"/>
+        <w:keepNext/>
+      </w:pPr>
+      <w:r>
+        <w:t xml:space="preserve">The system controls no physical process, so no physical-safety hazards exist. Against data loss: uploaded images are processed in memory and never written to disk, so a crash can lose at most the in-flight request; model weights and font assets are read-only at runtime.</w:t>
       </w:r>
     </w:p>
     <w:tbl>
@@ -14653,7 +14916,7 @@
               <w:jc w:val="left"/>
             </w:pPr>
             <w:r>
-              <w:t xml:space="preserve">Requirement</w:t>
+              <w:t xml:space="preserve">Requirement Description</w:t>
             </w:r>
           </w:p>
         </w:tc>
@@ -14691,54 +14954,15 @@
               <w:jc w:val="left"/>
             </w:pPr>
             <w:r>
-              <w:t xml:space="preserve">A first-time user shall complete upload → results without instructions, in one page with no navigation.</w:t>
-            </w:r>
-          </w:p>
-        </w:tc>
-        <w:tc>
-          <w:tcPr/>
-          <w:p>
-            <w:pPr>
-              <w:pStyle w:val="Compact"/>
-              <w:jc w:val="left"/>
-            </w:pPr>
-            <w:r>
-              <w:t xml:space="preserve">High</w:t>
-            </w:r>
-          </w:p>
-        </w:tc>
-      </w:tr>
-      <w:tr>
-        <w:tc>
-          <w:tcPr/>
-          <w:p>
-            <w:pPr>
-              <w:pStyle w:val="Compact"/>
-              <w:jc w:val="left"/>
-            </w:pPr>
-            <w:r>
-              <w:t xml:space="preserve">REQ-5.2-2</w:t>
-            </w:r>
-          </w:p>
-        </w:tc>
-        <w:tc>
-          <w:tcPr/>
-          <w:p>
-            <w:pPr>
-              <w:pStyle w:val="Compact"/>
-              <w:jc w:val="left"/>
-            </w:pPr>
-            <w:r>
-              <w:t xml:space="preserve">Scores and known/unknown status shall be visible without interaction.</w:t>
-            </w:r>
-          </w:p>
-        </w:tc>
-        <w:tc>
-          <w:tcPr/>
-          <w:p>
-            <w:pPr>
-              <w:pStyle w:val="Compact"/>
-              <w:keepNext/>
+              <w:t xml:space="preserve">The system shall open model weights and font assets read-only at runtime, so a failed request cannot corrupt them.</w:t>
+            </w:r>
+          </w:p>
+        </w:tc>
+        <w:tc>
+          <w:tcPr/>
+          <w:p>
+            <w:pPr>
+              <w:pStyle w:val="Compact"/>
               <w:jc w:val="left"/>
             </w:pPr>
             <w:r>
@@ -14754,7 +14978,16 @@
         <w:keepNext/>
       </w:pPr>
       <w:r>
-        <w:t xml:space="preserve">5.3 Reliability and Portability</w:t>
+        <w:t xml:space="preserve">5.3 Security Requirements</w:t>
+      </w:r>
+    </w:p>
+    <w:p>
+      <w:pPr>
+        <w:pStyle w:val="FirstParagraph"/>
+        <w:keepNext/>
+      </w:pPr>
+      <w:r>
+        <w:t xml:space="preserve">As a single-user local demo the app has no authentication and no persistence; no personal data is collected, so no retention obligations arise under data-privacy regulation.</w:t>
       </w:r>
     </w:p>
     <w:tbl>
@@ -14793,7 +15026,7 @@
               <w:jc w:val="left"/>
             </w:pPr>
             <w:r>
-              <w:t xml:space="preserve">Requirement</w:t>
+              <w:t xml:space="preserve">Requirement Description</w:t>
             </w:r>
           </w:p>
         </w:tc>
@@ -14831,7 +15064,7 @@
               <w:jc w:val="left"/>
             </w:pPr>
             <w:r>
-              <w:t xml:space="preserve">The system shall handle an unreadable/oversized/textless upload without crashing, returning a clear message.</w:t>
+              <w:t xml:space="preserve">The system shall process uploads in memory and discard them when the request completes; no upload shall be stored beyond the request lifetime.</w:t>
             </w:r>
           </w:p>
         </w:tc>
@@ -14869,15 +15102,31 @@
               <w:jc w:val="left"/>
             </w:pPr>
             <w:r>
-              <w:t xml:space="preserve">The system shall run from a single Docker image on a clean machine with no manual dependency setup.</w:t>
-            </w:r>
-          </w:p>
-        </w:tc>
-        <w:tc>
-          <w:tcPr/>
-          <w:p>
-            <w:pPr>
-              <w:pStyle w:val="Compact"/>
+              <w:t xml:space="preserve">The server shall bind only to the</w:t>
+            </w:r>
+            <w:r>
+              <w:t xml:space="preserve"> </w:t>
+            </w:r>
+            <w:r>
+              <w:rPr>
+                <w:rStyle w:val="VerbatimChar"/>
+              </w:rPr>
+              <w:t xml:space="preserve">localhost</w:t>
+            </w:r>
+            <w:r>
+              <w:t xml:space="preserve"> </w:t>
+            </w:r>
+            <w:r>
+              <w:t xml:space="preserve">interface and accept no remote connections.</w:t>
+            </w:r>
+          </w:p>
+        </w:tc>
+        <w:tc>
+          <w:tcPr/>
+          <w:p>
+            <w:pPr>
+              <w:pStyle w:val="Compact"/>
+              <w:keepNext/>
               <w:jc w:val="left"/>
             </w:pPr>
             <w:r>
@@ -14889,37 +15138,601 @@
     </w:tbl>
     <w:p>
       <w:pPr>
+        <w:pStyle w:val="Heading3"/>
+        <w:keepNext/>
+      </w:pPr>
+      <w:r>
+        <w:t xml:space="preserve">5.4 Software Quality Attributes</w:t>
+      </w:r>
+    </w:p>
+    <w:tbl>
+      <w:tblPr>
+        <w:tblStyle w:val="Table"/>
+        <w:tblW w:type="pct" w:w="5000"/>
+        <w:tblLayout w:type="fixed"/>
+        <w:tblLook w:firstRow="1" w:lastRow="0" w:firstColumn="0" w:lastColumn="0" w:noHBand="0" w:noVBand="0" w:val="0020"/>
+      </w:tblPr>
+      <w:tblGrid>
+        <w:gridCol w:w="2640"/>
+        <w:gridCol w:w="2640"/>
+        <w:gridCol w:w="2640"/>
+      </w:tblGrid>
+      <w:tr>
+        <w:trPr>
+          <w:tblHeader w:val="on"/>
+        </w:trPr>
+        <w:tc>
+          <w:tcPr/>
+          <w:p>
+            <w:pPr>
+              <w:pStyle w:val="Compact"/>
+              <w:jc w:val="left"/>
+            </w:pPr>
+            <w:r>
+              <w:t xml:space="preserve">ID</w:t>
+            </w:r>
+          </w:p>
+        </w:tc>
+        <w:tc>
+          <w:tcPr/>
+          <w:p>
+            <w:pPr>
+              <w:pStyle w:val="Compact"/>
+              <w:jc w:val="left"/>
+            </w:pPr>
+            <w:r>
+              <w:t xml:space="preserve">Requirement Description</w:t>
+            </w:r>
+          </w:p>
+        </w:tc>
+        <w:tc>
+          <w:tcPr/>
+          <w:p>
+            <w:pPr>
+              <w:pStyle w:val="Compact"/>
+              <w:jc w:val="left"/>
+            </w:pPr>
+            <w:r>
+              <w:t xml:space="preserve">Priority</w:t>
+            </w:r>
+          </w:p>
+        </w:tc>
+      </w:tr>
+      <w:tr>
+        <w:tc>
+          <w:tcPr/>
+          <w:p>
+            <w:pPr>
+              <w:pStyle w:val="Compact"/>
+              <w:jc w:val="left"/>
+            </w:pPr>
+            <w:r>
+              <w:t xml:space="preserve">REQ-5.4-1</w:t>
+            </w:r>
+          </w:p>
+        </w:tc>
+        <w:tc>
+          <w:tcPr/>
+          <w:p>
+            <w:pPr>
+              <w:pStyle w:val="Compact"/>
+              <w:jc w:val="left"/>
+            </w:pPr>
+            <w:r>
+              <w:t xml:space="preserve">Usability: a first-time user shall complete upload → results without instructions, in one page with no navigation.</w:t>
+            </w:r>
+          </w:p>
+        </w:tc>
+        <w:tc>
+          <w:tcPr/>
+          <w:p>
+            <w:pPr>
+              <w:pStyle w:val="Compact"/>
+              <w:jc w:val="left"/>
+            </w:pPr>
+            <w:r>
+              <w:t xml:space="preserve">High</w:t>
+            </w:r>
+          </w:p>
+        </w:tc>
+      </w:tr>
+      <w:tr>
+        <w:tc>
+          <w:tcPr/>
+          <w:p>
+            <w:pPr>
+              <w:pStyle w:val="Compact"/>
+              <w:jc w:val="left"/>
+            </w:pPr>
+            <w:r>
+              <w:t xml:space="preserve">REQ-5.4-2</w:t>
+            </w:r>
+          </w:p>
+        </w:tc>
+        <w:tc>
+          <w:tcPr/>
+          <w:p>
+            <w:pPr>
+              <w:pStyle w:val="Compact"/>
+              <w:jc w:val="left"/>
+            </w:pPr>
+            <w:r>
+              <w:t xml:space="preserve">Usability: scores and known/unknown status shall be visible without interaction.</w:t>
+            </w:r>
+          </w:p>
+        </w:tc>
+        <w:tc>
+          <w:tcPr/>
+          <w:p>
+            <w:pPr>
+              <w:pStyle w:val="Compact"/>
+              <w:jc w:val="left"/>
+            </w:pPr>
+            <w:r>
+              <w:t xml:space="preserve">Med</w:t>
+            </w:r>
+          </w:p>
+        </w:tc>
+      </w:tr>
+      <w:tr>
+        <w:tc>
+          <w:tcPr/>
+          <w:p>
+            <w:pPr>
+              <w:pStyle w:val="Compact"/>
+              <w:jc w:val="left"/>
+            </w:pPr>
+            <w:r>
+              <w:t xml:space="preserve">REQ-5.4-3</w:t>
+            </w:r>
+          </w:p>
+        </w:tc>
+        <w:tc>
+          <w:tcPr/>
+          <w:p>
+            <w:pPr>
+              <w:pStyle w:val="Compact"/>
+              <w:jc w:val="left"/>
+            </w:pPr>
+            <w:r>
+              <w:t xml:space="preserve">Reliability: the system shall handle an unreadable/oversized/textless upload without crashing, returning a clear message.</w:t>
+            </w:r>
+          </w:p>
+        </w:tc>
+        <w:tc>
+          <w:tcPr/>
+          <w:p>
+            <w:pPr>
+              <w:pStyle w:val="Compact"/>
+              <w:jc w:val="left"/>
+            </w:pPr>
+            <w:r>
+              <w:t xml:space="preserve">High</w:t>
+            </w:r>
+          </w:p>
+        </w:tc>
+      </w:tr>
+      <w:tr>
+        <w:tc>
+          <w:tcPr/>
+          <w:p>
+            <w:pPr>
+              <w:pStyle w:val="Compact"/>
+              <w:jc w:val="left"/>
+            </w:pPr>
+            <w:r>
+              <w:t xml:space="preserve">REQ-5.4-4</w:t>
+            </w:r>
+          </w:p>
+        </w:tc>
+        <w:tc>
+          <w:tcPr/>
+          <w:p>
+            <w:pPr>
+              <w:pStyle w:val="Compact"/>
+              <w:jc w:val="left"/>
+            </w:pPr>
+            <w:r>
+              <w:t xml:space="preserve">Portability: the system shall run from a single Docker image on a clean machine with no manual dependency setup.</w:t>
+            </w:r>
+          </w:p>
+        </w:tc>
+        <w:tc>
+          <w:tcPr/>
+          <w:p>
+            <w:pPr>
+              <w:pStyle w:val="Compact"/>
+              <w:jc w:val="left"/>
+            </w:pPr>
+            <w:r>
+              <w:t xml:space="preserve">Med</w:t>
+            </w:r>
+          </w:p>
+        </w:tc>
+      </w:tr>
+    </w:tbl>
+    <w:p>
+      <w:pPr>
+        <w:pStyle w:val="Heading3"/>
+      </w:pPr>
+      <w:r>
+        <w:t xml:space="preserve">5.5 Business Rules</w:t>
+      </w:r>
+    </w:p>
+    <w:p>
+      <w:pPr>
+        <w:pStyle w:val="Compact"/>
+        <w:numPr>
+          <w:ilvl w:val="0"/>
+          <w:numId w:val="1012"/>
+        </w:numPr>
+      </w:pPr>
+      <w:r>
+        <w:t xml:space="preserve">Only fonts from the open-source Google Fonts palette may be named in a result; the system never identifies or recommends a commercial font.</w:t>
+      </w:r>
+    </w:p>
+    <w:p>
+      <w:pPr>
+        <w:pStyle w:val="Compact"/>
+        <w:numPr>
+          <w:ilvl w:val="0"/>
+          <w:numId w:val="1012"/>
+        </w:numPr>
+      </w:pPr>
+      <w:r>
+        <w:t xml:space="preserve">A crop whose best similarity falls below τ must be reported as unknown; the system never forces a closed-set label onto an out-of-palette crop.</w:t>
+      </w:r>
+    </w:p>
+    <w:p>
+      <w:pPr>
+        <w:pStyle w:val="Compact"/>
+        <w:numPr>
+          <w:ilvl w:val="0"/>
+          <w:numId w:val="1012"/>
+        </w:numPr>
+      </w:pPr>
+      <w:r>
+        <w:t xml:space="preserve">Bundled sample images must come from real generative-AI output and must never overlap any training data.</w:t>
+      </w:r>
+    </w:p>
+    <w:p>
+      <w:pPr>
+        <w:pStyle w:val="Heading2"/>
+      </w:pPr>
+      <w:r>
+        <w:t xml:space="preserve">6. Other Requirements</w:t>
+      </w:r>
+    </w:p>
+    <w:p>
+      <w:pPr>
+        <w:pStyle w:val="Compact"/>
+        <w:numPr>
+          <w:ilvl w:val="0"/>
+          <w:numId w:val="1013"/>
+        </w:numPr>
+      </w:pPr>
+      <w:r>
+        <w:rPr>
+          <w:b/>
+          <w:bCs/>
+        </w:rPr>
+        <w:t xml:space="preserve">Licensing:</w:t>
+      </w:r>
+      <w:r>
+        <w:t xml:space="preserve"> </w:t>
+      </w:r>
+      <w:r>
+        <w:t xml:space="preserve">every runtime component and font asset is open-source; the system shall carry no mandatory license or subscription cost.</w:t>
+      </w:r>
+    </w:p>
+    <w:p>
+      <w:pPr>
+        <w:pStyle w:val="Compact"/>
+        <w:numPr>
+          <w:ilvl w:val="0"/>
+          <w:numId w:val="1013"/>
+        </w:numPr>
+      </w:pPr>
+      <w:r>
+        <w:rPr>
+          <w:b/>
+          <w:bCs/>
+        </w:rPr>
+        <w:t xml:space="preserve">Data retention:</w:t>
+      </w:r>
+      <w:r>
+        <w:t xml:space="preserve"> </w:t>
+      </w:r>
+      <w:r>
+        <w:t xml:space="preserve">none — the system stores no user data (see REQ-5.3-1).</w:t>
+      </w:r>
+    </w:p>
+    <w:p>
+      <w:pPr>
+        <w:pStyle w:val="Compact"/>
+        <w:keepNext/>
+        <w:numPr>
+          <w:ilvl w:val="0"/>
+          <w:numId w:val="1013"/>
+        </w:numPr>
+      </w:pPr>
+      <w:r>
+        <w:rPr>
+          <w:b/>
+          <w:bCs/>
+        </w:rPr>
+        <w:t xml:space="preserve">Internationalization:</w:t>
+      </w:r>
+      <w:r>
+        <w:t xml:space="preserve"> </w:t>
+      </w:r>
+      <w:r>
+        <w:t xml:space="preserve">the interface is English-only; the recognition palette is limited to Latin-script fonts, matching the thesis scope.</w:t>
+      </w:r>
+    </w:p>
+    <w:p>
+      <w:pPr>
+        <w:pStyle w:val="Heading2"/>
+        <w:keepNext/>
+      </w:pPr>
+      <w:r>
+        <w:t xml:space="preserve">Appendix A: Glossary</w:t>
+      </w:r>
+    </w:p>
+    <w:tbl>
+      <w:tblPr>
+        <w:tblStyle w:val="Table"/>
+        <w:tblW w:type="pct" w:w="5000"/>
+        <w:tblLayout w:type="fixed"/>
+        <w:tblLook w:firstRow="1" w:lastRow="0" w:firstColumn="0" w:lastColumn="0" w:noHBand="0" w:noVBand="0" w:val="0020"/>
+      </w:tblPr>
+      <w:tblGrid>
+        <w:gridCol w:w="3960"/>
+        <w:gridCol w:w="3960"/>
+      </w:tblGrid>
+      <w:tr>
+        <w:trPr>
+          <w:tblHeader w:val="on"/>
+        </w:trPr>
+        <w:tc>
+          <w:tcPr/>
+          <w:p>
+            <w:pPr>
+              <w:pStyle w:val="Compact"/>
+              <w:jc w:val="left"/>
+            </w:pPr>
+            <w:r>
+              <w:t xml:space="preserve">Term</w:t>
+            </w:r>
+          </w:p>
+        </w:tc>
+        <w:tc>
+          <w:tcPr/>
+          <w:p>
+            <w:pPr>
+              <w:pStyle w:val="Compact"/>
+              <w:jc w:val="left"/>
+            </w:pPr>
+            <w:r>
+              <w:t xml:space="preserve">Definition</w:t>
+            </w:r>
+          </w:p>
+        </w:tc>
+      </w:tr>
+      <w:tr>
+        <w:tc>
+          <w:tcPr/>
+          <w:p>
+            <w:pPr>
+              <w:pStyle w:val="Compact"/>
+              <w:jc w:val="left"/>
+            </w:pPr>
+            <w:r>
+              <w:t xml:space="preserve">Typographic hallucination</w:t>
+            </w:r>
+          </w:p>
+        </w:tc>
+        <w:tc>
+          <w:tcPr/>
+          <w:p>
+            <w:pPr>
+              <w:pStyle w:val="Compact"/>
+              <w:jc w:val="left"/>
+            </w:pPr>
+            <w:r>
+              <w:t xml:space="preserve">Probabilistic glyph deformation (warping, kerning jitter, smear) that GenAI introduces into rendered text.</w:t>
+            </w:r>
+          </w:p>
+        </w:tc>
+      </w:tr>
+      <w:tr>
+        <w:tc>
+          <w:tcPr/>
+          <w:p>
+            <w:pPr>
+              <w:pStyle w:val="Compact"/>
+              <w:jc w:val="left"/>
+            </w:pPr>
+            <w:r>
+              <w:t xml:space="preserve">Palette</w:t>
+            </w:r>
+          </w:p>
+        </w:tc>
+        <w:tc>
+          <w:tcPr/>
+          <w:p>
+            <w:pPr>
+              <w:pStyle w:val="Compact"/>
+              <w:jc w:val="left"/>
+            </w:pPr>
+            <w:r>
+              <w:t xml:space="preserve">The curated closed set of 50–100 known Google Fonts the model can name.</w:t>
+            </w:r>
+          </w:p>
+        </w:tc>
+      </w:tr>
+      <w:tr>
+        <w:tc>
+          <w:tcPr/>
+          <w:p>
+            <w:pPr>
+              <w:pStyle w:val="Compact"/>
+              <w:jc w:val="left"/>
+            </w:pPr>
+            <w:r>
+              <w:t xml:space="preserve">Open-set / reject</w:t>
+            </w:r>
+          </w:p>
+        </w:tc>
+        <w:tc>
+          <w:tcPr/>
+          <w:p>
+            <w:pPr>
+              <w:pStyle w:val="Compact"/>
+              <w:jc w:val="left"/>
+            </w:pPr>
+            <w:r>
+              <w:t xml:space="preserve">Returning</w:t>
+            </w:r>
+            <w:r>
+              <w:t xml:space="preserve"> </w:t>
+            </w:r>
+            <w:r>
+              <w:t xml:space="preserve">“unknown”</w:t>
+            </w:r>
+            <w:r>
+              <w:t xml:space="preserve"> </w:t>
+            </w:r>
+            <w:r>
+              <w:t xml:space="preserve">when a crop’s best match falls below threshold</w:t>
+            </w:r>
+            <w:r>
+              <w:t xml:space="preserve"> </w:t>
+            </w:r>
+            <w:r>
+              <w:rPr>
+                <w:b/>
+                <w:bCs/>
+              </w:rPr>
+              <w:t xml:space="preserve">τ</w:t>
+            </w:r>
+            <w:r>
+              <w:t xml:space="preserve">, instead of forcing a wrong label.</w:t>
+            </w:r>
+          </w:p>
+        </w:tc>
+      </w:tr>
+      <w:tr>
+        <w:tc>
+          <w:tcPr/>
+          <w:p>
+            <w:pPr>
+              <w:pStyle w:val="Compact"/>
+              <w:jc w:val="left"/>
+            </w:pPr>
+            <w:r>
+              <w:t xml:space="preserve">Top-K</w:t>
+            </w:r>
+          </w:p>
+        </w:tc>
+        <w:tc>
+          <w:tcPr/>
+          <w:p>
+            <w:pPr>
+              <w:pStyle w:val="Compact"/>
+              <w:jc w:val="left"/>
+            </w:pPr>
+            <w:r>
+              <w:t xml:space="preserve">The K highest-ranked font candidates for one text crop (K = 3 in the demo).</w:t>
+            </w:r>
+          </w:p>
+        </w:tc>
+      </w:tr>
+      <w:tr>
+        <w:tc>
+          <w:tcPr/>
+          <w:p>
+            <w:pPr>
+              <w:pStyle w:val="Compact"/>
+              <w:jc w:val="left"/>
+            </w:pPr>
+            <w:r>
+              <w:t xml:space="preserve">Embedding</w:t>
+            </w:r>
+          </w:p>
+        </w:tc>
+        <w:tc>
+          <w:tcPr/>
+          <w:p>
+            <w:pPr>
+              <w:pStyle w:val="Compact"/>
+              <w:jc w:val="left"/>
+            </w:pPr>
+            <w:r>
+              <w:t xml:space="preserve">The fixed-length style vector produced by the DINOv2 encoder + metric head.</w:t>
+            </w:r>
+          </w:p>
+        </w:tc>
+      </w:tr>
+      <w:tr>
+        <w:tc>
+          <w:tcPr/>
+          <w:p>
+            <w:pPr>
+              <w:pStyle w:val="Compact"/>
+              <w:jc w:val="left"/>
+            </w:pPr>
+            <w:r>
+              <w:t xml:space="preserve">SSIM</w:t>
+            </w:r>
+          </w:p>
+        </w:tc>
+        <w:tc>
+          <w:tcPr/>
+          <w:p>
+            <w:pPr>
+              <w:pStyle w:val="Compact"/>
+              <w:jc w:val="left"/>
+            </w:pPr>
+            <w:r>
+              <w:t xml:space="preserve">Structural Similarity Index — re-render score between the input crop and the predicted font.</w:t>
+            </w:r>
+          </w:p>
+        </w:tc>
+      </w:tr>
+    </w:tbl>
+    <w:p>
+      <w:pPr>
+        <w:pStyle w:val="Heading2"/>
+      </w:pPr>
+      <w:r>
+        <w:t xml:space="preserve">Appendix B: Analysis Models</w:t>
+      </w:r>
+    </w:p>
+    <w:p>
+      <w:pPr>
+        <w:pStyle w:val="FirstParagraph"/>
+      </w:pPr>
+      <w:r>
+        <w:t xml:space="preserve">The analysis models for this system live in Chapter 4 and are not duplicated here: the conceptual framework (Fig 8, §4.4.2) models the offline-training versus at-use data flow, the system-architecture diagram (Fig 9, §4.5.2) models the layered client-server structure, and the iterative-incremental SDLC model (Fig 10, §4.6) models the build sequence.</w:t>
+      </w:r>
+    </w:p>
+    <w:p>
+      <w:pPr>
         <w:pStyle w:val="BodyText"/>
       </w:pPr>
       <w:r>
         <w:rPr>
-          <w:i/>
-          <w:iCs/>
-        </w:rPr>
-        <w:t xml:space="preserve">Security note: as a single-user local demo the app has no authentication, no persistence, and stores no uploads beyond the request lifetime; uploaded images are processed in memory and discarded.</w:t>
-      </w:r>
-    </w:p>
-    <w:p>
-      <w:r>
-        <w:pict>
-          <v:rect style="width:0;height:1.5pt" o:hralign="center" o:hrstd="t" o:hr="t"/>
-        </w:pict>
-      </w:r>
-    </w:p>
-    <w:p>
-      <w:pPr>
-        <w:pStyle w:val="Heading2"/>
-      </w:pPr>
-      <w:r>
-        <w:t xml:space="preserve">6. Traceability</w:t>
-      </w:r>
-    </w:p>
-    <w:p>
-      <w:pPr>
-        <w:pStyle w:val="FirstParagraph"/>
-      </w:pPr>
-      <w:r>
-        <w:t xml:space="preserve">Functional features 4.1–4.4 realize the §4.5.1 functional requirements (upload · isolate crop · Top-K or unknown · font preview) and are served by the §4.5.2 architecture (Fig 9). Zones in the §3.1 wireframe map one-to-one to features 4.1 (Input), 4.2 (Processing), and 4.3–4.4 (Results).</w:t>
+          <w:b/>
+          <w:bCs/>
+        </w:rPr>
+        <w:t xml:space="preserve">Traceability.</w:t>
+      </w:r>
+      <w:r>
+        <w:t xml:space="preserve"> </w:t>
+      </w:r>
+      <w:r>
+        <w:t xml:space="preserve">System features 4.1–4.4 realize the §4.5.1 functional requirements (upload · isolate crop · Top-K or unknown · font preview) and are served by the §4.5.2 architecture (Fig 9). Zones in the §3.1 wireframe map one-to-one to features 4.1 (Input), 4.2 (Processing), and 4.3–4.4 (Results).</w:t>
       </w:r>
     </w:p>
     <w:p>
@@ -15006,18 +15819,18 @@
           <wp:inline>
             <wp:extent cx="5334000" cy="2830778"/>
             <wp:effectExtent b="0" l="0" r="0" t="0"/>
-            <wp:docPr descr="Two-panel wireframe. Panel A, the instructions screen: task description (rate 100 text crops from AI-generated images, pick the closest Google Font or mark Unknown/hallucinated), ground rules (work independently, self-paced, never shown the model’s predictions or other raters’ answers), a callout for the palette reference sheet, and a begin button. Panel B, the rating item: an item counter with progress bar, the AI-generated text crop displayed beside a palette-reference-sheet excerpt of labeled specimens, a required question with a searchable palette dropdown, an alternative Unknown/hallucinated radio option, and Back / Save-and-next buttons with per-item saving noted" title="" id="148" name="Picture"/>
+            <wp:docPr descr="Two-panel wireframe. Panel A, the instructions screen: task description (rate 100 text crops from AI-generated images, pick the closest Google Font or mark Unknown/hallucinated), ground rules (work independently, self-paced, never shown the model’s predictions or other raters’ answers), a callout for the palette reference sheet, and a begin button. Panel B, the rating item: an item counter with progress bar, the AI-generated text crop displayed beside a palette-reference-sheet excerpt of labeled specimens, a required question with a searchable palette dropdown, an alternative Unknown/hallucinated radio option, and Back / Save-and-next buttons with per-item saving noted" title="" id="169" name="Picture"/>
             <a:graphic>
               <a:graphicData uri="http://schemas.openxmlformats.org/drawingml/2006/picture">
                 <pic:pic>
                   <pic:nvPicPr>
-                    <pic:cNvPr descr="assets/figures/expert_panel_form.png" id="149" name="Picture"/>
+                    <pic:cNvPr descr="assets/figures/expert_panel_form.png" id="170" name="Picture"/>
                     <pic:cNvPicPr>
                       <a:picLocks noChangeArrowheads="1" noChangeAspect="1"/>
                     </pic:cNvPicPr>
                   </pic:nvPicPr>
                   <pic:blipFill>
-                    <a:blip r:embed="rId147"/>
+                    <a:blip r:embed="rId168"/>
                     <a:stretch>
                       <a:fillRect/>
                     </a:stretch>
@@ -16471,6 +17284,12 @@
     <w:lvlOverride w:ilvl="8">
       <w:startOverride w:val="1"/>
     </w:lvlOverride>
+  </w:num>
+  <w:num w:numId="1012">
+    <w:abstractNumId w:val="991"/>
+  </w:num>
+  <w:num w:numId="1013">
+    <w:abstractNumId w:val="991"/>
   </w:num>
 </w:numbering>
 </file>

</xml_diff>

<commit_message>
feat(methodology): update regarding feedback
</commit_message>
<xml_diff>
--- a/Final Paper.docx
+++ b/Final Paper.docx
@@ -8562,6 +8562,49 @@
         <w:pStyle w:val="BodyText"/>
       </w:pPr>
       <w:r>
+        <w:rPr>
+          <w:b/>
+          <w:bCs/>
+        </w:rPr>
+        <w:t xml:space="preserve">Word-level granularity and mixed typography.</w:t>
+      </w:r>
+      <w:r>
+        <w:t xml:space="preserve"> </w:t>
+      </w:r>
+      <w:r>
+        <w:t xml:space="preserve">The text regions of Figure 8 are delimited at word granularity: the localizer emits one bounding box per word, under the assumption that each word is set in a single typeface. This holds for the overwhelming majority of designed text, where font changes fall between words — a heading face against an accent face — rather than inside them, so word crops make the one-font-per-crop premise of the match test approximately true by construction; adjacent words that receive the same verdict are merged back into a single region in the presentation layer, so a five-word headline still reads as one result. The assumption is checked rather than trusted. The ViT encoder’s forward pass already yields one token per image patch, and when a crop’s patch tokens disagree about style — the signature of two typefaces sharing one box, or of a localizer box that swallowed two words — the crop is flagged as inhomogeneous at no additional inference cost, split at the token-cluster boundary, and each half is matched on its own. A half that remains incoherent after one split receives a third verdict,</w:t>
+      </w:r>
+      <w:r>
+        <w:t xml:space="preserve"> </w:t>
+      </w:r>
+      <w:r>
+        <w:rPr>
+          <w:b/>
+          <w:bCs/>
+        </w:rPr>
+        <w:t xml:space="preserve">“mixed typography”</w:t>
+      </w:r>
+      <w:r>
+        <w:t xml:space="preserve">: distinct from</w:t>
+      </w:r>
+      <w:r>
+        <w:t xml:space="preserve"> </w:t>
+      </w:r>
+      <w:r>
+        <w:t xml:space="preserve">“unknown,”</w:t>
+      </w:r>
+      <w:r>
+        <w:t xml:space="preserve"> </w:t>
+      </w:r>
+      <w:r>
+        <w:t xml:space="preserve">it reports that the crop violates the single-font premise and that no one font can honestly be assigned, instead of confidently naming the majority face and silently discarding the other. Attribution finer than one split — per-glyph styling inside an unsplittable word — is out of scope: it would require character segmentation on precisely the malformed glyphs that defeat segmenters, and a word deliberately set in two typefaces has no single reconstructable font for the template goal in any case.</w:t>
+      </w:r>
+    </w:p>
+    <w:p>
+      <w:pPr>
+        <w:pStyle w:val="BodyText"/>
+      </w:pPr>
+      <w:r>
         <w:t xml:space="preserve">That verdict deserves a precise reading, because it carries a genuine ambiguity. An unknown verdict means the crop resembled no palette font closely enough to justify a name, and the system cannot distinguish between the two situations that produce this: the text may be set in a typeface outside the 50 to 100 selected fonts, or it may be hallucinated past the point where any typeface is recoverable. Both surface identically. What the verdict does guarantee is the behavior that motivates the open-set design of Section 4.2.1, namely that no font is invented to fill the gap, which is precisely what a closed-set classifier is forced to do.</w:t>
       </w:r>
     </w:p>
@@ -8669,88 +8712,32 @@
     </w:p>
     <w:p>
       <w:pPr>
-        <w:pStyle w:val="Heading3"/>
-      </w:pPr>
-      <w:r>
-        <w:t xml:space="preserve">4.4.3 Value Proposition</w:t>
-      </w:r>
-    </w:p>
-    <w:p>
-      <w:pPr>
-        <w:pStyle w:val="FirstParagraph"/>
-      </w:pPr>
-      <w:r>
-        <w:t xml:space="preserve">The design suits its problem for three reasons. It is open-set: unlike a closed-set classifier that must name some font for every input, it can refuse, which matters when many generative crops correspond to no real typeface. It is trained on the hallucination distribution itself rather than on pristine glyphs, so it does not collapse on the warped, re-kerned input that defeats commercial identifiers and clean-glyph baselines. And because it targets a localized open-source palette, every match it returns is immediately reusable at no cost, so recognition ends in a template the designer can rebuild from instead of a paywalled lookup.</w:t>
-      </w:r>
-    </w:p>
-    <w:p>
-      <w:pPr>
-        <w:pStyle w:val="Heading3"/>
-      </w:pPr>
-      <w:r>
-        <w:t xml:space="preserve">4.4.4 High-Level Operational Logic</w:t>
-      </w:r>
-    </w:p>
-    <w:p>
-      <w:pPr>
-        <w:pStyle w:val="FirstParagraph"/>
-      </w:pPr>
-      <w:r>
-        <w:t xml:space="preserve">From the user’s side the interaction is simple. A designer opens the web application, uploads a generative-AI image containing text, and waits a moment while the system localizes and crops the text regions and runs each crop through the inference engine. For every detected region the application displays a short, ranked list of candidate Google Fonts, each shown as a rendered preview, or an</w:t>
-      </w:r>
-      <w:r>
-        <w:t xml:space="preserve"> </w:t>
-      </w:r>
-      <w:r>
-        <w:t xml:space="preserve">“unknown”</w:t>
-      </w:r>
-      <w:r>
-        <w:t xml:space="preserve"> </w:t>
-      </w:r>
-      <w:r>
-        <w:t xml:space="preserve">message when the system judges the glyph to fall outside its palette. The designer picks the closest match and reuses it directly in their own document. The user needs no knowledge of embeddings, thresholds, or the training pipeline; the technical machinery of Sections 4.2 and 4.3 stays hidden behind a single upload-and-review interaction.</w:t>
-      </w:r>
-    </w:p>
-    <w:p>
-      <w:pPr>
-        <w:pStyle w:val="Heading2"/>
-      </w:pPr>
-      <w:r>
-        <w:t xml:space="preserve">4.5 Analysis and Design</w:t>
-      </w:r>
-    </w:p>
-    <w:p>
-      <w:pPr>
-        <w:pStyle w:val="FirstParagraph"/>
-      </w:pPr>
-      <w:r>
-        <w:t xml:space="preserve">This section turns the concept of Section 4.4 into a specification. Section 4.5.1 states what the system must do and the qualities it must have, scoped to a local testing deployment rather than a public service. Section 4.5.2 describes the architecture that satisfies those requirements and how its parts communicate.</w:t>
-      </w:r>
-    </w:p>
-    <w:p>
-      <w:pPr>
-        <w:pStyle w:val="Heading3"/>
-      </w:pPr>
-      <w:r>
-        <w:t xml:space="preserve">4.5.1 Requirements Analysis</w:t>
-      </w:r>
-    </w:p>
-    <w:p>
-      <w:pPr>
-        <w:pStyle w:val="FirstParagraph"/>
-      </w:pPr>
-      <w:r>
-        <w:rPr>
-          <w:b/>
-          <w:bCs/>
-        </w:rPr>
-        <w:t xml:space="preserve">Functional requirements.</w:t>
-      </w:r>
-      <w:r>
-        <w:t xml:space="preserve"> </w:t>
-      </w:r>
-      <w:r>
-        <w:t xml:space="preserve">The system must:</w:t>
+        <w:pStyle w:val="BodyText"/>
+      </w:pPr>
+      <w:r>
+        <w:rPr>
+          <w:b/>
+          <w:bCs/>
+        </w:rPr>
+        <w:t xml:space="preserve">The framework as a step-by-step process.</w:t>
+      </w:r>
+      <w:r>
+        <w:t xml:space="preserve"> </w:t>
+      </w:r>
+      <w:r>
+        <w:t xml:space="preserve">For an outside researcher, the three bands of Figure 8 unfold into the following ordered procedure. Each step names its input, its operation, and its output; the section that owns a step’s parameters is cited in place, so the full detail of any step is one reference away.</w:t>
+      </w:r>
+    </w:p>
+    <w:p>
+      <w:pPr>
+        <w:pStyle w:val="BodyText"/>
+      </w:pPr>
+      <w:r>
+        <w:rPr>
+          <w:i/>
+          <w:iCs/>
+        </w:rPr>
+        <w:t xml:space="preserve">Before deployment — executed once by the researchers:</w:t>
       </w:r>
     </w:p>
     <w:p>
@@ -8762,7 +8749,17 @@
         </w:numPr>
       </w:pPr>
       <w:r>
-        <w:t xml:space="preserve">Accept an uploaded generative-AI image in common raster formats (PNG, JPEG) through the browser.</w:t>
+        <w:rPr>
+          <w:b/>
+          <w:bCs/>
+        </w:rPr>
+        <w:t xml:space="preserve">Select the palette.</w:t>
+      </w:r>
+      <w:r>
+        <w:t xml:space="preserve"> </w:t>
+      </w:r>
+      <w:r>
+        <w:t xml:space="preserve">The top 50–100 Google Fonts are curated across the four structural family classes under the bounding rationale of Section 4.1. Output: a fixed set of font files, each a named class.</w:t>
       </w:r>
     </w:p>
     <w:p>
@@ -8774,7 +8771,17 @@
         </w:numPr>
       </w:pPr>
       <w:r>
-        <w:t xml:space="preserve">Localize and crop each text region in the image using an off-the-shelf text detector.</w:t>
+        <w:rPr>
+          <w:b/>
+          <w:bCs/>
+        </w:rPr>
+        <w:t xml:space="preserve">Render pristine crops.</w:t>
+      </w:r>
+      <w:r>
+        <w:t xml:space="preserve"> </w:t>
+      </w:r>
+      <w:r>
+        <w:t xml:space="preserve">Every palette font is rendered into word crops under the image and text properties of Section 4.3.1. Output: labeled clean images, the font of each known by construction.</w:t>
       </w:r>
     </w:p>
     <w:p>
@@ -8786,7 +8793,31 @@
         </w:numPr>
       </w:pPr>
       <w:r>
-        <w:t xml:space="preserve">Preprocess each crop and embed it with the frozen DINOv2 encoder and the trained metric head.</w:t>
+        <w:rPr>
+          <w:b/>
+          <w:bCs/>
+        </w:rPr>
+        <w:t xml:space="preserve">Degrade.</w:t>
+      </w:r>
+      <w:r>
+        <w:t xml:space="preserve"> </w:t>
+      </w:r>
+      <w:r>
+        <w:t xml:space="preserve">Each pristine crop passes through the operator</w:t>
+      </w:r>
+      <w:r>
+        <w:t xml:space="preserve"> </w:t>
+      </w:r>
+      <m:oMath>
+        <m:r>
+          <m:t>D</m:t>
+        </m:r>
+      </m:oMath>
+      <w:r>
+        <w:t xml:space="preserve"> </w:t>
+      </w:r>
+      <w:r>
+        <w:t xml:space="preserve">of Section 3.2.3 at logged intensities. Output: hallucinated look-alikes carrying the same label; the corpus holds both the pristine crops and the degraded copies, one metadata row each (Table 1).</w:t>
       </w:r>
     </w:p>
     <w:p>
@@ -8798,19 +8829,17 @@
         </w:numPr>
       </w:pPr>
       <w:r>
-        <w:t xml:space="preserve">Apply the open-set decision to each crop, either rejecting it as</w:t>
-      </w:r>
-      <w:r>
-        <w:t xml:space="preserve"> </w:t>
-      </w:r>
-      <w:r>
-        <w:t xml:space="preserve">“unknown”</w:t>
-      </w:r>
-      <w:r>
-        <w:t xml:space="preserve"> </w:t>
-      </w:r>
-      <w:r>
-        <w:t xml:space="preserve">or ranking the localized palette.</w:t>
+        <w:rPr>
+          <w:b/>
+          <w:bCs/>
+        </w:rPr>
+        <w:t xml:space="preserve">Partition.</w:t>
+      </w:r>
+      <w:r>
+        <w:t xml:space="preserve"> </w:t>
+      </w:r>
+      <w:r>
+        <w:t xml:space="preserve">The corpus splits 70/15/15 into training, validation, and test sets, stratified as in Section 4.3.2. The validation and test slices are not touched again until steps 8 and 11.</w:t>
       </w:r>
     </w:p>
     <w:p>
@@ -8822,19 +8851,17 @@
         </w:numPr>
       </w:pPr>
       <w:r>
-        <w:t xml:space="preserve">Return, for every detected region, a Top-K shortlist of candidate Google Fonts or an</w:t>
-      </w:r>
-      <w:r>
-        <w:t xml:space="preserve"> </w:t>
-      </w:r>
-      <w:r>
-        <w:t xml:space="preserve">“unknown”</w:t>
-      </w:r>
-      <w:r>
-        <w:t xml:space="preserve"> </w:t>
-      </w:r>
-      <w:r>
-        <w:t xml:space="preserve">verdict.</w:t>
+        <w:rPr>
+          <w:b/>
+          <w:bCs/>
+        </w:rPr>
+        <w:t xml:space="preserve">Train the teacher.</w:t>
+      </w:r>
+      <w:r>
+        <w:t xml:space="preserve"> </w:t>
+      </w:r>
+      <w:r>
+        <w:t xml:space="preserve">DINOv2 with the LoRA adaptation of Section 4.3.2 is fitted to the font labels on the training slice. Output: a supervising model that never leaves this band.</w:t>
       </w:r>
     </w:p>
     <w:p>
@@ -8846,7 +8873,40 @@
         </w:numPr>
       </w:pPr>
       <w:r>
-        <w:t xml:space="preserve">Render a preview of each candidate font so the user can compare it against the source text.</w:t>
+        <w:rPr>
+          <w:b/>
+          <w:bCs/>
+        </w:rPr>
+        <w:t xml:space="preserve">Train the student.</w:t>
+      </w:r>
+      <w:r>
+        <w:t xml:space="preserve"> </w:t>
+      </w:r>
+      <w:r>
+        <w:t xml:space="preserve">The metric head</w:t>
+      </w:r>
+      <w:r>
+        <w:t xml:space="preserve"> </w:t>
+      </w:r>
+      <m:oMath>
+        <m:sSub>
+          <m:e>
+            <m:r>
+              <m:t>f</m:t>
+            </m:r>
+          </m:e>
+          <m:sub>
+            <m:r>
+              <m:t>θ</m:t>
+            </m:r>
+          </m:sub>
+        </m:sSub>
+      </m:oMath>
+      <w:r>
+        <w:t xml:space="preserve"> </w:t>
+      </w:r>
+      <w:r>
+        <w:t xml:space="preserve">trains on the same slice under two simultaneous signals — the triplet objective on the labels (Chapter 3) and distillation toward the teacher’s similarity judgments, which consults no labels. Output: an embedding function that maps any crop to a font-style fingerprint.</w:t>
       </w:r>
     </w:p>
     <w:p>
@@ -8858,16 +8918,17 @@
         </w:numPr>
       </w:pPr>
       <w:r>
-        <w:t xml:space="preserve">Expose the recognition pipeline through a REST endpoint (</w:t>
-      </w:r>
-      <w:r>
-        <w:rPr>
-          <w:rStyle w:val="VerbatimChar"/>
-        </w:rPr>
-        <w:t xml:space="preserve">/predict</w:t>
-      </w:r>
-      <w:r>
-        <w:t xml:space="preserve">) that the frontend calls.</w:t>
+        <w:rPr>
+          <w:b/>
+          <w:bCs/>
+        </w:rPr>
+        <w:t xml:space="preserve">Build the palette map.</w:t>
+      </w:r>
+      <w:r>
+        <w:t xml:space="preserve"> </w:t>
+      </w:r>
+      <w:r>
+        <w:t xml:space="preserve">Every training crop of each font is embedded by the finished student and averaged into that font’s prototype. Output: one reference fingerprint per palette font.</w:t>
       </w:r>
     </w:p>
     <w:p>
@@ -8879,7 +8940,62 @@
         </w:numPr>
       </w:pPr>
       <w:r>
-        <w:t xml:space="preserve">Load the trained model weights once at startup and reuse them across requests.</w:t>
+        <w:rPr>
+          <w:b/>
+          <w:bCs/>
+        </w:rPr>
+        <w:t xml:space="preserve">Calibrate.</w:t>
+      </w:r>
+      <w:r>
+        <w:t xml:space="preserve"> </w:t>
+      </w:r>
+      <w:r>
+        <w:t xml:space="preserve">Validation crops are embedded and scored against their nearest prototypes;</w:t>
+      </w:r>
+      <w:r>
+        <w:t xml:space="preserve"> </w:t>
+      </w:r>
+      <m:oMath>
+        <m:r>
+          <m:t>τ</m:t>
+        </m:r>
+      </m:oMath>
+      <w:r>
+        <w:t xml:space="preserve"> </w:t>
+      </w:r>
+      <w:r>
+        <w:t xml:space="preserve">is fixed at the cutoff that accepts 95% of the crops whose font truly is in the palette, the operating point of Section 4.10.2. Output: the trained model —</w:t>
+      </w:r>
+      <w:r>
+        <w:t xml:space="preserve"> </w:t>
+      </w:r>
+      <m:oMath>
+        <m:sSub>
+          <m:e>
+            <m:r>
+              <m:t>f</m:t>
+            </m:r>
+          </m:e>
+          <m:sub>
+            <m:r>
+              <m:t>θ</m:t>
+            </m:r>
+          </m:sub>
+        </m:sSub>
+      </m:oMath>
+      <w:r>
+        <w:t xml:space="preserve">, the prototypes, and</w:t>
+      </w:r>
+      <w:r>
+        <w:t xml:space="preserve"> </w:t>
+      </w:r>
+      <m:oMath>
+        <m:r>
+          <m:t>τ</m:t>
+        </m:r>
+      </m:oMath>
+      <w:r>
+        <w:t xml:space="preserve">. The teacher is discarded.</w:t>
       </w:r>
     </w:p>
     <w:p>
@@ -8888,16 +9004,10 @@
       </w:pPr>
       <w:r>
         <w:rPr>
-          <w:b/>
-          <w:bCs/>
-        </w:rPr>
-        <w:t xml:space="preserve">Non-functional requirements.</w:t>
-      </w:r>
-      <w:r>
-        <w:t xml:space="preserve"> </w:t>
-      </w:r>
-      <w:r>
-        <w:t xml:space="preserve">The system should also:</w:t>
+          <w:i/>
+          <w:iCs/>
+        </w:rPr>
+        <w:t xml:space="preserve">At use — executed for every uploaded image:</w:t>
       </w:r>
     </w:p>
     <w:p>
@@ -8909,7 +9019,17 @@
         </w:numPr>
       </w:pPr>
       <w:r>
-        <w:t xml:space="preserve">Be usable through a single upload-and-review interaction that hides the underlying model (usability).</w:t>
+        <w:rPr>
+          <w:b/>
+          <w:bCs/>
+        </w:rPr>
+        <w:t xml:space="preserve">Ingest.</w:t>
+      </w:r>
+      <w:r>
+        <w:t xml:space="preserve"> </w:t>
+      </w:r>
+      <w:r>
+        <w:t xml:space="preserve">The user submits a raster image in an accepted format (Section 4.2.4). The off-the-shelf localizer emits one bounding box per word, and each word crop proceeds independently.</w:t>
       </w:r>
     </w:p>
     <w:p>
@@ -8921,7 +9041,40 @@
         </w:numPr>
       </w:pPr>
       <w:r>
-        <w:t xml:space="preserve">Return results at interactive latency on a single machine, targeting a response within a few seconds per image (responsiveness).</w:t>
+        <w:rPr>
+          <w:b/>
+          <w:bCs/>
+        </w:rPr>
+        <w:t xml:space="preserve">Embed and check.</w:t>
+      </w:r>
+      <w:r>
+        <w:t xml:space="preserve"> </w:t>
+      </w:r>
+      <w:r>
+        <w:t xml:space="preserve">Inside the model’s forward pass each crop is prepared (square-pad, 224², grayscale, normalize; Section 4.3.2), encoded by the frozen backbone, and projected by</w:t>
+      </w:r>
+      <w:r>
+        <w:t xml:space="preserve"> </w:t>
+      </w:r>
+      <m:oMath>
+        <m:sSub>
+          <m:e>
+            <m:r>
+              <m:t>f</m:t>
+            </m:r>
+          </m:e>
+          <m:sub>
+            <m:r>
+              <m:t>θ</m:t>
+            </m:r>
+          </m:sub>
+        </m:sSub>
+      </m:oMath>
+      <w:r>
+        <w:t xml:space="preserve"> </w:t>
+      </w:r>
+      <w:r>
+        <w:t xml:space="preserve">into a fingerprint. The same pass yields the patch tokens for the homogeneity check described above; a flagged crop is split once and each half re-enters this step, and a half that stays incoherent exits with the mixed-typography verdict.</w:t>
       </w:r>
     </w:p>
     <w:p>
@@ -8933,7 +9086,51 @@
         </w:numPr>
       </w:pPr>
       <w:r>
-        <w:t xml:space="preserve">Produce the same output for the same input, through deterministic preprocessing and pinned model weights and seeds (reproducibility).</w:t>
+        <w:rPr>
+          <w:b/>
+          <w:bCs/>
+        </w:rPr>
+        <w:t xml:space="preserve">Decide.</w:t>
+      </w:r>
+      <w:r>
+        <w:t xml:space="preserve"> </w:t>
+      </w:r>
+      <w:r>
+        <w:t xml:space="preserve">The fingerprint’s similarity to its nearest prototype meets the match test: at or above</w:t>
+      </w:r>
+      <w:r>
+        <w:t xml:space="preserve"> </w:t>
+      </w:r>
+      <m:oMath>
+        <m:r>
+          <m:t>τ</m:t>
+        </m:r>
+      </m:oMath>
+      <w:r>
+        <w:t xml:space="preserve">, the crop returns its Top-3 shortlist with similarity scores and live font previews; below</w:t>
+      </w:r>
+      <w:r>
+        <w:t xml:space="preserve"> </w:t>
+      </w:r>
+      <m:oMath>
+        <m:r>
+          <m:t>τ</m:t>
+        </m:r>
+      </m:oMath>
+      <w:r>
+        <w:t xml:space="preserve">, it returns the unknown-font verdict. Adjacent words with the same verdict merge into one region card in the interface (Section 4.5).</w:t>
+      </w:r>
+    </w:p>
+    <w:p>
+      <w:pPr>
+        <w:pStyle w:val="FirstParagraph"/>
+      </w:pPr>
+      <w:r>
+        <w:rPr>
+          <w:i/>
+          <w:iCs/>
+        </w:rPr>
+        <w:t xml:space="preserve">How we measure it — executed offline on held-out data:</w:t>
       </w:r>
     </w:p>
     <w:p>
@@ -8941,11 +9138,21 @@
         <w:pStyle w:val="Compact"/>
         <w:numPr>
           <w:ilvl w:val="0"/>
-          <w:numId w:val="1005"/>
+          <w:numId w:val="1006"/>
         </w:numPr>
       </w:pPr>
       <w:r>
-        <w:t xml:space="preserve">Run from a single Docker image on one host, with no external service dependencies at inference time beyond the bundled weights and font files (portability).</w:t>
+        <w:rPr>
+          <w:b/>
+          <w:bCs/>
+        </w:rPr>
+        <w:t xml:space="preserve">Score recognition.</w:t>
+      </w:r>
+      <w:r>
+        <w:t xml:space="preserve"> </w:t>
+      </w:r>
+      <w:r>
+        <w:t xml:space="preserve">Top-1/Top-3 accuracy on the untouched synthetic test slice and on the real-generative set, whose ground truth is the human-proxy panel consensus of Section 4.2.3.</w:t>
       </w:r>
     </w:p>
     <w:p>
@@ -8953,11 +9160,21 @@
         <w:pStyle w:val="Compact"/>
         <w:numPr>
           <w:ilvl w:val="0"/>
-          <w:numId w:val="1005"/>
+          <w:numId w:val="1006"/>
         </w:numPr>
       </w:pPr>
       <w:r>
-        <w:t xml:space="preserve">Keep the localizer, encoder, metric head, and open-set decision as separable components, so any one can be replaced without rewriting the others (maintainability).</w:t>
+        <w:rPr>
+          <w:b/>
+          <w:bCs/>
+        </w:rPr>
+        <w:t xml:space="preserve">Verify predictions structurally.</w:t>
+      </w:r>
+      <w:r>
+        <w:t xml:space="preserve"> </w:t>
+      </w:r>
+      <w:r>
+        <w:t xml:space="preserve">The re-render check of Section 4.2.2 scores each accepted prediction against its input crop.</w:t>
       </w:r>
     </w:p>
     <w:p>
@@ -8965,11 +9182,126 @@
         <w:pStyle w:val="Compact"/>
         <w:numPr>
           <w:ilvl w:val="0"/>
-          <w:numId w:val="1005"/>
+          <w:numId w:val="1006"/>
         </w:numPr>
       </w:pPr>
       <w:r>
-        <w:t xml:space="preserve">Operate as a single-user local demo, with no authentication, accounts, or multi-user scaling in scope (a deliberate delimitation, consistent with Section 4.1).</w:t>
+        <w:rPr>
+          <w:b/>
+          <w:bCs/>
+        </w:rPr>
+        <w:t xml:space="preserve">Compare.</w:t>
+      </w:r>
+      <w:r>
+        <w:t xml:space="preserve"> </w:t>
+      </w:r>
+      <w:r>
+        <w:t xml:space="preserve">The closed-set baselines and the backbone comparison run under the protocol of Section 4.10.2, on the same data and calibration recipe.</w:t>
+      </w:r>
+    </w:p>
+    <w:p>
+      <w:pPr>
+        <w:pStyle w:val="FirstParagraph"/>
+      </w:pPr>
+      <w:r>
+        <w:t xml:space="preserve">Any researcher holding the released code, the pinned seeds and versions (Section 4.7.3), and this sequence can regenerate the corpus bit-for-bit, retrain both models, arrive at the same</w:t>
+      </w:r>
+      <w:r>
+        <w:t xml:space="preserve"> </w:t>
+      </w:r>
+      <m:oMath>
+        <m:r>
+          <m:t>τ</m:t>
+        </m:r>
+      </m:oMath>
+      <w:r>
+        <w:t xml:space="preserve">, and reproduce the reported tables — which is the standard the framework is built to meet.</w:t>
+      </w:r>
+    </w:p>
+    <w:p>
+      <w:pPr>
+        <w:pStyle w:val="Heading3"/>
+      </w:pPr>
+      <w:r>
+        <w:t xml:space="preserve">4.4.3 Value Proposition</w:t>
+      </w:r>
+    </w:p>
+    <w:p>
+      <w:pPr>
+        <w:pStyle w:val="FirstParagraph"/>
+      </w:pPr>
+      <w:r>
+        <w:t xml:space="preserve">The design suits its problem for three reasons. It is open-set: unlike a closed-set classifier that must name some font for every input, it can refuse, which matters when many generative crops correspond to no real typeface. It is trained on the hallucination distribution itself rather than on pristine glyphs, so it does not collapse on the warped, re-kerned input that defeats commercial identifiers and clean-glyph baselines. And because it targets a localized open-source palette, every match it returns is immediately reusable at no cost, so recognition ends in a template the designer can rebuild from instead of a paywalled lookup.</w:t>
+      </w:r>
+    </w:p>
+    <w:p>
+      <w:pPr>
+        <w:pStyle w:val="Heading3"/>
+      </w:pPr>
+      <w:r>
+        <w:t xml:space="preserve">4.4.4 High-Level Operational Logic</w:t>
+      </w:r>
+    </w:p>
+    <w:p>
+      <w:pPr>
+        <w:pStyle w:val="FirstParagraph"/>
+      </w:pPr>
+      <w:r>
+        <w:t xml:space="preserve">From the user’s side the interaction is simple. A designer opens the web application, uploads a generative-AI image containing text, and waits a moment while the system localizes and crops the text regions and runs each crop through the inference engine. For every detected region the application displays a short, ranked list of candidate Google Fonts, each shown as a rendered preview, or an</w:t>
+      </w:r>
+      <w:r>
+        <w:t xml:space="preserve"> </w:t>
+      </w:r>
+      <w:r>
+        <w:t xml:space="preserve">“unknown”</w:t>
+      </w:r>
+      <w:r>
+        <w:t xml:space="preserve"> </w:t>
+      </w:r>
+      <w:r>
+        <w:t xml:space="preserve">message when the system judges the glyph to fall outside its palette. The designer picks the closest match and reuses it directly in their own document. The user needs no knowledge of embeddings, thresholds, or the training pipeline; the technical machinery of Sections 4.2 and 4.3 stays hidden behind a single upload-and-review interaction.</w:t>
+      </w:r>
+    </w:p>
+    <w:p>
+      <w:pPr>
+        <w:pStyle w:val="Heading2"/>
+      </w:pPr>
+      <w:r>
+        <w:t xml:space="preserve">4.5 Analysis and Design</w:t>
+      </w:r>
+    </w:p>
+    <w:p>
+      <w:pPr>
+        <w:pStyle w:val="FirstParagraph"/>
+      </w:pPr>
+      <w:r>
+        <w:t xml:space="preserve">This section turns the concept of Section 4.4 into a specification. Section 4.5.1 states what the system must do and the qualities it must have, scoped to a local testing deployment rather than a public service. Section 4.5.2 describes the architecture that satisfies those requirements and how its parts communicate.</w:t>
+      </w:r>
+    </w:p>
+    <w:p>
+      <w:pPr>
+        <w:pStyle w:val="Heading3"/>
+      </w:pPr>
+      <w:r>
+        <w:t xml:space="preserve">4.5.1 Requirements Analysis</w:t>
+      </w:r>
+    </w:p>
+    <w:p>
+      <w:pPr>
+        <w:pStyle w:val="FirstParagraph"/>
+      </w:pPr>
+      <w:r>
+        <w:rPr>
+          <w:b/>
+          <w:bCs/>
+        </w:rPr>
+        <w:t xml:space="preserve">Functional requirements.</w:t>
+      </w:r>
+      <w:r>
+        <w:t xml:space="preserve"> </w:t>
+      </w:r>
+      <w:r>
+        <w:t xml:space="preserve">The system must:</w:t>
       </w:r>
     </w:p>
     <w:p>
@@ -8977,7 +9309,226 @@
         <w:pStyle w:val="Compact"/>
         <w:numPr>
           <w:ilvl w:val="0"/>
-          <w:numId w:val="1005"/>
+          <w:numId w:val="1007"/>
+        </w:numPr>
+      </w:pPr>
+      <w:r>
+        <w:t xml:space="preserve">Accept an uploaded generative-AI image in common raster formats (PNG, JPEG) through the browser.</w:t>
+      </w:r>
+    </w:p>
+    <w:p>
+      <w:pPr>
+        <w:pStyle w:val="Compact"/>
+        <w:numPr>
+          <w:ilvl w:val="0"/>
+          <w:numId w:val="1007"/>
+        </w:numPr>
+      </w:pPr>
+      <w:r>
+        <w:t xml:space="preserve">Localize and crop each text region in the image using an off-the-shelf text detector.</w:t>
+      </w:r>
+    </w:p>
+    <w:p>
+      <w:pPr>
+        <w:pStyle w:val="Compact"/>
+        <w:numPr>
+          <w:ilvl w:val="0"/>
+          <w:numId w:val="1007"/>
+        </w:numPr>
+      </w:pPr>
+      <w:r>
+        <w:t xml:space="preserve">Preprocess each crop and embed it with the frozen DINOv2 encoder and the trained metric head.</w:t>
+      </w:r>
+    </w:p>
+    <w:p>
+      <w:pPr>
+        <w:pStyle w:val="Compact"/>
+        <w:numPr>
+          <w:ilvl w:val="0"/>
+          <w:numId w:val="1007"/>
+        </w:numPr>
+      </w:pPr>
+      <w:r>
+        <w:t xml:space="preserve">Apply the open-set decision to each crop, either rejecting it as</w:t>
+      </w:r>
+      <w:r>
+        <w:t xml:space="preserve"> </w:t>
+      </w:r>
+      <w:r>
+        <w:t xml:space="preserve">“unknown”</w:t>
+      </w:r>
+      <w:r>
+        <w:t xml:space="preserve"> </w:t>
+      </w:r>
+      <w:r>
+        <w:t xml:space="preserve">or ranking the localized palette.</w:t>
+      </w:r>
+    </w:p>
+    <w:p>
+      <w:pPr>
+        <w:pStyle w:val="Compact"/>
+        <w:numPr>
+          <w:ilvl w:val="0"/>
+          <w:numId w:val="1007"/>
+        </w:numPr>
+      </w:pPr>
+      <w:r>
+        <w:t xml:space="preserve">Return, for every detected region, a Top-K shortlist of candidate Google Fonts or an</w:t>
+      </w:r>
+      <w:r>
+        <w:t xml:space="preserve"> </w:t>
+      </w:r>
+      <w:r>
+        <w:t xml:space="preserve">“unknown”</w:t>
+      </w:r>
+      <w:r>
+        <w:t xml:space="preserve"> </w:t>
+      </w:r>
+      <w:r>
+        <w:t xml:space="preserve">verdict.</w:t>
+      </w:r>
+    </w:p>
+    <w:p>
+      <w:pPr>
+        <w:pStyle w:val="Compact"/>
+        <w:numPr>
+          <w:ilvl w:val="0"/>
+          <w:numId w:val="1007"/>
+        </w:numPr>
+      </w:pPr>
+      <w:r>
+        <w:t xml:space="preserve">Render a preview of each candidate font so the user can compare it against the source text.</w:t>
+      </w:r>
+    </w:p>
+    <w:p>
+      <w:pPr>
+        <w:pStyle w:val="Compact"/>
+        <w:numPr>
+          <w:ilvl w:val="0"/>
+          <w:numId w:val="1007"/>
+        </w:numPr>
+      </w:pPr>
+      <w:r>
+        <w:t xml:space="preserve">Expose the recognition pipeline through a REST endpoint (</w:t>
+      </w:r>
+      <w:r>
+        <w:rPr>
+          <w:rStyle w:val="VerbatimChar"/>
+        </w:rPr>
+        <w:t xml:space="preserve">/predict</w:t>
+      </w:r>
+      <w:r>
+        <w:t xml:space="preserve">) that the frontend calls.</w:t>
+      </w:r>
+    </w:p>
+    <w:p>
+      <w:pPr>
+        <w:pStyle w:val="Compact"/>
+        <w:numPr>
+          <w:ilvl w:val="0"/>
+          <w:numId w:val="1007"/>
+        </w:numPr>
+      </w:pPr>
+      <w:r>
+        <w:t xml:space="preserve">Load the trained model weights once at startup and reuse them across requests.</w:t>
+      </w:r>
+    </w:p>
+    <w:p>
+      <w:pPr>
+        <w:pStyle w:val="FirstParagraph"/>
+      </w:pPr>
+      <w:r>
+        <w:rPr>
+          <w:b/>
+          <w:bCs/>
+        </w:rPr>
+        <w:t xml:space="preserve">Non-functional requirements.</w:t>
+      </w:r>
+      <w:r>
+        <w:t xml:space="preserve"> </w:t>
+      </w:r>
+      <w:r>
+        <w:t xml:space="preserve">The system should also:</w:t>
+      </w:r>
+    </w:p>
+    <w:p>
+      <w:pPr>
+        <w:pStyle w:val="Compact"/>
+        <w:numPr>
+          <w:ilvl w:val="0"/>
+          <w:numId w:val="1008"/>
+        </w:numPr>
+      </w:pPr>
+      <w:r>
+        <w:t xml:space="preserve">Be usable through a single upload-and-review interaction that hides the underlying model (usability).</w:t>
+      </w:r>
+    </w:p>
+    <w:p>
+      <w:pPr>
+        <w:pStyle w:val="Compact"/>
+        <w:numPr>
+          <w:ilvl w:val="0"/>
+          <w:numId w:val="1008"/>
+        </w:numPr>
+      </w:pPr>
+      <w:r>
+        <w:t xml:space="preserve">Return results at interactive latency on a single machine, targeting a response within a few seconds per image (responsiveness).</w:t>
+      </w:r>
+    </w:p>
+    <w:p>
+      <w:pPr>
+        <w:pStyle w:val="Compact"/>
+        <w:numPr>
+          <w:ilvl w:val="0"/>
+          <w:numId w:val="1008"/>
+        </w:numPr>
+      </w:pPr>
+      <w:r>
+        <w:t xml:space="preserve">Produce the same output for the same input, through deterministic preprocessing and pinned model weights and seeds (reproducibility).</w:t>
+      </w:r>
+    </w:p>
+    <w:p>
+      <w:pPr>
+        <w:pStyle w:val="Compact"/>
+        <w:numPr>
+          <w:ilvl w:val="0"/>
+          <w:numId w:val="1008"/>
+        </w:numPr>
+      </w:pPr>
+      <w:r>
+        <w:t xml:space="preserve">Run from a single Docker image on one host, with no external service dependencies at inference time beyond the bundled weights and font files (portability).</w:t>
+      </w:r>
+    </w:p>
+    <w:p>
+      <w:pPr>
+        <w:pStyle w:val="Compact"/>
+        <w:numPr>
+          <w:ilvl w:val="0"/>
+          <w:numId w:val="1008"/>
+        </w:numPr>
+      </w:pPr>
+      <w:r>
+        <w:t xml:space="preserve">Keep the localizer, encoder, metric head, and open-set decision as separable components, so any one can be replaced without rewriting the others (maintainability).</w:t>
+      </w:r>
+    </w:p>
+    <w:p>
+      <w:pPr>
+        <w:pStyle w:val="Compact"/>
+        <w:numPr>
+          <w:ilvl w:val="0"/>
+          <w:numId w:val="1008"/>
+        </w:numPr>
+      </w:pPr>
+      <w:r>
+        <w:t xml:space="preserve">Operate as a single-user local demo, with no authentication, accounts, or multi-user scaling in scope (a deliberate delimitation, consistent with Section 4.1).</w:t>
+      </w:r>
+    </w:p>
+    <w:p>
+      <w:pPr>
+        <w:pStyle w:val="Compact"/>
+        <w:numPr>
+          <w:ilvl w:val="0"/>
+          <w:numId w:val="1008"/>
         </w:numPr>
       </w:pPr>
       <w:r>
@@ -9283,7 +9834,7 @@
         <w:pStyle w:val="Compact"/>
         <w:numPr>
           <w:ilvl w:val="0"/>
-          <w:numId w:val="1006"/>
+          <w:numId w:val="1009"/>
         </w:numPr>
       </w:pPr>
       <w:r>
@@ -9316,7 +9867,7 @@
         <w:pStyle w:val="Compact"/>
         <w:numPr>
           <w:ilvl w:val="0"/>
-          <w:numId w:val="1006"/>
+          <w:numId w:val="1009"/>
         </w:numPr>
       </w:pPr>
       <w:r>
@@ -9361,7 +9912,7 @@
         <w:pStyle w:val="Compact"/>
         <w:numPr>
           <w:ilvl w:val="0"/>
-          <w:numId w:val="1006"/>
+          <w:numId w:val="1009"/>
         </w:numPr>
       </w:pPr>
       <w:r>
@@ -9383,7 +9934,7 @@
         <w:pStyle w:val="Compact"/>
         <w:numPr>
           <w:ilvl w:val="0"/>
-          <w:numId w:val="1006"/>
+          <w:numId w:val="1009"/>
         </w:numPr>
       </w:pPr>
       <w:r>
@@ -11756,6 +12307,60 @@
     </w:p>
     <w:p>
       <w:pPr>
+        <w:pStyle w:val="BodyText"/>
+      </w:pPr>
+      <w:r>
+        <w:t xml:space="preserve">Two validation instruments follow from the word-level design of Section 4.4.2. First, the mixed-typography verdict is validated against a</w:t>
+      </w:r>
+      <w:r>
+        <w:t xml:space="preserve"> </w:t>
+      </w:r>
+      <w:r>
+        <w:rPr>
+          <w:b/>
+          <w:bCs/>
+        </w:rPr>
+        <w:t xml:space="preserve">mixed-font stressor set</w:t>
+      </w:r>
+      <w:r>
+        <w:t xml:space="preserve"> </w:t>
+      </w:r>
+      <w:r>
+        <w:t xml:space="preserve">the synthetic pipeline renders on demand: lines and words deliberately set in two palette fonts at controlled mixing ratios, degraded by the operator</w:t>
+      </w:r>
+      <w:r>
+        <w:t xml:space="preserve"> </w:t>
+      </w:r>
+      <m:oMath>
+        <m:r>
+          <m:t>D</m:t>
+        </m:r>
+      </m:oMath>
+      <w:r>
+        <w:t xml:space="preserve"> </w:t>
+      </w:r>
+      <w:r>
+        <w:t xml:space="preserve">like every other crop, so the detection rate and false-alarm rate of the homogeneity check are measured on labeled data that no in-the-wild collection could supply. Because the served unit is the word crop, the threshold calibration of this section is likewise performed on word-granularity validation crops. Second, the choice of encoder is validated by a</w:t>
+      </w:r>
+      <w:r>
+        <w:t xml:space="preserve"> </w:t>
+      </w:r>
+      <w:r>
+        <w:rPr>
+          <w:b/>
+          <w:bCs/>
+        </w:rPr>
+        <w:t xml:space="preserve">backbone comparison</w:t>
+      </w:r>
+      <w:r>
+        <w:t xml:space="preserve"> </w:t>
+      </w:r>
+      <w:r>
+        <w:t xml:space="preserve">rather than assumed: the same frozen-encoder-plus-metric-head recipe, corpus, and calibration procedure are re-run with the backbone swapped — the incumbent DINOv2 against a contrastively pretrained vision-language encoder, a supervised ViT, and a convolutional baseline — holding everything else fixed, and each candidate is reported with its Top-1/Top-3 accuracy, false-positive rate at 95% recall, parameter count, and CPU and GPU inference latency. The homogeneity check narrows the field before speed and accuracy decide it: the check reads per-patch tokens, so a qualifying backbone must expose patch-level features, which is a property of the ViT family that a pooled convolutional embedding does not natively provide. The comparison therefore selects the deployed model on measured evidence, with the architecture class justified by the capability the pipeline requires of it.</w:t>
+      </w:r>
+    </w:p>
+    <w:p>
+      <w:pPr>
         <w:pStyle w:val="Heading3"/>
       </w:pPr>
       <w:r>
@@ -11843,7 +12448,7 @@
         <w:pStyle w:val="BodyText"/>
       </w:pPr>
       <w:r>
-        <w:t xml:space="preserve">Version 1.1 · July 26, 2026</w:t>
+        <w:t xml:space="preserve">Version 1.2 · August 3, 2026</w:t>
       </w:r>
     </w:p>
     <w:p>
@@ -12056,6 +12661,56 @@
           </w:p>
         </w:tc>
       </w:tr>
+      <w:tr>
+        <w:tc>
+          <w:tcPr/>
+          <w:p>
+            <w:pPr>
+              <w:pStyle w:val="Compact"/>
+              <w:jc w:val="left"/>
+            </w:pPr>
+            <w:r>
+              <w:t xml:space="preserve">2026-08-03</w:t>
+            </w:r>
+          </w:p>
+        </w:tc>
+        <w:tc>
+          <w:tcPr/>
+          <w:p>
+            <w:pPr>
+              <w:pStyle w:val="Compact"/>
+              <w:jc w:val="left"/>
+            </w:pPr>
+            <w:r>
+              <w:t xml:space="preserve">1.2</w:t>
+            </w:r>
+          </w:p>
+        </w:tc>
+        <w:tc>
+          <w:tcPr/>
+          <w:p>
+            <w:pPr>
+              <w:pStyle w:val="Compact"/>
+              <w:jc w:val="left"/>
+            </w:pPr>
+            <w:r>
+              <w:t xml:space="preserve">Post-defense revisions: word-level localization, mixed-typography verdict, word-merge presentation</w:t>
+            </w:r>
+          </w:p>
+        </w:tc>
+        <w:tc>
+          <w:tcPr/>
+          <w:p>
+            <w:pPr>
+              <w:pStyle w:val="Compact"/>
+              <w:jc w:val="left"/>
+            </w:pPr>
+            <w:r>
+              <w:t xml:space="preserve">Research team</w:t>
+            </w:r>
+          </w:p>
+        </w:tc>
+      </w:tr>
     </w:tbl>
     <w:p>
       <w:pPr>
@@ -12603,7 +13258,7 @@
         <w:pStyle w:val="Compact"/>
         <w:numPr>
           <w:ilvl w:val="0"/>
-          <w:numId w:val="1007"/>
+          <w:numId w:val="1010"/>
         </w:numPr>
       </w:pPr>
       <w:r>
@@ -12615,11 +13270,11 @@
         <w:pStyle w:val="Compact"/>
         <w:numPr>
           <w:ilvl w:val="0"/>
-          <w:numId w:val="1007"/>
+          <w:numId w:val="1010"/>
         </w:numPr>
       </w:pPr>
       <w:r>
-        <w:t xml:space="preserve">Localize the text region(s) in the image and crop each one.</w:t>
+        <w:t xml:space="preserve">Localize the text in the image at word granularity and crop each word.</w:t>
       </w:r>
     </w:p>
     <w:p>
@@ -12627,11 +13282,11 @@
         <w:pStyle w:val="Compact"/>
         <w:numPr>
           <w:ilvl w:val="0"/>
-          <w:numId w:val="1007"/>
+          <w:numId w:val="1010"/>
         </w:numPr>
       </w:pPr>
       <w:r>
-        <w:t xml:space="preserve">Embed each crop and rank it against the font palette.</w:t>
+        <w:t xml:space="preserve">Embed each crop, check it for font homogeneity, and rank it against the font palette.</w:t>
       </w:r>
     </w:p>
     <w:p>
@@ -12639,11 +13294,11 @@
         <w:pStyle w:val="Compact"/>
         <w:numPr>
           <w:ilvl w:val="0"/>
-          <w:numId w:val="1007"/>
+          <w:numId w:val="1010"/>
         </w:numPr>
       </w:pPr>
       <w:r>
-        <w:t xml:space="preserve">Return a Top-K shortlist per crop with a similarity score, or reject it as out-of-palette.</w:t>
+        <w:t xml:space="preserve">Return a Top-K shortlist per crop with a similarity score, reject it as out-of-palette, or report it as mixed typography; adjacent words with the same verdict merge into one result.</w:t>
       </w:r>
     </w:p>
     <w:p>
@@ -12652,7 +13307,7 @@
         <w:keepNext/>
         <w:numPr>
           <w:ilvl w:val="0"/>
-          <w:numId w:val="1007"/>
+          <w:numId w:val="1010"/>
         </w:numPr>
       </w:pPr>
       <w:r>
@@ -12811,7 +13466,7 @@
         <w:pStyle w:val="Compact"/>
         <w:numPr>
           <w:ilvl w:val="0"/>
-          <w:numId w:val="1008"/>
+          <w:numId w:val="1011"/>
         </w:numPr>
       </w:pPr>
       <w:r>
@@ -12826,263 +13481,6 @@
       </w:r>
       <w:r>
         <w:t xml:space="preserve">current Chrome / Firefox / Edge (latest two versions), desktop viewport.</w:t>
-      </w:r>
-    </w:p>
-    <w:p>
-      <w:pPr>
-        <w:pStyle w:val="Compact"/>
-        <w:numPr>
-          <w:ilvl w:val="0"/>
-          <w:numId w:val="1008"/>
-        </w:numPr>
-      </w:pPr>
-      <w:r>
-        <w:rPr>
-          <w:b/>
-          <w:bCs/>
-        </w:rPr>
-        <w:t xml:space="preserve">Server:</w:t>
-      </w:r>
-      <w:r>
-        <w:t xml:space="preserve"> </w:t>
-      </w:r>
-      <w:r>
-        <w:t xml:space="preserve">Python 3.11+, FastAPI, PyTorch, packaged with Docker; runs on the presenter’s laptop (</w:t>
-      </w:r>
-      <w:r>
-        <w:rPr>
-          <w:rStyle w:val="VerbatimChar"/>
-        </w:rPr>
-        <w:t xml:space="preserve">localhost</w:t>
-      </w:r>
-      <w:r>
-        <w:t xml:space="preserve">). GPU optional — CPU inference acceptable for single-image demo latency.</w:t>
-      </w:r>
-    </w:p>
-    <w:p>
-      <w:pPr>
-        <w:pStyle w:val="Compact"/>
-        <w:numPr>
-          <w:ilvl w:val="0"/>
-          <w:numId w:val="1008"/>
-        </w:numPr>
-      </w:pPr>
-      <w:r>
-        <w:rPr>
-          <w:b/>
-          <w:bCs/>
-        </w:rPr>
-        <w:t xml:space="preserve">Assets:</w:t>
-      </w:r>
-      <w:r>
-        <w:t xml:space="preserve"> </w:t>
-      </w:r>
-      <w:r>
-        <w:t xml:space="preserve">DINOv2 + baseline weights from HuggingFace Hub; Google Fonts files for palette matching and preview rendering.</w:t>
-      </w:r>
-    </w:p>
-    <w:p>
-      <w:pPr>
-        <w:pStyle w:val="Heading3"/>
-      </w:pPr>
-      <w:r>
-        <w:t xml:space="preserve">2.5 Design and Implementation Constraints</w:t>
-      </w:r>
-    </w:p>
-    <w:p>
-      <w:pPr>
-        <w:pStyle w:val="Compact"/>
-        <w:numPr>
-          <w:ilvl w:val="0"/>
-          <w:numId w:val="1009"/>
-        </w:numPr>
-      </w:pPr>
-      <w:r>
-        <w:t xml:space="preserve">Stack is fixed by the methodology (Ch4 §4.8):</w:t>
-      </w:r>
-      <w:r>
-        <w:t xml:space="preserve"> </w:t>
-      </w:r>
-      <w:r>
-        <w:rPr>
-          <w:b/>
-          <w:bCs/>
-        </w:rPr>
-        <w:t xml:space="preserve">React</w:t>
-      </w:r>
-      <w:r>
-        <w:t xml:space="preserve"> </w:t>
-      </w:r>
-      <w:r>
-        <w:t xml:space="preserve">(frontend),</w:t>
-      </w:r>
-      <w:r>
-        <w:t xml:space="preserve"> </w:t>
-      </w:r>
-      <w:r>
-        <w:rPr>
-          <w:b/>
-          <w:bCs/>
-        </w:rPr>
-        <w:t xml:space="preserve">FastAPI</w:t>
-      </w:r>
-      <w:r>
-        <w:t xml:space="preserve"> </w:t>
-      </w:r>
-      <w:r>
-        <w:t xml:space="preserve">(backend),</w:t>
-      </w:r>
-      <w:r>
-        <w:t xml:space="preserve"> </w:t>
-      </w:r>
-      <w:r>
-        <w:rPr>
-          <w:b/>
-          <w:bCs/>
-        </w:rPr>
-        <w:t xml:space="preserve">PyTorch + HuggingFace</w:t>
-      </w:r>
-      <w:r>
-        <w:t xml:space="preserve"> </w:t>
-      </w:r>
-      <w:r>
-        <w:t xml:space="preserve">(inference),</w:t>
-      </w:r>
-      <w:r>
-        <w:t xml:space="preserve"> </w:t>
-      </w:r>
-      <w:r>
-        <w:rPr>
-          <w:b/>
-          <w:bCs/>
-        </w:rPr>
-        <w:t xml:space="preserve">Docker</w:t>
-      </w:r>
-      <w:r>
-        <w:t xml:space="preserve"> </w:t>
-      </w:r>
-      <w:r>
-        <w:t xml:space="preserve">(deploy).</w:t>
-      </w:r>
-    </w:p>
-    <w:p>
-      <w:pPr>
-        <w:pStyle w:val="Compact"/>
-        <w:numPr>
-          <w:ilvl w:val="0"/>
-          <w:numId w:val="1009"/>
-        </w:numPr>
-      </w:pPr>
-      <w:r>
-        <w:t xml:space="preserve">Preprocessing (square-pad → 224² → ImageNet normalize)</w:t>
-      </w:r>
-      <w:r>
-        <w:t xml:space="preserve"> </w:t>
-      </w:r>
-      <w:r>
-        <w:rPr>
-          <w:b/>
-          <w:bCs/>
-        </w:rPr>
-        <w:t xml:space="preserve">shall</w:t>
-      </w:r>
-      <w:r>
-        <w:t xml:space="preserve"> </w:t>
-      </w:r>
-      <w:r>
-        <w:t xml:space="preserve">run inside the model forward pass to avoid train–serve skew (Ch4 §4.3.2).</w:t>
-      </w:r>
-    </w:p>
-    <w:p>
-      <w:pPr>
-        <w:pStyle w:val="Compact"/>
-        <w:numPr>
-          <w:ilvl w:val="0"/>
-          <w:numId w:val="1009"/>
-        </w:numPr>
-      </w:pPr>
-      <w:r>
-        <w:t xml:space="preserve">Only open-source fonts (the Google Fonts palette) may be returned — no commercial font identifiers or licenses.</w:t>
-      </w:r>
-    </w:p>
-    <w:p>
-      <w:pPr>
-        <w:pStyle w:val="Heading3"/>
-      </w:pPr>
-      <w:r>
-        <w:t xml:space="preserve">2.6 Assumptions and Dependencies</w:t>
-      </w:r>
-    </w:p>
-    <w:p>
-      <w:pPr>
-        <w:pStyle w:val="Compact"/>
-        <w:numPr>
-          <w:ilvl w:val="0"/>
-          <w:numId w:val="1010"/>
-        </w:numPr>
-      </w:pPr>
-      <w:r>
-        <w:t xml:space="preserve">The trained metric head and palette are available on disk at startup.</w:t>
-      </w:r>
-    </w:p>
-    <w:p>
-      <w:pPr>
-        <w:pStyle w:val="Compact"/>
-        <w:numPr>
-          <w:ilvl w:val="0"/>
-          <w:numId w:val="1010"/>
-        </w:numPr>
-      </w:pPr>
-      <w:r>
-        <w:t xml:space="preserve">The uploaded image contains legible rendered text (not handwriting / heavy occlusion).</w:t>
-      </w:r>
-    </w:p>
-    <w:p>
-      <w:pPr>
-        <w:pStyle w:val="Compact"/>
-        <w:numPr>
-          <w:ilvl w:val="0"/>
-          <w:numId w:val="1010"/>
-        </w:numPr>
-      </w:pPr>
-      <w:r>
-        <w:t xml:space="preserve">The off-the-shelf text-localization component is available and returns bounding boxes.</w:t>
-      </w:r>
-    </w:p>
-    <w:p>
-      <w:pPr>
-        <w:pStyle w:val="Compact"/>
-        <w:numPr>
-          <w:ilvl w:val="0"/>
-          <w:numId w:val="1010"/>
-        </w:numPr>
-      </w:pPr>
-      <w:r>
-        <w:t xml:space="preserve">The HuggingFace Hub remains reachable for the one-time weight download; after that the app runs offline.</w:t>
-      </w:r>
-    </w:p>
-    <w:p>
-      <w:pPr>
-        <w:pStyle w:val="Heading2"/>
-      </w:pPr>
-      <w:r>
-        <w:t xml:space="preserve">3. External Interface Requirements</w:t>
-      </w:r>
-    </w:p>
-    <w:p>
-      <w:pPr>
-        <w:pStyle w:val="Heading3"/>
-      </w:pPr>
-      <w:r>
-        <w:t xml:space="preserve">3.1 User Interfaces</w:t>
-      </w:r>
-    </w:p>
-    <w:p>
-      <w:pPr>
-        <w:pStyle w:val="FirstParagraph"/>
-      </w:pPr>
-      <w:r>
-        <w:t xml:space="preserve">Single page, three vertically stacked zones (wireframe below):</w:t>
       </w:r>
     </w:p>
     <w:p>
@@ -13098,29 +13496,22 @@
           <w:b/>
           <w:bCs/>
         </w:rPr>
-        <w:t xml:space="preserve">Input</w:t>
-      </w:r>
-      <w:r>
-        <w:t xml:space="preserve"> </w:t>
-      </w:r>
-      <w:r>
-        <w:t xml:space="preserve">— a drag-drop/browse dropzone, sample thumbnails, and an</w:t>
-      </w:r>
-      <w:r>
-        <w:t xml:space="preserve"> </w:t>
-      </w:r>
-      <w:r>
-        <w:rPr>
-          <w:b/>
-          <w:bCs/>
-        </w:rPr>
-        <w:t xml:space="preserve">Identify Fonts</w:t>
-      </w:r>
-      <w:r>
-        <w:t xml:space="preserve"> </w:t>
-      </w:r>
-      <w:r>
-        <w:t xml:space="preserve">action.</w:t>
+        <w:t xml:space="preserve">Server:</w:t>
+      </w:r>
+      <w:r>
+        <w:t xml:space="preserve"> </w:t>
+      </w:r>
+      <w:r>
+        <w:t xml:space="preserve">Python 3.11+, FastAPI, PyTorch, packaged with Docker; runs on the presenter’s laptop (</w:t>
+      </w:r>
+      <w:r>
+        <w:rPr>
+          <w:rStyle w:val="VerbatimChar"/>
+        </w:rPr>
+        <w:t xml:space="preserve">localhost</w:t>
+      </w:r>
+      <w:r>
+        <w:t xml:space="preserve">). GPU optional — CPU inference acceptable for single-image demo latency.</w:t>
       </w:r>
     </w:p>
     <w:p>
@@ -13136,13 +13527,21 @@
           <w:b/>
           <w:bCs/>
         </w:rPr>
-        <w:t xml:space="preserve">Processing</w:t>
-      </w:r>
-      <w:r>
-        <w:t xml:space="preserve"> </w:t>
-      </w:r>
-      <w:r>
-        <w:t xml:space="preserve">— the uploaded image with detected text regions boxed, plus a pipeline status/progress indicator.</w:t>
+        <w:t xml:space="preserve">Assets:</w:t>
+      </w:r>
+      <w:r>
+        <w:t xml:space="preserve"> </w:t>
+      </w:r>
+      <w:r>
+        <w:t xml:space="preserve">DINOv2 + baseline weights from HuggingFace Hub; Google Fonts files for palette matching and preview rendering.</w:t>
+      </w:r>
+    </w:p>
+    <w:p>
+      <w:pPr>
+        <w:pStyle w:val="Heading3"/>
+      </w:pPr>
+      <w:r>
+        <w:t xml:space="preserve">2.5 Design and Implementation Constraints</w:t>
       </w:r>
     </w:p>
     <w:p>
@@ -13150,10 +13549,266 @@
         <w:pStyle w:val="Compact"/>
         <w:numPr>
           <w:ilvl w:val="0"/>
-          <w:numId w:val="1011"/>
+          <w:numId w:val="1012"/>
         </w:numPr>
       </w:pPr>
       <w:r>
+        <w:t xml:space="preserve">Stack is fixed by the methodology (Ch4 §4.8):</w:t>
+      </w:r>
+      <w:r>
+        <w:t xml:space="preserve"> </w:t>
+      </w:r>
+      <w:r>
+        <w:rPr>
+          <w:b/>
+          <w:bCs/>
+        </w:rPr>
+        <w:t xml:space="preserve">React</w:t>
+      </w:r>
+      <w:r>
+        <w:t xml:space="preserve"> </w:t>
+      </w:r>
+      <w:r>
+        <w:t xml:space="preserve">(frontend),</w:t>
+      </w:r>
+      <w:r>
+        <w:t xml:space="preserve"> </w:t>
+      </w:r>
+      <w:r>
+        <w:rPr>
+          <w:b/>
+          <w:bCs/>
+        </w:rPr>
+        <w:t xml:space="preserve">FastAPI</w:t>
+      </w:r>
+      <w:r>
+        <w:t xml:space="preserve"> </w:t>
+      </w:r>
+      <w:r>
+        <w:t xml:space="preserve">(backend),</w:t>
+      </w:r>
+      <w:r>
+        <w:t xml:space="preserve"> </w:t>
+      </w:r>
+      <w:r>
+        <w:rPr>
+          <w:b/>
+          <w:bCs/>
+        </w:rPr>
+        <w:t xml:space="preserve">PyTorch + HuggingFace</w:t>
+      </w:r>
+      <w:r>
+        <w:t xml:space="preserve"> </w:t>
+      </w:r>
+      <w:r>
+        <w:t xml:space="preserve">(inference),</w:t>
+      </w:r>
+      <w:r>
+        <w:t xml:space="preserve"> </w:t>
+      </w:r>
+      <w:r>
+        <w:rPr>
+          <w:b/>
+          <w:bCs/>
+        </w:rPr>
+        <w:t xml:space="preserve">Docker</w:t>
+      </w:r>
+      <w:r>
+        <w:t xml:space="preserve"> </w:t>
+      </w:r>
+      <w:r>
+        <w:t xml:space="preserve">(deploy).</w:t>
+      </w:r>
+    </w:p>
+    <w:p>
+      <w:pPr>
+        <w:pStyle w:val="Compact"/>
+        <w:numPr>
+          <w:ilvl w:val="0"/>
+          <w:numId w:val="1012"/>
+        </w:numPr>
+      </w:pPr>
+      <w:r>
+        <w:t xml:space="preserve">Preprocessing (square-pad → 224² → ImageNet normalize)</w:t>
+      </w:r>
+      <w:r>
+        <w:t xml:space="preserve"> </w:t>
+      </w:r>
+      <w:r>
+        <w:rPr>
+          <w:b/>
+          <w:bCs/>
+        </w:rPr>
+        <w:t xml:space="preserve">shall</w:t>
+      </w:r>
+      <w:r>
+        <w:t xml:space="preserve"> </w:t>
+      </w:r>
+      <w:r>
+        <w:t xml:space="preserve">run inside the model forward pass to avoid train–serve skew (Ch4 §4.3.2).</w:t>
+      </w:r>
+    </w:p>
+    <w:p>
+      <w:pPr>
+        <w:pStyle w:val="Compact"/>
+        <w:numPr>
+          <w:ilvl w:val="0"/>
+          <w:numId w:val="1012"/>
+        </w:numPr>
+      </w:pPr>
+      <w:r>
+        <w:t xml:space="preserve">Only open-source fonts (the Google Fonts palette) may be returned — no commercial font identifiers or licenses.</w:t>
+      </w:r>
+    </w:p>
+    <w:p>
+      <w:pPr>
+        <w:pStyle w:val="Heading3"/>
+      </w:pPr>
+      <w:r>
+        <w:t xml:space="preserve">2.6 Assumptions and Dependencies</w:t>
+      </w:r>
+    </w:p>
+    <w:p>
+      <w:pPr>
+        <w:pStyle w:val="Compact"/>
+        <w:numPr>
+          <w:ilvl w:val="0"/>
+          <w:numId w:val="1013"/>
+        </w:numPr>
+      </w:pPr>
+      <w:r>
+        <w:t xml:space="preserve">The trained metric head and palette are available on disk at startup.</w:t>
+      </w:r>
+    </w:p>
+    <w:p>
+      <w:pPr>
+        <w:pStyle w:val="Compact"/>
+        <w:numPr>
+          <w:ilvl w:val="0"/>
+          <w:numId w:val="1013"/>
+        </w:numPr>
+      </w:pPr>
+      <w:r>
+        <w:t xml:space="preserve">The uploaded image contains legible rendered text (not handwriting / heavy occlusion).</w:t>
+      </w:r>
+    </w:p>
+    <w:p>
+      <w:pPr>
+        <w:pStyle w:val="Compact"/>
+        <w:numPr>
+          <w:ilvl w:val="0"/>
+          <w:numId w:val="1013"/>
+        </w:numPr>
+      </w:pPr>
+      <w:r>
+        <w:t xml:space="preserve">The off-the-shelf text-localization component is available and returns bounding boxes.</w:t>
+      </w:r>
+    </w:p>
+    <w:p>
+      <w:pPr>
+        <w:pStyle w:val="Compact"/>
+        <w:numPr>
+          <w:ilvl w:val="0"/>
+          <w:numId w:val="1013"/>
+        </w:numPr>
+      </w:pPr>
+      <w:r>
+        <w:t xml:space="preserve">The HuggingFace Hub remains reachable for the one-time weight download; after that the app runs offline.</w:t>
+      </w:r>
+    </w:p>
+    <w:p>
+      <w:pPr>
+        <w:pStyle w:val="Heading2"/>
+      </w:pPr>
+      <w:r>
+        <w:t xml:space="preserve">3. External Interface Requirements</w:t>
+      </w:r>
+    </w:p>
+    <w:p>
+      <w:pPr>
+        <w:pStyle w:val="Heading3"/>
+      </w:pPr>
+      <w:r>
+        <w:t xml:space="preserve">3.1 User Interfaces</w:t>
+      </w:r>
+    </w:p>
+    <w:p>
+      <w:pPr>
+        <w:pStyle w:val="FirstParagraph"/>
+      </w:pPr>
+      <w:r>
+        <w:t xml:space="preserve">Single page, three vertically stacked zones (wireframe below):</w:t>
+      </w:r>
+    </w:p>
+    <w:p>
+      <w:pPr>
+        <w:pStyle w:val="Compact"/>
+        <w:numPr>
+          <w:ilvl w:val="0"/>
+          <w:numId w:val="1014"/>
+        </w:numPr>
+      </w:pPr>
+      <w:r>
+        <w:rPr>
+          <w:b/>
+          <w:bCs/>
+        </w:rPr>
+        <w:t xml:space="preserve">Input</w:t>
+      </w:r>
+      <w:r>
+        <w:t xml:space="preserve"> </w:t>
+      </w:r>
+      <w:r>
+        <w:t xml:space="preserve">— a drag-drop/browse dropzone, sample thumbnails, and an</w:t>
+      </w:r>
+      <w:r>
+        <w:t xml:space="preserve"> </w:t>
+      </w:r>
+      <w:r>
+        <w:rPr>
+          <w:b/>
+          <w:bCs/>
+        </w:rPr>
+        <w:t xml:space="preserve">Identify Fonts</w:t>
+      </w:r>
+      <w:r>
+        <w:t xml:space="preserve"> </w:t>
+      </w:r>
+      <w:r>
+        <w:t xml:space="preserve">action.</w:t>
+      </w:r>
+    </w:p>
+    <w:p>
+      <w:pPr>
+        <w:pStyle w:val="Compact"/>
+        <w:numPr>
+          <w:ilvl w:val="0"/>
+          <w:numId w:val="1014"/>
+        </w:numPr>
+      </w:pPr>
+      <w:r>
+        <w:rPr>
+          <w:b/>
+          <w:bCs/>
+        </w:rPr>
+        <w:t xml:space="preserve">Processing</w:t>
+      </w:r>
+      <w:r>
+        <w:t xml:space="preserve"> </w:t>
+      </w:r>
+      <w:r>
+        <w:t xml:space="preserve">— the uploaded image with detected text regions boxed, plus a pipeline status/progress indicator.</w:t>
+      </w:r>
+    </w:p>
+    <w:p>
+      <w:pPr>
+        <w:pStyle w:val="Compact"/>
+        <w:numPr>
+          <w:ilvl w:val="0"/>
+          <w:numId w:val="1014"/>
+        </w:numPr>
+      </w:pPr>
+      <w:r>
         <w:rPr>
           <w:b/>
           <w:bCs/>
@@ -13180,7 +13835,7 @@
           <w:b/>
           <w:bCs/>
         </w:rPr>
-        <w:t xml:space="preserve">KNOWN / UNKNOWN</w:t>
+        <w:t xml:space="preserve">KNOWN / UNKNOWN / MIXED</w:t>
       </w:r>
       <w:r>
         <w:t xml:space="preserve"> </w:t>
@@ -14061,7 +14716,7 @@
               <w:jc w:val="left"/>
             </w:pPr>
             <w:r>
-              <w:t xml:space="preserve">The system shall detect one or more text regions and crop each region for independent matching.</w:t>
+              <w:t xml:space="preserve">The system shall localize text at word granularity (one bounding box per word) and crop each word for independent matching.</w:t>
             </w:r>
           </w:p>
         </w:tc>
@@ -14192,6 +14847,44 @@
           </w:p>
         </w:tc>
       </w:tr>
+      <w:tr>
+        <w:tc>
+          <w:tcPr/>
+          <w:p>
+            <w:pPr>
+              <w:pStyle w:val="Compact"/>
+              <w:jc w:val="left"/>
+            </w:pPr>
+            <w:r>
+              <w:t xml:space="preserve">REQ-4.2-5</w:t>
+            </w:r>
+          </w:p>
+        </w:tc>
+        <w:tc>
+          <w:tcPr/>
+          <w:p>
+            <w:pPr>
+              <w:pStyle w:val="Compact"/>
+              <w:jc w:val="left"/>
+            </w:pPr>
+            <w:r>
+              <w:t xml:space="preserve">The system shall check each crop for font homogeneity using the encoder’s patch-level features; a flagged crop shall be split once at the detected boundary and each half matched independently.</w:t>
+            </w:r>
+          </w:p>
+        </w:tc>
+        <w:tc>
+          <w:tcPr/>
+          <w:p>
+            <w:pPr>
+              <w:pStyle w:val="Compact"/>
+              <w:jc w:val="left"/>
+            </w:pPr>
+            <w:r>
+              <w:t xml:space="preserve">High</w:t>
+            </w:r>
+          </w:p>
+        </w:tc>
+      </w:tr>
     </w:tbl>
     <w:p>
       <w:pPr>
@@ -14214,7 +14907,7 @@
         <w:pStyle w:val="FirstParagraph"/>
       </w:pPr>
       <w:r>
-        <w:t xml:space="preserve">For each crop, the system ranks the palette and decides known vs. unknown. Priority:</w:t>
+        <w:t xml:space="preserve">For each crop, the system ranks the palette and decides known, unknown, or mixed typography. Priority:</w:t>
       </w:r>
       <w:r>
         <w:t xml:space="preserve"> </w:t>
@@ -14418,7 +15111,7 @@
               <w:jc w:val="left"/>
             </w:pPr>
             <w:r>
-              <w:t xml:space="preserve">The system shall present each crop’s result as its own card in a carousel with previous/next navigation and a region indicator (e.g.,</w:t>
+              <w:t xml:space="preserve">The system shall present each result as its own card in a carousel with previous/next navigation and a region indicator (e.g.,</w:t>
             </w:r>
             <w:r>
               <w:t xml:space="preserve"> </w:t>
@@ -14427,7 +15120,7 @@
               <w:t xml:space="preserve">“Region 1 of 2”</w:t>
             </w:r>
             <w:r>
-              <w:t xml:space="preserve">), each card labeled KNOWN or UNKNOWN.</w:t>
+              <w:t xml:space="preserve">), each card labeled KNOWN, UNKNOWN, or MIXED.</w:t>
             </w:r>
           </w:p>
         </w:tc>
@@ -14516,6 +15209,56 @@
             </w:pPr>
             <w:r>
               <w:t xml:space="preserve">Low</w:t>
+            </w:r>
+          </w:p>
+        </w:tc>
+      </w:tr>
+      <w:tr>
+        <w:tc>
+          <w:tcPr/>
+          <w:p>
+            <w:pPr>
+              <w:pStyle w:val="Compact"/>
+              <w:jc w:val="left"/>
+            </w:pPr>
+            <w:r>
+              <w:t xml:space="preserve">REQ-4.3-6</w:t>
+            </w:r>
+          </w:p>
+        </w:tc>
+        <w:tc>
+          <w:tcPr/>
+          <w:p>
+            <w:pPr>
+              <w:pStyle w:val="Compact"/>
+              <w:jc w:val="left"/>
+            </w:pPr>
+            <w:r>
+              <w:t xml:space="preserve">The system shall report a crop that remains font-inhomogeneous after one split as</w:t>
+            </w:r>
+            <w:r>
+              <w:t xml:space="preserve"> </w:t>
+            </w:r>
+            <w:r>
+              <w:t xml:space="preserve">“mixed typography”</w:t>
+            </w:r>
+            <w:r>
+              <w:t xml:space="preserve"> </w:t>
+            </w:r>
+            <w:r>
+              <w:t xml:space="preserve">rather than assigning a single font, and shall merge adjacent word crops that share the same verdict into one region card.</w:t>
+            </w:r>
+          </w:p>
+        </w:tc>
+        <w:tc>
+          <w:tcPr/>
+          <w:p>
+            <w:pPr>
+              <w:pStyle w:val="Compact"/>
+              <w:jc w:val="left"/>
+            </w:pPr>
+            <w:r>
+              <w:t xml:space="preserve">High</w:t>
             </w:r>
           </w:p>
         </w:tc>
@@ -15364,7 +16107,7 @@
         <w:pStyle w:val="Compact"/>
         <w:numPr>
           <w:ilvl w:val="0"/>
-          <w:numId w:val="1012"/>
+          <w:numId w:val="1015"/>
         </w:numPr>
       </w:pPr>
       <w:r>
@@ -15376,7 +16119,7 @@
         <w:pStyle w:val="Compact"/>
         <w:numPr>
           <w:ilvl w:val="0"/>
-          <w:numId w:val="1012"/>
+          <w:numId w:val="1015"/>
         </w:numPr>
       </w:pPr>
       <w:r>
@@ -15388,7 +16131,7 @@
         <w:pStyle w:val="Compact"/>
         <w:numPr>
           <w:ilvl w:val="0"/>
-          <w:numId w:val="1012"/>
+          <w:numId w:val="1015"/>
         </w:numPr>
       </w:pPr>
       <w:r>
@@ -15408,7 +16151,7 @@
         <w:pStyle w:val="Compact"/>
         <w:numPr>
           <w:ilvl w:val="0"/>
-          <w:numId w:val="1013"/>
+          <w:numId w:val="1016"/>
         </w:numPr>
       </w:pPr>
       <w:r>
@@ -15430,7 +16173,7 @@
         <w:pStyle w:val="Compact"/>
         <w:numPr>
           <w:ilvl w:val="0"/>
-          <w:numId w:val="1013"/>
+          <w:numId w:val="1016"/>
         </w:numPr>
       </w:pPr>
       <w:r>
@@ -15453,7 +16196,7 @@
         <w:keepNext/>
         <w:numPr>
           <w:ilvl w:val="0"/>
-          <w:numId w:val="1013"/>
+          <w:numId w:val="1016"/>
         </w:numPr>
       </w:pPr>
       <w:r>
@@ -15618,6 +16361,32 @@
             </w:r>
             <w:r>
               <w:t xml:space="preserve">, instead of forcing a wrong label.</w:t>
+            </w:r>
+          </w:p>
+        </w:tc>
+      </w:tr>
+      <w:tr>
+        <w:tc>
+          <w:tcPr/>
+          <w:p>
+            <w:pPr>
+              <w:pStyle w:val="Compact"/>
+              <w:jc w:val="left"/>
+            </w:pPr>
+            <w:r>
+              <w:t xml:space="preserve">Mixed typography</w:t>
+            </w:r>
+          </w:p>
+        </w:tc>
+        <w:tc>
+          <w:tcPr/>
+          <w:p>
+            <w:pPr>
+              <w:pStyle w:val="Compact"/>
+              <w:jc w:val="left"/>
+            </w:pPr>
+            <w:r>
+              <w:t xml:space="preserve">Verdict for a crop whose patch-level features indicate more than one typeface and that stays inhomogeneous after one split; no single font is assigned.</w:t>
             </w:r>
           </w:p>
         </w:tc>
@@ -16949,6 +17718,176 @@
     </w:lvl>
     <w:lvl w:ilvl="8">
       <w:start w:val="1"/>
+      <w:numFmt w:val="decimal"/>
+      <w:lvlText w:val="%9."/>
+      <w:lvlJc w:val="left"/>
+      <w:pPr>
+        <w:ind w:left="6480" w:hanging="360"/>
+      </w:pPr>
+    </w:lvl>
+  </w:abstractNum>
+  <w:abstractNum w:abstractNumId="99419">
+    <w:nsid w:val="00A99419"/>
+    <w:multiLevelType w:val="multilevel"/>
+    <w:lvl w:ilvl="0">
+      <w:start w:val="9"/>
+      <w:numFmt w:val="decimal"/>
+      <w:lvlText w:val="%1."/>
+      <w:lvlJc w:val="left"/>
+      <w:pPr>
+        <w:ind w:left="720" w:hanging="360"/>
+      </w:pPr>
+    </w:lvl>
+    <w:lvl w:ilvl="1">
+      <w:start w:val="9"/>
+      <w:numFmt w:val="decimal"/>
+      <w:lvlText w:val="%2."/>
+      <w:lvlJc w:val="left"/>
+      <w:pPr>
+        <w:ind w:left="1440" w:hanging="360"/>
+      </w:pPr>
+    </w:lvl>
+    <w:lvl w:ilvl="2">
+      <w:start w:val="9"/>
+      <w:numFmt w:val="decimal"/>
+      <w:lvlText w:val="%3."/>
+      <w:lvlJc w:val="left"/>
+      <w:pPr>
+        <w:ind w:left="2160" w:hanging="360"/>
+      </w:pPr>
+    </w:lvl>
+    <w:lvl w:ilvl="3">
+      <w:start w:val="9"/>
+      <w:numFmt w:val="decimal"/>
+      <w:lvlText w:val="%4."/>
+      <w:lvlJc w:val="left"/>
+      <w:pPr>
+        <w:ind w:left="2880" w:hanging="360"/>
+      </w:pPr>
+    </w:lvl>
+    <w:lvl w:ilvl="4">
+      <w:start w:val="9"/>
+      <w:numFmt w:val="decimal"/>
+      <w:lvlText w:val="%5."/>
+      <w:lvlJc w:val="left"/>
+      <w:pPr>
+        <w:ind w:left="3600" w:hanging="360"/>
+      </w:pPr>
+    </w:lvl>
+    <w:lvl w:ilvl="5">
+      <w:start w:val="9"/>
+      <w:numFmt w:val="decimal"/>
+      <w:lvlText w:val="%6."/>
+      <w:lvlJc w:val="left"/>
+      <w:pPr>
+        <w:ind w:left="4320" w:hanging="360"/>
+      </w:pPr>
+    </w:lvl>
+    <w:lvl w:ilvl="6">
+      <w:start w:val="9"/>
+      <w:numFmt w:val="decimal"/>
+      <w:lvlText w:val="%7."/>
+      <w:lvlJc w:val="left"/>
+      <w:pPr>
+        <w:ind w:left="5040" w:hanging="360"/>
+      </w:pPr>
+    </w:lvl>
+    <w:lvl w:ilvl="7">
+      <w:start w:val="9"/>
+      <w:numFmt w:val="decimal"/>
+      <w:lvlText w:val="%8."/>
+      <w:lvlJc w:val="left"/>
+      <w:pPr>
+        <w:ind w:left="5760" w:hanging="360"/>
+      </w:pPr>
+    </w:lvl>
+    <w:lvl w:ilvl="8">
+      <w:start w:val="9"/>
+      <w:numFmt w:val="decimal"/>
+      <w:lvlText w:val="%9."/>
+      <w:lvlJc w:val="left"/>
+      <w:pPr>
+        <w:ind w:left="6480" w:hanging="360"/>
+      </w:pPr>
+    </w:lvl>
+  </w:abstractNum>
+  <w:abstractNum w:abstractNumId="994112">
+    <w:nsid w:val="0A994112"/>
+    <w:multiLevelType w:val="multilevel"/>
+    <w:lvl w:ilvl="0">
+      <w:start w:val="12"/>
+      <w:numFmt w:val="decimal"/>
+      <w:lvlText w:val="%1."/>
+      <w:lvlJc w:val="left"/>
+      <w:pPr>
+        <w:ind w:left="720" w:hanging="360"/>
+      </w:pPr>
+    </w:lvl>
+    <w:lvl w:ilvl="1">
+      <w:start w:val="12"/>
+      <w:numFmt w:val="decimal"/>
+      <w:lvlText w:val="%2."/>
+      <w:lvlJc w:val="left"/>
+      <w:pPr>
+        <w:ind w:left="1440" w:hanging="360"/>
+      </w:pPr>
+    </w:lvl>
+    <w:lvl w:ilvl="2">
+      <w:start w:val="12"/>
+      <w:numFmt w:val="decimal"/>
+      <w:lvlText w:val="%3."/>
+      <w:lvlJc w:val="left"/>
+      <w:pPr>
+        <w:ind w:left="2160" w:hanging="360"/>
+      </w:pPr>
+    </w:lvl>
+    <w:lvl w:ilvl="3">
+      <w:start w:val="12"/>
+      <w:numFmt w:val="decimal"/>
+      <w:lvlText w:val="%4."/>
+      <w:lvlJc w:val="left"/>
+      <w:pPr>
+        <w:ind w:left="2880" w:hanging="360"/>
+      </w:pPr>
+    </w:lvl>
+    <w:lvl w:ilvl="4">
+      <w:start w:val="12"/>
+      <w:numFmt w:val="decimal"/>
+      <w:lvlText w:val="%5."/>
+      <w:lvlJc w:val="left"/>
+      <w:pPr>
+        <w:ind w:left="3600" w:hanging="360"/>
+      </w:pPr>
+    </w:lvl>
+    <w:lvl w:ilvl="5">
+      <w:start w:val="12"/>
+      <w:numFmt w:val="decimal"/>
+      <w:lvlText w:val="%6."/>
+      <w:lvlJc w:val="left"/>
+      <w:pPr>
+        <w:ind w:left="4320" w:hanging="360"/>
+      </w:pPr>
+    </w:lvl>
+    <w:lvl w:ilvl="6">
+      <w:start w:val="12"/>
+      <w:numFmt w:val="decimal"/>
+      <w:lvlText w:val="%7."/>
+      <w:lvlJc w:val="left"/>
+      <w:pPr>
+        <w:ind w:left="5040" w:hanging="360"/>
+      </w:pPr>
+    </w:lvl>
+    <w:lvl w:ilvl="7">
+      <w:start w:val="12"/>
+      <w:numFmt w:val="decimal"/>
+      <w:lvlText w:val="%8."/>
+      <w:lvlJc w:val="left"/>
+      <w:pPr>
+        <w:ind w:left="5760" w:hanging="360"/>
+      </w:pPr>
+    </w:lvl>
+    <w:lvl w:ilvl="8">
+      <w:start w:val="12"/>
       <w:numFmt w:val="decimal"/>
       <w:lvlText w:val="%9."/>
       <w:lvlJc w:val="left"/>
@@ -17184,6 +18123,66 @@
     </w:lvlOverride>
   </w:num>
   <w:num w:numId="1005">
+    <w:abstractNumId w:val="99419"/>
+    <w:lvlOverride w:ilvl="0">
+      <w:startOverride w:val="9"/>
+    </w:lvlOverride>
+    <w:lvlOverride w:ilvl="1">
+      <w:startOverride w:val="9"/>
+    </w:lvlOverride>
+    <w:lvlOverride w:ilvl="2">
+      <w:startOverride w:val="9"/>
+    </w:lvlOverride>
+    <w:lvlOverride w:ilvl="3">
+      <w:startOverride w:val="9"/>
+    </w:lvlOverride>
+    <w:lvlOverride w:ilvl="4">
+      <w:startOverride w:val="9"/>
+    </w:lvlOverride>
+    <w:lvlOverride w:ilvl="5">
+      <w:startOverride w:val="9"/>
+    </w:lvlOverride>
+    <w:lvlOverride w:ilvl="6">
+      <w:startOverride w:val="9"/>
+    </w:lvlOverride>
+    <w:lvlOverride w:ilvl="7">
+      <w:startOverride w:val="9"/>
+    </w:lvlOverride>
+    <w:lvlOverride w:ilvl="8">
+      <w:startOverride w:val="9"/>
+    </w:lvlOverride>
+  </w:num>
+  <w:num w:numId="1006">
+    <w:abstractNumId w:val="994112"/>
+    <w:lvlOverride w:ilvl="0">
+      <w:startOverride w:val="12"/>
+    </w:lvlOverride>
+    <w:lvlOverride w:ilvl="1">
+      <w:startOverride w:val="12"/>
+    </w:lvlOverride>
+    <w:lvlOverride w:ilvl="2">
+      <w:startOverride w:val="12"/>
+    </w:lvlOverride>
+    <w:lvlOverride w:ilvl="3">
+      <w:startOverride w:val="12"/>
+    </w:lvlOverride>
+    <w:lvlOverride w:ilvl="4">
+      <w:startOverride w:val="12"/>
+    </w:lvlOverride>
+    <w:lvlOverride w:ilvl="5">
+      <w:startOverride w:val="12"/>
+    </w:lvlOverride>
+    <w:lvlOverride w:ilvl="6">
+      <w:startOverride w:val="12"/>
+    </w:lvlOverride>
+    <w:lvlOverride w:ilvl="7">
+      <w:startOverride w:val="12"/>
+    </w:lvlOverride>
+    <w:lvlOverride w:ilvl="8">
+      <w:startOverride w:val="12"/>
+    </w:lvlOverride>
+  </w:num>
+  <w:num w:numId="1007">
     <w:abstractNumId w:val="99411"/>
     <w:lvlOverride w:ilvl="0">
       <w:startOverride w:val="1"/>
@@ -17213,7 +18212,7 @@
       <w:startOverride w:val="1"/>
     </w:lvlOverride>
   </w:num>
-  <w:num w:numId="1006">
+  <w:num w:numId="1008">
     <w:abstractNumId w:val="99411"/>
     <w:lvlOverride w:ilvl="0">
       <w:startOverride w:val="1"/>
@@ -17243,19 +18242,7 @@
       <w:startOverride w:val="1"/>
     </w:lvlOverride>
   </w:num>
-  <w:num w:numId="1007">
-    <w:abstractNumId w:val="991"/>
-  </w:num>
-  <w:num w:numId="1008">
-    <w:abstractNumId w:val="991"/>
-  </w:num>
   <w:num w:numId="1009">
-    <w:abstractNumId w:val="991"/>
-  </w:num>
-  <w:num w:numId="1010">
-    <w:abstractNumId w:val="991"/>
-  </w:num>
-  <w:num w:numId="1011">
     <w:abstractNumId w:val="99411"/>
     <w:lvlOverride w:ilvl="0">
       <w:startOverride w:val="1"/>
@@ -17285,10 +18272,52 @@
       <w:startOverride w:val="1"/>
     </w:lvlOverride>
   </w:num>
+  <w:num w:numId="1010">
+    <w:abstractNumId w:val="991"/>
+  </w:num>
+  <w:num w:numId="1011">
+    <w:abstractNumId w:val="991"/>
+  </w:num>
   <w:num w:numId="1012">
     <w:abstractNumId w:val="991"/>
   </w:num>
   <w:num w:numId="1013">
+    <w:abstractNumId w:val="991"/>
+  </w:num>
+  <w:num w:numId="1014">
+    <w:abstractNumId w:val="99411"/>
+    <w:lvlOverride w:ilvl="0">
+      <w:startOverride w:val="1"/>
+    </w:lvlOverride>
+    <w:lvlOverride w:ilvl="1">
+      <w:startOverride w:val="1"/>
+    </w:lvlOverride>
+    <w:lvlOverride w:ilvl="2">
+      <w:startOverride w:val="1"/>
+    </w:lvlOverride>
+    <w:lvlOverride w:ilvl="3">
+      <w:startOverride w:val="1"/>
+    </w:lvlOverride>
+    <w:lvlOverride w:ilvl="4">
+      <w:startOverride w:val="1"/>
+    </w:lvlOverride>
+    <w:lvlOverride w:ilvl="5">
+      <w:startOverride w:val="1"/>
+    </w:lvlOverride>
+    <w:lvlOverride w:ilvl="6">
+      <w:startOverride w:val="1"/>
+    </w:lvlOverride>
+    <w:lvlOverride w:ilvl="7">
+      <w:startOverride w:val="1"/>
+    </w:lvlOverride>
+    <w:lvlOverride w:ilvl="8">
+      <w:startOverride w:val="1"/>
+    </w:lvlOverride>
+  </w:num>
+  <w:num w:numId="1015">
+    <w:abstractNumId w:val="991"/>
+  </w:num>
+  <w:num w:numId="1016">
     <w:abstractNumId w:val="991"/>
   </w:num>
 </w:numbering>

</xml_diff>

<commit_message>
feat(methodology): update for mixed tpography
</commit_message>
<xml_diff>
--- a/Final Paper.docx
+++ b/Final Paper.docx
@@ -7204,7 +7204,19 @@
         <w:t xml:space="preserve"> </w:t>
       </w:r>
       <w:r>
-        <w:t xml:space="preserve">verdict, and a label is fixed only when at least two of three raters agree. The instrument’s</w:t>
+        <w:t xml:space="preserve">verdict, and a label is fixed only when at least two of three raters agree. Each item also carries a second required judgment: whether the crop appears to be set in one typeface throughout or in more than one, with a</w:t>
+      </w:r>
+      <w:r>
+        <w:t xml:space="preserve"> </w:t>
+      </w:r>
+      <w:r>
+        <w:t xml:space="preserve">“cannot tell”</w:t>
+      </w:r>
+      <w:r>
+        <w:t xml:space="preserve"> </w:t>
+      </w:r>
+      <w:r>
+        <w:t xml:space="preserve">option, under the same blind protocol and consensus rule. This coherence question turns the single-typeface assumption of Section 4.4.2 from a premise into a measured quantity — the prevalence of font-incoherent text in real generative output — and its consensus answers double as the ground truth against which the pipeline’s homogeneity check is validated (Section 4.10.2). The instrument’s</w:t>
       </w:r>
       <w:r>
         <w:t xml:space="preserve"> </w:t>
@@ -8572,7 +8584,23 @@
         <w:t xml:space="preserve"> </w:t>
       </w:r>
       <w:r>
-        <w:t xml:space="preserve">The text regions of Figure 8 are delimited at word granularity: the localizer emits one bounding box per word, under the assumption that each word is set in a single typeface. This holds for the overwhelming majority of designed text, where font changes fall between words — a heading face against an accent face — rather than inside them, so word crops make the one-font-per-crop premise of the match test approximately true by construction; adjacent words that receive the same verdict are merged back into a single region in the presentation layer, so a five-word headline still reads as one result. The assumption is checked rather than trusted. The ViT encoder’s forward pass already yields one token per image patch, and when a crop’s patch tokens disagree about style — the signature of two typefaces sharing one box, or of a localizer box that swallowed two words — the crop is flagged as inhomogeneous at no additional inference cost, split at the token-cluster boundary, and each half is matched on its own. A half that remains incoherent after one split receives a third verdict,</w:t>
+        <w:t xml:space="preserve">The text regions of Figure 8 are delimited at word granularity: the localizer emits one bounding box per word, under the assumption that each word is set in a single typeface. This holds for the overwhelming majority of designed text, where font changes fall between words — a heading face against an accent face — rather than inside them, so word crops make the one-font-per-crop premise of the match test approximately true by construction. The assumption operates at the level of design intent: generators learn from designed text, so a word’s intended style is single, and style that drifts</w:t>
+      </w:r>
+      <w:r>
+        <w:t xml:space="preserve"> </w:t>
+      </w:r>
+      <w:r>
+        <w:rPr>
+          <w:i/>
+          <w:iCs/>
+        </w:rPr>
+        <w:t xml:space="preserve">within</w:t>
+      </w:r>
+      <w:r>
+        <w:t xml:space="preserve"> </w:t>
+      </w:r>
+      <w:r>
+        <w:t xml:space="preserve">a word is the hallucination this thesis studies — degradation around one intent, not a deliberate second typeface. How often real output violates even that intent-level reading is measured rather than presumed, through the panel’s coherence judgment (Section 4.2.3); adjacent words that receive the same verdict are merged back into a single region in the presentation layer, so a five-word headline still reads as one result. The assumption is checked rather than trusted. The ViT encoder’s forward pass already yields one token per image patch, and when a crop’s patch tokens disagree about style — the signature of two typefaces sharing one box, or of a localizer box that swallowed two words — the crop is flagged as inhomogeneous at no additional inference cost, split at the token-cluster boundary, and each half is matched on its own. A half that remains incoherent after one split receives a third verdict,</w:t>
       </w:r>
       <w:r>
         <w:t xml:space="preserve"> </w:t>
@@ -8598,6 +8626,47 @@
       </w:r>
       <w:r>
         <w:t xml:space="preserve">it reports that the crop violates the single-font premise and that no one font can honestly be assigned, instead of confidently naming the majority face and silently discarding the other. Attribution finer than one split — per-glyph styling inside an unsplittable word — is out of scope: it would require character segmentation on precisely the malformed glyphs that defeat segmenters, and a word deliberately set in two typefaces has no single reconstructable font for the template goal in any case.</w:t>
+      </w:r>
+    </w:p>
+    <w:p>
+      <w:pPr>
+        <w:pStyle w:val="BodyText"/>
+      </w:pPr>
+      <w:r>
+        <w:rPr>
+          <w:b/>
+          <w:bCs/>
+        </w:rPr>
+        <w:t xml:space="preserve">How a flagged crop is split.</w:t>
+      </w:r>
+      <w:r>
+        <w:t xml:space="preserve"> </w:t>
+      </w:r>
+      <w:r>
+        <w:t xml:space="preserve">The check and the split both read the encoder’s patch grid. A 224 × 224 input reaches the ViT as a 16 × 16 grid of patches, one token each; patches carrying no ink (padding margins, inter-letter gaps) are excluded by their attention weight, and the remaining tokens are pooled by grid column, giving a left-to-right style profile of the word. Homogeneity is judged by how tightly those column vectors group: when a two-group clustering separates them more widely than a dispersion cutoff — calibrated, like</w:t>
+      </w:r>
+      <w:r>
+        <w:t xml:space="preserve"> </w:t>
+      </w:r>
+      <m:oMath>
+        <m:r>
+          <m:t>τ</m:t>
+        </m:r>
+      </m:oMath>
+      <w:r>
+        <w:t xml:space="preserve">, at an operating point on labeled data (Section 4.10.2) — the crop is flagged as inhomogeneous. The split then demands spatial contiguity. Only when the two groups occupy a contiguous left run and a contiguous right run of columns does a real boundary exist; the boundary column is mapped back to a pixel coordinate in the original crop, undoing the padding offset, and the cut is made with a margin of roughly half a character so that no glyph is bisected. Interleaved groups mean per-letter drift rather than composed typography — no boundary exists, and the crop takes the mixed-typography verdict directly, which is what prevents the system from imposing structure on noise. Each half re-enters the pipeline as an ordinary crop, and the split is attempted only once: a word still incoherent after one cut is not a composition of typefaces but deformation past recovery, for which</w:t>
+      </w:r>
+      <w:r>
+        <w:t xml:space="preserve"> </w:t>
+      </w:r>
+      <w:r>
+        <w:t xml:space="preserve">“mixed typography”</w:t>
+      </w:r>
+      <w:r>
+        <w:t xml:space="preserve"> </w:t>
+      </w:r>
+      <w:r>
+        <w:t xml:space="preserve">is already the honest answer. The added cost is negligible — the tokens exist from the original forward pass, the clustering runs over at most sixteen column vectors, and extra encoder passes arise only for the two halves of actually flagged crops.</w:t>
       </w:r>
     </w:p>
     <w:p>
@@ -12340,7 +12409,18 @@
         <w:t xml:space="preserve"> </w:t>
       </w:r>
       <w:r>
-        <w:t xml:space="preserve">like every other crop, so the detection rate and false-alarm rate of the homogeneity check are measured on labeled data that no in-the-wild collection could supply. Because the served unit is the word crop, the threshold calibration of this section is likewise performed on word-granularity validation crops. Second, the choice of encoder is validated by a</w:t>
+        <w:t xml:space="preserve">like every other crop, so the detection rate and false-alarm rate of the homogeneity check are measured on labeled data that no in-the-wild collection could supply. The check’s dispersion cutoff is calibrated on the same stressor set by the operating-point recipe used for</w:t>
+      </w:r>
+      <w:r>
+        <w:t xml:space="preserve"> </w:t>
+      </w:r>
+      <m:oMath>
+        <m:r>
+          <m:t>τ</m:t>
+        </m:r>
+      </m:oMath>
+      <w:r>
+        <w:t xml:space="preserve">, and its real-world validity is reported as the agreement between the flag and the panel’s coherence judgment (Section 4.2.3) on the real-generative crops. Because the served unit is the word crop, the threshold calibration of this section is likewise performed on word-granularity validation crops. Second, the choice of encoder is validated by a</w:t>
       </w:r>
       <w:r>
         <w:t xml:space="preserve"> </w:t>
@@ -16530,7 +16610,7 @@
         <w:pStyle w:val="FirstParagraph"/>
       </w:pPr>
       <w:r>
-        <w:t xml:space="preserve">This appendix reproduces the layout of the web-based rating form that delivers the human-proxy consensus instrument of Section 4.2.3. The form has two screens. Screen A is shown once: it states the task, the ground rules (independent, self-paced, blind to the model’s predictions and to the other raters), and the palette reference sheet the rater keeps open while rating. Screen B repeats for each of the [N = 100] real generative text crops: the crop is displayed beside an excerpt of the reference sheet, and the rater makes exactly one required choice — the closest palette font, found through a searchable list, or the</w:t>
+        <w:t xml:space="preserve">This appendix reproduces the layout of the web-based rating form that delivers the human-proxy consensus instrument of Section 4.2.3. The form has two screens. Screen A is shown once: it states the task, the ground rules (independent, self-paced, blind to the model’s predictions and to the other raters), and the palette reference sheet the rater keeps open while rating. Screen B repeats for each of the [N = 100] real generative text crops: the crop is displayed beside an excerpt of the reference sheet, and the rater makes two required judgments — first, the closest palette font, found through a searchable list, or the</w:t>
       </w:r>
       <w:r>
         <w:t xml:space="preserve"> </w:t>
@@ -16542,7 +16622,19 @@
         <w:t xml:space="preserve"> </w:t>
       </w:r>
       <w:r>
-        <w:t xml:space="preserve">verdict when no palette font matches.</w:t>
+        <w:t xml:space="preserve">verdict when no palette font matches; and second, whether the crop appears set in one typeface throughout or in more than one, with a</w:t>
+      </w:r>
+      <w:r>
+        <w:t xml:space="preserve"> </w:t>
+      </w:r>
+      <w:r>
+        <w:t xml:space="preserve">“cannot tell”</w:t>
+      </w:r>
+      <w:r>
+        <w:t xml:space="preserve"> </w:t>
+      </w:r>
+      <w:r>
+        <w:t xml:space="preserve">option (the coherence judgment of Section 4.2.3, which measures the prevalence of font-incoherent generative text and validates the pipeline’s homogeneity check).</w:t>
       </w:r>
     </w:p>
     <w:p>

</xml_diff>

<commit_message>
feat(methodology): added comparison tables
</commit_message>
<xml_diff>
--- a/Final Paper.docx
+++ b/Final Paper.docx
@@ -8792,7 +8792,7 @@
         <w:t xml:space="preserve">how we measure it</w:t>
       </w:r>
       <w:r>
-        <w:t xml:space="preserve">, holds the researcher instruments of Section 4.2 rather than any part of the served system. Top-K accuracy records how often the true font appears in the shortlist. The re-render check scores the structural distance between a re-rendering of the predicted font and the original crop. The human-proxy panel supplies the accuracy floor. These run offline, over held-out evaluation sets, and produce no output the designer ever sees.</w:t>
+        <w:t xml:space="preserve">, holds the researcher instruments of Section 4.2 rather than any part of the served system. Top-K accuracy records how often the true font appears in the shortlist. The re-render check scores the structural distance between a re-rendering of the predicted font and the original crop. The model comparison benchmarks the recognizer against the closed-set baselines and the alternative backbones, under the protocol of Section 4.10.2. The human-proxy panel supplies the accuracy floor. These run offline, over held-out evaluation sets, and produce no output the designer ever sees.</w:t>
       </w:r>
     </w:p>
     <w:p>
@@ -8830,7 +8830,7 @@
           <wp:inline>
             <wp:extent cx="5334000" cy="4109366"/>
             <wp:effectExtent b="0" l="0" r="0" t="0"/>
-            <wp:docPr descr="Diagram with three enclosed horizontal bands. Top band, before deployment: the Google Fonts palette is rendered into pristine word crops, expanded by the operator D with degraded look-alikes, and the combined pristine-plus-degraded corpus trains a teacher model (DINOv2 with LoRA, offline only) and a student metric head f-theta, which learns from font labels through triplet loss and from the teacher through distillation; the band ends in the trained model, meaning the weights f-theta and the match threshold tau. A dashed arrow carries that model into the middle band, loaded once at startup. Middle band, at use: an AI-generated image from DALL-E, Midjourney, or Stable Diffusion passes through off-the-shelf text localization, which emits one bounding box per word; each word crop is then resized to 224 by 224 pixels, converted to grayscale and rescaled in brightness, encoded by the frozen DINOv2 Vision Transformer, passed through a same-font check that asks whether the crop’s patches agree on one style (splitting the crop once if not), projected by the metric head into a font-style fingerprint, and put to a match test against the threshold tau. Three verdicts follow: passing crops yield a Top-K Google Fonts shortlist, one per crop; crops whose closest font falls short of tau yield an unknown-font verdict in which no font is guessed; and crops that remain style-incoherent after one split yield a mixed-typography verdict in which no single font is assigned. Bottom band, how we measure it: Top-K accuracy, the re-render check, and the human-proxy panel, marked as researcher instruments never shown to the user. An in-figure legend defines solid arrows as the per-image path and dashed arrows as researcher-side work outside it" title="" id="80" name="Picture"/>
+            <wp:docPr descr="Diagram with three enclosed horizontal bands. Top band, before deployment: the Google Fonts palette is rendered into pristine word crops, expanded by the operator D with degraded look-alikes, and the combined pristine-plus-degraded corpus trains a teacher model (DINOv2 with LoRA, offline only) and a student metric head f-theta, which learns from font labels through triplet loss and from the teacher through distillation; the band ends in the trained model, meaning the weights f-theta and the match threshold tau. A dashed arrow carries that model into the middle band, loaded once at startup. Middle band, at use: an AI-generated image from DALL-E, Midjourney, or Stable Diffusion passes through off-the-shelf text localization, which emits one bounding box per word; each word crop is then resized to 224 by 224 pixels, converted to grayscale and rescaled in brightness, encoded by the frozen DINOv2 Vision Transformer, passed through a same-font check that asks whether the crop’s patches agree on one style (splitting the crop once if not), projected by the metric head into a font-style fingerprint, and put to a match test against the threshold tau. Three verdicts follow: passing crops yield a Top-K Google Fonts shortlist, one per crop; crops whose closest font falls short of tau yield an unknown-font verdict in which no font is guessed; and crops that remain style-incoherent after one split yield a mixed-typography verdict in which no single font is assigned. Bottom band, how we measure it: Top-K accuracy, the re-render check, the model comparison against closed-set baselines and alternative backbones, and the human-proxy panel, marked as researcher instruments never shown to the user. An in-figure legend defines solid arrows as the per-image path and dashed arrows as researcher-side work outside it" title="" id="80" name="Picture"/>
             <a:graphic>
               <a:graphicData uri="http://schemas.openxmlformats.org/drawingml/2006/picture">
                 <pic:pic>
@@ -12541,7 +12541,390 @@
         <w:t xml:space="preserve"> </w:t>
       </w:r>
       <w:r>
-        <w:t xml:space="preserve">rather than by assumption. The same frozen-encoder-plus-metric-head recipe, the same corpus, and the same calibration procedure are re-run with only the backbone swapped: the incumbent DINOv2 against a contrastively pretrained vision-language encoder, a supervised ViT, and a convolutional baseline. Each candidate is reported with its Top-1/Top-3 accuracy, false-positive rate at 95% recall, parameter count, and CPU and GPU inference latency. One capability requirement narrows the field before speed and accuracy decide it: the homogeneity check reads per-patch tokens, so a qualifying backbone must expose patch-level features. That is a property of the ViT family which a pooled convolutional embedding does not natively provide. The comparison therefore selects the deployed model on measured evidence, with the architecture class justified by the capability the pipeline requires of it.</w:t>
+        <w:t xml:space="preserve">rather than by assumption. The same frozen-encoder-plus-metric-head recipe, the same corpus, and the same calibration procedure are re-run with only the backbone swapped: the incumbent DINOv2 (Oquab et al., 2024) against a contrastively pretrained vision-language encoder (SigLIP; Zhai et al., 2023), a supervised ViT (Dosovitskiy et al., 2021), and a convolutional baseline (ConvNeXt; Liu et al., 2022). Each candidate is reported with its Top-1/Top-3 accuracy, false-positive rate at 95% recall, parameter count, and CPU and GPU inference latency. One capability requirement narrows the field before speed and accuracy decide it: the homogeneity check reads per-patch tokens, so a qualifying backbone must expose patch-level features. That is a property of the ViT family which a pooled convolutional embedding does not natively provide. The comparison therefore selects the deployed model on measured evidence, with the architecture class justified by the capability the pipeline requires of it. Table 5 profiles the four candidates: what the literature already establishes about each, and which columns only this study’s runs can fill.</w:t>
+      </w:r>
+    </w:p>
+    <w:p>
+      <w:pPr>
+        <w:pStyle w:val="BodyText"/>
+        <w:keepNext/>
+      </w:pPr>
+      <w:r>
+        <w:rPr>
+          <w:b/>
+          <w:bCs/>
+        </w:rPr>
+        <w:t xml:space="preserve">Table 5</w:t>
+      </w:r>
+    </w:p>
+    <w:p>
+      <w:pPr>
+        <w:pStyle w:val="BodyText"/>
+        <w:keepNext/>
+      </w:pPr>
+      <w:r>
+        <w:rPr>
+          <w:i/>
+          <w:iCs/>
+        </w:rPr>
+        <w:t xml:space="preserve">Candidate Backbones for the Encoder Comparison</w:t>
+      </w:r>
+    </w:p>
+    <w:tbl>
+      <w:tblPr>
+        <w:tblStyle w:val="Table"/>
+        <w:tblW w:type="pct" w:w="5000"/>
+        <w:tblLayout w:type="fixed"/>
+        <w:tblLook w:firstRow="1" w:lastRow="0" w:firstColumn="0" w:lastColumn="0" w:noHBand="0" w:noVBand="0" w:val="0020"/>
+      </w:tblPr>
+      <w:tblGrid>
+        <w:gridCol w:w="1788"/>
+        <w:gridCol w:w="1532"/>
+        <w:gridCol w:w="1532"/>
+        <w:gridCol w:w="1532"/>
+        <w:gridCol w:w="1532"/>
+      </w:tblGrid>
+      <w:tr>
+        <w:trPr>
+          <w:tblHeader w:val="on"/>
+        </w:trPr>
+        <w:tc>
+          <w:tcPr/>
+          <w:p>
+            <w:pPr>
+              <w:pStyle w:val="Compact"/>
+            </w:pPr>
+            <w:r>
+              <w:t xml:space="preserve">Backbone (checkpoint)</w:t>
+            </w:r>
+          </w:p>
+        </w:tc>
+        <w:tc>
+          <w:tcPr/>
+          <w:p>
+            <w:pPr>
+              <w:pStyle w:val="Compact"/>
+            </w:pPr>
+            <w:r>
+              <w:t xml:space="preserve">Pretraining signal</w:t>
+            </w:r>
+          </w:p>
+        </w:tc>
+        <w:tc>
+          <w:tcPr/>
+          <w:p>
+            <w:pPr>
+              <w:pStyle w:val="Compact"/>
+            </w:pPr>
+            <w:r>
+              <w:t xml:space="preserve">Parameters</w:t>
+            </w:r>
+          </w:p>
+        </w:tc>
+        <w:tc>
+          <w:tcPr/>
+          <w:p>
+            <w:pPr>
+              <w:pStyle w:val="Compact"/>
+            </w:pPr>
+            <w:r>
+              <w:t xml:space="preserve">Patch-level features</w:t>
+            </w:r>
+          </w:p>
+        </w:tc>
+        <w:tc>
+          <w:tcPr/>
+          <w:p>
+            <w:pPr>
+              <w:pStyle w:val="Compact"/>
+            </w:pPr>
+            <w:r>
+              <w:t xml:space="preserve">Reported ImageNet-1k accuracy</w:t>
+            </w:r>
+          </w:p>
+        </w:tc>
+      </w:tr>
+      <w:tr>
+        <w:tc>
+          <w:tcPr/>
+          <w:p>
+            <w:pPr>
+              <w:pStyle w:val="Compact"/>
+            </w:pPr>
+            <w:r>
+              <w:t xml:space="preserve">DINOv2 ViT-B/14 —</w:t>
+            </w:r>
+            <w:r>
+              <w:t xml:space="preserve"> </w:t>
+            </w:r>
+            <w:r>
+              <w:rPr>
+                <w:rStyle w:val="VerbatimChar"/>
+              </w:rPr>
+              <w:t xml:space="preserve">facebook/dinov2-base</w:t>
+            </w:r>
+          </w:p>
+        </w:tc>
+        <w:tc>
+          <w:tcPr/>
+          <w:p>
+            <w:pPr>
+              <w:pStyle w:val="Compact"/>
+            </w:pPr>
+            <w:r>
+              <w:t xml:space="preserve">Self-supervised (Oquab et al., 2024)</w:t>
+            </w:r>
+          </w:p>
+        </w:tc>
+        <w:tc>
+          <w:tcPr/>
+          <w:p>
+            <w:pPr>
+              <w:pStyle w:val="Compact"/>
+            </w:pPr>
+            <w:r>
+              <w:t xml:space="preserve">86.6M</w:t>
+            </w:r>
+          </w:p>
+        </w:tc>
+        <w:tc>
+          <w:tcPr/>
+          <w:p>
+            <w:pPr>
+              <w:pStyle w:val="Compact"/>
+            </w:pPr>
+            <w:r>
+              <w:t xml:space="preserve">Yes — native patch tokens</w:t>
+            </w:r>
+          </w:p>
+        </w:tc>
+        <w:tc>
+          <w:tcPr/>
+          <w:p>
+            <w:pPr>
+              <w:pStyle w:val="Compact"/>
+            </w:pPr>
+            <w:r>
+              <w:t xml:space="preserve">84.5% (linear probe on frozen features)</w:t>
+            </w:r>
+          </w:p>
+        </w:tc>
+      </w:tr>
+      <w:tr>
+        <w:tc>
+          <w:tcPr/>
+          <w:p>
+            <w:pPr>
+              <w:pStyle w:val="Compact"/>
+            </w:pPr>
+            <w:r>
+              <w:t xml:space="preserve">SigLIP ViT-B/16 —</w:t>
+            </w:r>
+            <w:r>
+              <w:t xml:space="preserve"> </w:t>
+            </w:r>
+            <w:r>
+              <w:rPr>
+                <w:rStyle w:val="VerbatimChar"/>
+              </w:rPr>
+              <w:t xml:space="preserve">google/siglip-base-patch16-224</w:t>
+            </w:r>
+          </w:p>
+        </w:tc>
+        <w:tc>
+          <w:tcPr/>
+          <w:p>
+            <w:pPr>
+              <w:pStyle w:val="Compact"/>
+            </w:pPr>
+            <w:r>
+              <w:t xml:space="preserve">Contrastive image-text (Zhai et al., 2023)</w:t>
+            </w:r>
+          </w:p>
+        </w:tc>
+        <w:tc>
+          <w:tcPr/>
+          <w:p>
+            <w:pPr>
+              <w:pStyle w:val="Compact"/>
+            </w:pPr>
+            <w:r>
+              <w:t xml:space="preserve">203M with the text tower; only the ViT-B vision tower runs here</w:t>
+            </w:r>
+          </w:p>
+        </w:tc>
+        <w:tc>
+          <w:tcPr/>
+          <w:p>
+            <w:pPr>
+              <w:pStyle w:val="Compact"/>
+            </w:pPr>
+            <w:r>
+              <w:t xml:space="preserve">Yes — native patch tokens</w:t>
+            </w:r>
+          </w:p>
+        </w:tc>
+        <w:tc>
+          <w:tcPr/>
+          <w:p>
+            <w:pPr>
+              <w:pStyle w:val="Compact"/>
+            </w:pPr>
+            <w:r>
+              <w:t xml:space="preserve">Published evaluations use a zero-shot protocol not comparable to the other rows (Zhai et al., 2023)</w:t>
+            </w:r>
+          </w:p>
+        </w:tc>
+      </w:tr>
+      <w:tr>
+        <w:tc>
+          <w:tcPr/>
+          <w:p>
+            <w:pPr>
+              <w:pStyle w:val="Compact"/>
+            </w:pPr>
+            <w:r>
+              <w:t xml:space="preserve">Supervised ViT-B/16 —</w:t>
+            </w:r>
+            <w:r>
+              <w:t xml:space="preserve"> </w:t>
+            </w:r>
+            <w:r>
+              <w:rPr>
+                <w:rStyle w:val="VerbatimChar"/>
+              </w:rPr>
+              <w:t xml:space="preserve">google/vit-base-patch16-224</w:t>
+            </w:r>
+          </w:p>
+        </w:tc>
+        <w:tc>
+          <w:tcPr/>
+          <w:p>
+            <w:pPr>
+              <w:pStyle w:val="Compact"/>
+            </w:pPr>
+            <w:r>
+              <w:t xml:space="preserve">Supervised classification on ImageNet-21k (Dosovitskiy et al., 2021)</w:t>
+            </w:r>
+          </w:p>
+        </w:tc>
+        <w:tc>
+          <w:tcPr/>
+          <w:p>
+            <w:pPr>
+              <w:pStyle w:val="Compact"/>
+            </w:pPr>
+            <w:r>
+              <w:t xml:space="preserve">~86M</w:t>
+            </w:r>
+          </w:p>
+        </w:tc>
+        <w:tc>
+          <w:tcPr/>
+          <w:p>
+            <w:pPr>
+              <w:pStyle w:val="Compact"/>
+            </w:pPr>
+            <w:r>
+              <w:t xml:space="preserve">Yes — native patch tokens</w:t>
+            </w:r>
+          </w:p>
+        </w:tc>
+        <w:tc>
+          <w:tcPr/>
+          <w:p>
+            <w:pPr>
+              <w:pStyle w:val="Compact"/>
+            </w:pPr>
+            <w:r>
+              <w:t xml:space="preserve">84.0% (fine-tuned)</w:t>
+            </w:r>
+          </w:p>
+        </w:tc>
+      </w:tr>
+      <w:tr>
+        <w:tc>
+          <w:tcPr/>
+          <w:p>
+            <w:pPr>
+              <w:pStyle w:val="Compact"/>
+            </w:pPr>
+            <w:r>
+              <w:t xml:space="preserve">ConvNeXt-T —</w:t>
+            </w:r>
+            <w:r>
+              <w:t xml:space="preserve"> </w:t>
+            </w:r>
+            <w:r>
+              <w:rPr>
+                <w:rStyle w:val="VerbatimChar"/>
+              </w:rPr>
+              <w:t xml:space="preserve">facebook/convnext-tiny-224</w:t>
+            </w:r>
+          </w:p>
+        </w:tc>
+        <w:tc>
+          <w:tcPr/>
+          <w:p>
+            <w:pPr>
+              <w:pStyle w:val="Compact"/>
+            </w:pPr>
+            <w:r>
+              <w:t xml:space="preserve">Supervised classification (Liu et al., 2022)</w:t>
+            </w:r>
+          </w:p>
+        </w:tc>
+        <w:tc>
+          <w:tcPr/>
+          <w:p>
+            <w:pPr>
+              <w:pStyle w:val="Compact"/>
+            </w:pPr>
+            <w:r>
+              <w:t xml:space="preserve">28.6M</w:t>
+            </w:r>
+          </w:p>
+        </w:tc>
+        <w:tc>
+          <w:tcPr/>
+          <w:p>
+            <w:pPr>
+              <w:pStyle w:val="Compact"/>
+            </w:pPr>
+            <w:r>
+              <w:t xml:space="preserve">No — pooled feature maps; does not qualify for the same-font check</w:t>
+            </w:r>
+          </w:p>
+        </w:tc>
+        <w:tc>
+          <w:tcPr/>
+          <w:p>
+            <w:pPr>
+              <w:pStyle w:val="Compact"/>
+            </w:pPr>
+            <w:r>
+              <w:t xml:space="preserve">82.1% (supervised training)</w:t>
+            </w:r>
+          </w:p>
+        </w:tc>
+      </w:tr>
+    </w:tbl>
+    <w:p>
+      <w:pPr>
+        <w:pStyle w:val="BodyText"/>
+      </w:pPr>
+      <w:r>
+        <w:rPr>
+          <w:i/>
+          <w:iCs/>
+        </w:rPr>
+        <w:t xml:space="preserve">Note.</w:t>
+      </w:r>
+      <w:r>
+        <w:t xml:space="preserve"> </w:t>
+      </w:r>
+      <w:r>
+        <w:t xml:space="preserve">The accuracy column is a general-capability proxy taken from each model’s own literature; the evaluation protocols differ (linear probe, fine-tune, supervised training) and the figures are not directly comparable with one another. Task-level performance — Top-1/Top-3 on the font corpus, false-positive rate at 95% recall, and CPU/GPU latency per crop — cannot be quoted from the literature, because no published work evaluates these backbones on degraded font recognition; those values are produced by the comparison runs of this section and reported in Chapter 5. The DINOv2-vs-supervised-ViT pair shares one architecture class, so their difference isolates the effect of self-supervised pretraining; ConvNeXt-T anchors the speed floor and the capability contrast.</w:t>
       </w:r>
     </w:p>
     <w:p>
@@ -16882,7 +17265,7 @@
           <w:i/>
           <w:iCs/>
         </w:rPr>
-        <w:t xml:space="preserve">(35 rows). Apply a hanging indent (0.5 in) and double spacing when exported.</w:t>
+        <w:t xml:space="preserve">(38 rows). Apply a hanging indent (0.5 in) and double spacing when exported.</w:t>
       </w:r>
     </w:p>
     <w:p>
@@ -17255,7 +17638,7 @@
         <w:jc w:val="left"/>
       </w:pPr>
       <w:r>
-        <w:t xml:space="preserve">Hofmann, C., Schmid, S., Lehner, B., Klotz, D., &amp; Hochreiter, S. (2024). Energy-based Hopfield boosting for out-of-distribution detection. In</w:t>
+        <w:t xml:space="preserve">Dosovitskiy, A., Beyer, L., Kolesnikov, A., Weissenborn, D., Zhai, X., Unterthiner, T., Dehghani, M., Minderer, M., Heigold, G., Gelly, S., Uszkoreit, J., &amp; Houlsby, N. (2021). An image is worth 16×16 words: Transformers for image recognition at scale. In</w:t>
       </w:r>
       <w:r>
         <w:t xml:space="preserve"> </w:t>
@@ -17265,13 +17648,10 @@
           <w:i/>
           <w:iCs/>
         </w:rPr>
-        <w:t xml:space="preserve">Advances in Neural Information Processing Systems</w:t>
-      </w:r>
-      <w:r>
-        <w:t xml:space="preserve"> </w:t>
-      </w:r>
-      <w:r>
-        <w:t xml:space="preserve">(Vol. 37). https://proceedings.neurips.cc/paper_files/paper/2024/hash/ee20461718669c6c9c5da478d46d60d9-Abstract-Conference.html</w:t>
+        <w:t xml:space="preserve">International Conference on Learning Representations (ICLR)</w:t>
+      </w:r>
+      <w:r>
+        <w:t xml:space="preserve">. https://arxiv.org/abs/2010.11929</w:t>
       </w:r>
     </w:p>
     <w:p>
@@ -17281,7 +17661,7 @@
         <w:jc w:val="left"/>
       </w:pPr>
       <w:r>
-        <w:t xml:space="preserve">Jiang, B., Yuan, Y., Bai, X., Hao, Z., Yin, A., Hu, Y., Liao, W., Ungar, L., &amp; Taylor, C. J. (2025). ControlText: Unlocking controllable fonts in multilingual text rendering without font annotations. In</w:t>
+        <w:t xml:space="preserve">Hofmann, C., Schmid, S., Lehner, B., Klotz, D., &amp; Hochreiter, S. (2024). Energy-based Hopfield boosting for out-of-distribution detection. In</w:t>
       </w:r>
       <w:r>
         <w:t xml:space="preserve"> </w:t>
@@ -17291,10 +17671,13 @@
           <w:i/>
           <w:iCs/>
         </w:rPr>
-        <w:t xml:space="preserve">Findings of the Association for Computational Linguistics: EMNLP 2025</w:t>
-      </w:r>
-      <w:r>
-        <w:t xml:space="preserve">. https://arxiv.org/abs/2502.10999</w:t>
+        <w:t xml:space="preserve">Advances in Neural Information Processing Systems</w:t>
+      </w:r>
+      <w:r>
+        <w:t xml:space="preserve"> </w:t>
+      </w:r>
+      <w:r>
+        <w:t xml:space="preserve">(Vol. 37). https://proceedings.neurips.cc/paper_files/paper/2024/hash/ee20461718669c6c9c5da478d46d60d9-Abstract-Conference.html</w:t>
       </w:r>
     </w:p>
     <w:p>
@@ -17304,7 +17687,7 @@
         <w:jc w:val="left"/>
       </w:pPr>
       <w:r>
-        <w:t xml:space="preserve">Kondo, T., Takezaki, S., Haraguchi, D., &amp; Uchida, S. (2024). Font style interpolation with diffusion models. In</w:t>
+        <w:t xml:space="preserve">Jiang, B., Yuan, Y., Bai, X., Hao, Z., Yin, A., Hu, Y., Liao, W., Ungar, L., &amp; Taylor, C. J. (2025). ControlText: Unlocking controllable fonts in multilingual text rendering without font annotations. In</w:t>
       </w:r>
       <w:r>
         <w:t xml:space="preserve"> </w:t>
@@ -17314,10 +17697,10 @@
           <w:i/>
           <w:iCs/>
         </w:rPr>
-        <w:t xml:space="preserve">Document Analysis and Recognition – ICDAR 2024</w:t>
-      </w:r>
-      <w:r>
-        <w:t xml:space="preserve">. Springer. https://doi.org/10.1007/978-3-031-70536-6_6</w:t>
+        <w:t xml:space="preserve">Findings of the Association for Computational Linguistics: EMNLP 2025</w:t>
+      </w:r>
+      <w:r>
+        <w:t xml:space="preserve">. https://arxiv.org/abs/2502.10999</w:t>
       </w:r>
     </w:p>
     <w:p>
@@ -17327,7 +17710,7 @@
         <w:jc w:val="left"/>
       </w:pPr>
       <w:r>
-        <w:t xml:space="preserve">Li, Z., Li, X., Fu, X., Zhang, X., Wang, W., Chen, S., &amp; Yang, J. (2024). PromptKD: Unsupervised prompt distillation for vision-language models. In</w:t>
+        <w:t xml:space="preserve">Kondo, T., Takezaki, S., Haraguchi, D., &amp; Uchida, S. (2024). Font style interpolation with diffusion models. In</w:t>
       </w:r>
       <w:r>
         <w:t xml:space="preserve"> </w:t>
@@ -17337,10 +17720,10 @@
           <w:i/>
           <w:iCs/>
         </w:rPr>
-        <w:t xml:space="preserve">Proceedings of the IEEE/CVF Conference on Computer Vision and Pattern Recognition (CVPR)</w:t>
-      </w:r>
-      <w:r>
-        <w:t xml:space="preserve">. https://arxiv.org/abs/2403.02781</w:t>
+        <w:t xml:space="preserve">Document Analysis and Recognition – ICDAR 2024</w:t>
+      </w:r>
+      <w:r>
+        <w:t xml:space="preserve">. Springer. https://doi.org/10.1007/978-3-031-70536-6_6</w:t>
       </w:r>
     </w:p>
     <w:p>
@@ -17350,7 +17733,7 @@
         <w:jc w:val="left"/>
       </w:pPr>
       <w:r>
-        <w:t xml:space="preserve">Schroff, F., Kalenichenko, D., &amp; Philbin, J. (2015). FaceNet: A unified embedding for face recognition and clustering. In</w:t>
+        <w:t xml:space="preserve">Li, Z., Li, X., Fu, X., Zhang, X., Wang, W., Chen, S., &amp; Yang, J. (2024). PromptKD: Unsupervised prompt distillation for vision-language models. In</w:t>
       </w:r>
       <w:r>
         <w:t xml:space="preserve"> </w:t>
@@ -17360,13 +17743,10 @@
           <w:i/>
           <w:iCs/>
         </w:rPr>
-        <w:t xml:space="preserve">Proceedings of the IEEE Conference on Computer Vision and Pattern Recognition (CVPR)</w:t>
-      </w:r>
-      <w:r>
-        <w:t xml:space="preserve"> </w:t>
-      </w:r>
-      <w:r>
-        <w:t xml:space="preserve">(pp. 815–823). https://doi.org/10.1109/CVPR.2015.7298682</w:t>
+        <w:t xml:space="preserve">Proceedings of the IEEE/CVF Conference on Computer Vision and Pattern Recognition (CVPR)</w:t>
+      </w:r>
+      <w:r>
+        <w:t xml:space="preserve">. https://arxiv.org/abs/2403.02781</w:t>
       </w:r>
     </w:p>
     <w:p>
@@ -17376,7 +17756,7 @@
         <w:jc w:val="left"/>
       </w:pPr>
       <w:r>
-        <w:t xml:space="preserve">Sheikh, T. U., Shehzadi, T., Hashmi, K. A., Stricker, D., &amp; Afzal, M. Z. (2024). UnSupDLA: Towards unsupervised document layout analysis. In</w:t>
+        <w:t xml:space="preserve">Liu, Z., Mao, H., Wu, C.-Y., Feichtenhofer, C., Darrell, T., &amp; Xie, S. (2022). A ConvNet for the 2020s. In</w:t>
       </w:r>
       <w:r>
         <w:t xml:space="preserve"> </w:t>
@@ -17386,10 +17766,10 @@
           <w:i/>
           <w:iCs/>
         </w:rPr>
-        <w:t xml:space="preserve">Document Analysis and Recognition – ICDAR 2024 Workshops</w:t>
-      </w:r>
-      <w:r>
-        <w:t xml:space="preserve">. Springer. https://doi.org/10.1007/978-3-031-70546-5_2</w:t>
+        <w:t xml:space="preserve">Proceedings of the IEEE/CVF Conference on Computer Vision and Pattern Recognition (CVPR)</w:t>
+      </w:r>
+      <w:r>
+        <w:t xml:space="preserve">. https://arxiv.org/abs/2201.03545</w:t>
       </w:r>
     </w:p>
     <w:p>
@@ -17399,7 +17779,7 @@
         <w:jc w:val="left"/>
       </w:pPr>
       <w:r>
-        <w:t xml:space="preserve">Vaswani, A., Shazeer, N., Parmar, N., Uszkoreit, J., Jones, L., Gomez, A. N., Kaiser, Ł., &amp; Polosukhin, I. (2017). Attention is all you need. In</w:t>
+        <w:t xml:space="preserve">Schroff, F., Kalenichenko, D., &amp; Philbin, J. (2015). FaceNet: A unified embedding for face recognition and clustering. In</w:t>
       </w:r>
       <w:r>
         <w:t xml:space="preserve"> </w:t>
@@ -17409,13 +17789,13 @@
           <w:i/>
           <w:iCs/>
         </w:rPr>
-        <w:t xml:space="preserve">Advances in Neural Information Processing Systems</w:t>
-      </w:r>
-      <w:r>
-        <w:t xml:space="preserve"> </w:t>
-      </w:r>
-      <w:r>
-        <w:t xml:space="preserve">(Vol. 30). https://proceedings.neurips.cc/paper/2017/hash/3f5ee243547dee91fbd053c1c4a845aa-Abstract.html</w:t>
+        <w:t xml:space="preserve">Proceedings of the IEEE Conference on Computer Vision and Pattern Recognition (CVPR)</w:t>
+      </w:r>
+      <w:r>
+        <w:t xml:space="preserve"> </w:t>
+      </w:r>
+      <w:r>
+        <w:t xml:space="preserve">(pp. 815–823). https://doi.org/10.1109/CVPR.2015.7298682</w:t>
       </w:r>
     </w:p>
     <w:p>
@@ -17425,7 +17805,7 @@
         <w:jc w:val="left"/>
       </w:pPr>
       <w:r>
-        <w:t xml:space="preserve">Wang, Y., Zhang, Q., Guo, Y., &amp; Wang, Y. (2024). Non-negative contrastive learning. In</w:t>
+        <w:t xml:space="preserve">Sheikh, T. U., Shehzadi, T., Hashmi, K. A., Stricker, D., &amp; Afzal, M. Z. (2024). UnSupDLA: Towards unsupervised document layout analysis. In</w:t>
       </w:r>
       <w:r>
         <w:t xml:space="preserve"> </w:t>
@@ -17435,10 +17815,10 @@
           <w:i/>
           <w:iCs/>
         </w:rPr>
-        <w:t xml:space="preserve">International Conference on Learning Representations (ICLR)</w:t>
-      </w:r>
-      <w:r>
-        <w:t xml:space="preserve">. https://arxiv.org/abs/2403.12459</w:t>
+        <w:t xml:space="preserve">Document Analysis and Recognition – ICDAR 2024 Workshops</w:t>
+      </w:r>
+      <w:r>
+        <w:t xml:space="preserve">. Springer. https://doi.org/10.1007/978-3-031-70546-5_2</w:t>
       </w:r>
     </w:p>
     <w:p>
@@ -17448,7 +17828,7 @@
         <w:jc w:val="left"/>
       </w:pPr>
       <w:r>
-        <w:t xml:space="preserve">Wang, Z., Yang, J., Jin, H., Shechtman, E., Agarwala, A., Brandt, J., &amp; Huang, T. S. (2015). DeepFont: Identify your font from an image. In</w:t>
+        <w:t xml:space="preserve">Vaswani, A., Shazeer, N., Parmar, N., Uszkoreit, J., Jones, L., Gomez, A. N., Kaiser, Ł., &amp; Polosukhin, I. (2017). Attention is all you need. In</w:t>
       </w:r>
       <w:r>
         <w:t xml:space="preserve"> </w:t>
@@ -17458,6 +17838,55 @@
           <w:i/>
           <w:iCs/>
         </w:rPr>
+        <w:t xml:space="preserve">Advances in Neural Information Processing Systems</w:t>
+      </w:r>
+      <w:r>
+        <w:t xml:space="preserve"> </w:t>
+      </w:r>
+      <w:r>
+        <w:t xml:space="preserve">(Vol. 30). https://proceedings.neurips.cc/paper/2017/hash/3f5ee243547dee91fbd053c1c4a845aa-Abstract.html</w:t>
+      </w:r>
+    </w:p>
+    <w:p>
+      <w:pPr>
+        <w:pStyle w:val="BodyText"/>
+        <w:ind w:left="720" w:hanging="720"/>
+        <w:jc w:val="left"/>
+      </w:pPr>
+      <w:r>
+        <w:t xml:space="preserve">Wang, Y., Zhang, Q., Guo, Y., &amp; Wang, Y. (2024). Non-negative contrastive learning. In</w:t>
+      </w:r>
+      <w:r>
+        <w:t xml:space="preserve"> </w:t>
+      </w:r>
+      <w:r>
+        <w:rPr>
+          <w:i/>
+          <w:iCs/>
+        </w:rPr>
+        <w:t xml:space="preserve">International Conference on Learning Representations (ICLR)</w:t>
+      </w:r>
+      <w:r>
+        <w:t xml:space="preserve">. https://arxiv.org/abs/2403.12459</w:t>
+      </w:r>
+    </w:p>
+    <w:p>
+      <w:pPr>
+        <w:pStyle w:val="BodyText"/>
+        <w:ind w:left="720" w:hanging="720"/>
+        <w:jc w:val="left"/>
+      </w:pPr>
+      <w:r>
+        <w:t xml:space="preserve">Wang, Z., Yang, J., Jin, H., Shechtman, E., Agarwala, A., Brandt, J., &amp; Huang, T. S. (2015). DeepFont: Identify your font from an image. In</w:t>
+      </w:r>
+      <w:r>
+        <w:t xml:space="preserve"> </w:t>
+      </w:r>
+      <w:r>
+        <w:rPr>
+          <w:i/>
+          <w:iCs/>
+        </w:rPr>
         <w:t xml:space="preserve">Proceedings of the 23rd ACM International Conference on Multimedia</w:t>
       </w:r>
       <w:r>
@@ -17465,6 +17894,29 @@
       </w:r>
       <w:r>
         <w:t xml:space="preserve">(pp. 451–459). https://doi.org/10.1145/2733373.2806219</w:t>
+      </w:r>
+    </w:p>
+    <w:p>
+      <w:pPr>
+        <w:pStyle w:val="BodyText"/>
+        <w:ind w:left="720" w:hanging="720"/>
+        <w:jc w:val="left"/>
+      </w:pPr>
+      <w:r>
+        <w:t xml:space="preserve">Zhai, X., Mustafa, B., Kolesnikov, A., &amp; Beyer, L. (2023). Sigmoid loss for language image pre-training. In</w:t>
+      </w:r>
+      <w:r>
+        <w:t xml:space="preserve"> </w:t>
+      </w:r>
+      <w:r>
+        <w:rPr>
+          <w:i/>
+          <w:iCs/>
+        </w:rPr>
+        <w:t xml:space="preserve">Proceedings of the IEEE/CVF International Conference on Computer Vision (ICCV)</w:t>
+      </w:r>
+      <w:r>
+        <w:t xml:space="preserve">. https://arxiv.org/abs/2303.15343</w:t>
       </w:r>
     </w:p>
     <w:p>

</xml_diff>